<commit_message>
Manual de usuario - Avance en licencias
</commit_message>
<xml_diff>
--- a/Programacion/Manual de usuario/Manual de usuario.docx
+++ b/Programacion/Manual de usuario/Manual de usuario.docx
@@ -60,7 +60,7 @@
       <w:pPr>
         <w:pStyle w:val="Heading1"/>
       </w:pPr>
-      <w:bookmarkStart w:name="_Toc1971335356" w:id="205680889"/>
+      <w:bookmarkStart w:name="_Toc2047801213" w:id="2047716878"/>
       <w:r>
         <w:rPr>
           <w:b w:val="1"/>
@@ -72,7 +72,7 @@
       <w:r>
         <w:br/>
       </w:r>
-      <w:bookmarkEnd w:id="205680889"/>
+      <w:bookmarkEnd w:id="2047716878"/>
     </w:p>
     <w:sdt>
       <w:sdtPr>
@@ -102,7 +102,7 @@
           <w:r>
             <w:fldChar w:fldCharType="separate"/>
           </w:r>
-          <w:hyperlink w:anchor="_Toc1971335356">
+          <w:hyperlink w:anchor="_Toc2047801213">
             <w:r>
               <w:rPr>
                 <w:rStyle w:val="Hyperlink"/>
@@ -116,7 +116,7 @@
               <w:fldChar w:fldCharType="begin"/>
             </w:r>
             <w:r>
-              <w:instrText xml:space="preserve">PAGEREF _Toc1971335356 \h</w:instrText>
+              <w:instrText xml:space="preserve">PAGEREF _Toc2047801213 \h</w:instrText>
             </w:r>
             <w:r>
               <w:fldChar w:fldCharType="separate"/>
@@ -142,7 +142,7 @@
               <w:rStyle w:val="Hyperlink"/>
             </w:rPr>
           </w:pPr>
-          <w:hyperlink w:anchor="_Toc2045647080">
+          <w:hyperlink w:anchor="_Toc544508615">
             <w:r>
               <w:rPr>
                 <w:rStyle w:val="Hyperlink"/>
@@ -156,7 +156,7 @@
               <w:fldChar w:fldCharType="begin"/>
             </w:r>
             <w:r>
-              <w:instrText xml:space="preserve">PAGEREF _Toc2045647080 \h</w:instrText>
+              <w:instrText xml:space="preserve">PAGEREF _Toc544508615 \h</w:instrText>
             </w:r>
             <w:r>
               <w:fldChar w:fldCharType="separate"/>
@@ -182,7 +182,7 @@
               <w:rStyle w:val="Hyperlink"/>
             </w:rPr>
           </w:pPr>
-          <w:hyperlink w:anchor="_Toc759484134">
+          <w:hyperlink w:anchor="_Toc859196054">
             <w:r>
               <w:rPr>
                 <w:rStyle w:val="Hyperlink"/>
@@ -196,7 +196,7 @@
               <w:fldChar w:fldCharType="begin"/>
             </w:r>
             <w:r>
-              <w:instrText xml:space="preserve">PAGEREF _Toc759484134 \h</w:instrText>
+              <w:instrText xml:space="preserve">PAGEREF _Toc859196054 \h</w:instrText>
             </w:r>
             <w:r>
               <w:fldChar w:fldCharType="separate"/>
@@ -222,12 +222,12 @@
               <w:rStyle w:val="Hyperlink"/>
             </w:rPr>
           </w:pPr>
-          <w:hyperlink w:anchor="_Toc1879536190">
+          <w:hyperlink w:anchor="_Toc820899969">
             <w:r>
               <w:rPr>
                 <w:rStyle w:val="Hyperlink"/>
               </w:rPr>
-              <w:t>Otros tipos de licencia</w:t>
+              <w:t>Otros tipos de licencia de software</w:t>
             </w:r>
             <w:r>
               <w:tab/>
@@ -236,7 +236,7 @@
               <w:fldChar w:fldCharType="begin"/>
             </w:r>
             <w:r>
-              <w:instrText xml:space="preserve">PAGEREF _Toc1879536190 \h</w:instrText>
+              <w:instrText xml:space="preserve">PAGEREF _Toc820899969 \h</w:instrText>
             </w:r>
             <w:r>
               <w:fldChar w:fldCharType="separate"/>
@@ -262,7 +262,7 @@
               <w:rStyle w:val="Hyperlink"/>
             </w:rPr>
           </w:pPr>
-          <w:hyperlink w:anchor="_Toc1919253877">
+          <w:hyperlink w:anchor="_Toc399201739">
             <w:r>
               <w:rPr>
                 <w:rStyle w:val="Hyperlink"/>
@@ -276,7 +276,7 @@
               <w:fldChar w:fldCharType="begin"/>
             </w:r>
             <w:r>
-              <w:instrText xml:space="preserve">PAGEREF _Toc1919253877 \h</w:instrText>
+              <w:instrText xml:space="preserve">PAGEREF _Toc399201739 \h</w:instrText>
             </w:r>
             <w:r>
               <w:fldChar w:fldCharType="separate"/>
@@ -302,7 +302,7 @@
               <w:rStyle w:val="Hyperlink"/>
             </w:rPr>
           </w:pPr>
-          <w:hyperlink w:anchor="_Toc422482387">
+          <w:hyperlink w:anchor="_Toc1517806272">
             <w:r>
               <w:rPr>
                 <w:rStyle w:val="Hyperlink"/>
@@ -316,7 +316,7 @@
               <w:fldChar w:fldCharType="begin"/>
             </w:r>
             <w:r>
-              <w:instrText xml:space="preserve">PAGEREF _Toc422482387 \h</w:instrText>
+              <w:instrText xml:space="preserve">PAGEREF _Toc1517806272 \h</w:instrText>
             </w:r>
             <w:r>
               <w:fldChar w:fldCharType="separate"/>
@@ -339,7 +339,7 @@
               <w:tab w:val="right" w:leader="dot" w:pos="9015"/>
             </w:tabs>
           </w:pPr>
-          <w:hyperlink w:anchor="_Toc1908650395">
+          <w:hyperlink w:anchor="_Toc1060950956">
             <w:r>
               <w:rPr>
                 <w:rStyle w:val="Hyperlink"/>
@@ -353,7 +353,7 @@
               <w:fldChar w:fldCharType="begin"/>
             </w:r>
             <w:r>
-              <w:instrText xml:space="preserve">PAGEREF _Toc1908650395 \h</w:instrText>
+              <w:instrText xml:space="preserve">PAGEREF _Toc1060950956 \h</w:instrText>
             </w:r>
             <w:r>
               <w:fldChar w:fldCharType="separate"/>
@@ -376,7 +376,7 @@
               <w:tab w:val="right" w:leader="dot" w:pos="9015"/>
             </w:tabs>
           </w:pPr>
-          <w:hyperlink w:anchor="_Toc1859130345">
+          <w:hyperlink w:anchor="_Toc1663264036">
             <w:r>
               <w:rPr>
                 <w:rStyle w:val="Hyperlink"/>
@@ -390,7 +390,7 @@
               <w:fldChar w:fldCharType="begin"/>
             </w:r>
             <w:r>
-              <w:instrText xml:space="preserve">PAGEREF _Toc1859130345 \h</w:instrText>
+              <w:instrText xml:space="preserve">PAGEREF _Toc1663264036 \h</w:instrText>
             </w:r>
             <w:r>
               <w:fldChar w:fldCharType="separate"/>
@@ -413,7 +413,7 @@
               <w:tab w:val="right" w:leader="dot" w:pos="9015"/>
             </w:tabs>
           </w:pPr>
-          <w:hyperlink w:anchor="_Toc272745850">
+          <w:hyperlink w:anchor="_Toc77101453">
             <w:r>
               <w:rPr>
                 <w:rStyle w:val="Hyperlink"/>
@@ -427,7 +427,7 @@
               <w:fldChar w:fldCharType="begin"/>
             </w:r>
             <w:r>
-              <w:instrText xml:space="preserve">PAGEREF _Toc272745850 \h</w:instrText>
+              <w:instrText xml:space="preserve">PAGEREF _Toc77101453 \h</w:instrText>
             </w:r>
             <w:r>
               <w:fldChar w:fldCharType="separate"/>
@@ -436,7 +436,7 @@
               <w:rPr>
                 <w:rStyle w:val="Hyperlink"/>
               </w:rPr>
-              <w:t>2</w:t>
+              <w:t>3</w:t>
             </w:r>
             <w:r>
               <w:fldChar w:fldCharType="end"/>
@@ -450,7 +450,7 @@
               <w:tab w:val="right" w:leader="dot" w:pos="9015"/>
             </w:tabs>
           </w:pPr>
-          <w:hyperlink w:anchor="_Toc1287449758">
+          <w:hyperlink w:anchor="_Toc81259772">
             <w:r>
               <w:rPr>
                 <w:rStyle w:val="Hyperlink"/>
@@ -464,7 +464,7 @@
               <w:fldChar w:fldCharType="begin"/>
             </w:r>
             <w:r>
-              <w:instrText xml:space="preserve">PAGEREF _Toc1287449758 \h</w:instrText>
+              <w:instrText xml:space="preserve">PAGEREF _Toc81259772 \h</w:instrText>
             </w:r>
             <w:r>
               <w:fldChar w:fldCharType="separate"/>
@@ -487,7 +487,7 @@
               <w:tab w:val="right" w:leader="dot" w:pos="9015"/>
             </w:tabs>
           </w:pPr>
-          <w:hyperlink w:anchor="_Toc540836682">
+          <w:hyperlink w:anchor="_Toc2133818568">
             <w:r>
               <w:rPr>
                 <w:rStyle w:val="Hyperlink"/>
@@ -501,7 +501,7 @@
               <w:fldChar w:fldCharType="begin"/>
             </w:r>
             <w:r>
-              <w:instrText xml:space="preserve">PAGEREF _Toc540836682 \h</w:instrText>
+              <w:instrText xml:space="preserve">PAGEREF _Toc2133818568 \h</w:instrText>
             </w:r>
             <w:r>
               <w:fldChar w:fldCharType="separate"/>
@@ -532,7 +532,7 @@
           <w:bCs w:val="1"/>
         </w:rPr>
       </w:pPr>
-      <w:bookmarkStart w:name="_Toc2045647080" w:id="1570963488"/>
+      <w:bookmarkStart w:name="_Toc544508615" w:id="148542406"/>
       <w:r>
         <w:rPr>
           <w:b w:val="1"/>
@@ -540,40 +540,855 @@
         </w:rPr>
         <w:t>Licencia</w:t>
       </w:r>
-      <w:bookmarkEnd w:id="1570963488"/>
+      <w:bookmarkEnd w:id="148542406"/>
     </w:p>
     <w:p>
       <w:pPr>
         <w:pStyle w:val="Heading2"/>
       </w:pPr>
-      <w:bookmarkStart w:name="_Toc759484134" w:id="39275930"/>
+      <w:bookmarkStart w:name="_Toc859196054" w:id="610359836"/>
       <w:r>
         <w:rPr/>
         <w:t>Licencia de la aplicación</w:t>
       </w:r>
-      <w:bookmarkEnd w:id="39275930"/>
+      <w:bookmarkEnd w:id="610359836"/>
+    </w:p>
+    <w:p>
+      <w:pPr>
+        <w:pStyle w:val="Normal"/>
+        <w:rPr>
+          <w:u w:val="single"/>
+        </w:rPr>
+      </w:pPr>
+      <w:r>
+        <w:rPr>
+          <w:u w:val="single"/>
+        </w:rPr>
+        <w:t xml:space="preserve">Licencia </w:t>
+      </w:r>
+      <w:r>
+        <w:rPr>
+          <w:u w:val="single"/>
+        </w:rPr>
+        <w:t>de software</w:t>
+      </w:r>
+    </w:p>
+    <w:p>
+      <w:pPr>
+        <w:pStyle w:val="Normal"/>
+        <w:rPr>
+          <w:u w:val="single"/>
+        </w:rPr>
+      </w:pPr>
+    </w:p>
+    <w:p>
+      <w:pPr>
+        <w:pStyle w:val="Normal"/>
+        <w:rPr>
+          <w:u w:val="single"/>
+        </w:rPr>
+      </w:pPr>
+      <w:r>
+        <w:rPr>
+          <w:u w:val="single"/>
+        </w:rPr>
+        <w:t>Licencia de Creative Commons</w:t>
+      </w:r>
+    </w:p>
+    <w:p>
+      <w:pPr>
+        <w:pStyle w:val="Normal"/>
+        <w:rPr>
+          <w:i w:val="1"/>
+          <w:iCs w:val="1"/>
+          <w:u w:val="single"/>
+        </w:rPr>
+      </w:pPr>
+      <w:r>
+        <w:rPr>
+          <w:i w:val="1"/>
+          <w:iCs w:val="1"/>
+          <w:u w:val="single"/>
+        </w:rPr>
+        <w:t>https://creativecommons.org/chooser/</w:t>
+      </w:r>
+    </w:p>
+    <w:p>
+      <w:pPr>
+        <w:pStyle w:val="Normal"/>
+      </w:pPr>
+    </w:p>
+    <w:p>
+      <w:pPr>
+        <w:pStyle w:val="Normal"/>
+      </w:pPr>
+    </w:p>
+    <w:p>
+      <w:pPr>
+        <w:pStyle w:val="Normal"/>
+      </w:pPr>
+    </w:p>
+    <w:p>
+      <w:pPr>
+        <w:pStyle w:val="Normal"/>
+      </w:pPr>
     </w:p>
     <w:p>
       <w:pPr>
         <w:pStyle w:val="Heading2"/>
       </w:pPr>
-      <w:bookmarkStart w:name="_Toc1879536190" w:id="1598916893"/>
+      <w:bookmarkStart w:name="_Toc820899969" w:id="331534152"/>
       <w:r>
         <w:rPr/>
         <w:t>Otros tipos de licencia</w:t>
       </w:r>
-      <w:bookmarkEnd w:id="1598916893"/>
+      <w:r>
+        <w:rPr/>
+        <w:t xml:space="preserve"> de software</w:t>
+      </w:r>
+      <w:bookmarkEnd w:id="331534152"/>
+    </w:p>
+    <w:p>
+      <w:pPr>
+        <w:pStyle w:val="Normal"/>
+        <w:rPr>
+          <w:i w:val="1"/>
+          <w:iCs w:val="1"/>
+        </w:rPr>
+      </w:pPr>
+      <w:r>
+        <w:rPr>
+          <w:u w:val="single"/>
+        </w:rPr>
+        <w:t xml:space="preserve">Código </w:t>
+      </w:r>
+      <w:bookmarkStart w:name="_Int_BNGyn2rD" w:id="804433918"/>
+      <w:r>
+        <w:rPr>
+          <w:u w:val="single"/>
+        </w:rPr>
+        <w:t>cerrado</w:t>
+      </w:r>
+      <w:r>
+        <w:rPr/>
+        <w:t xml:space="preserve"> :</w:t>
+      </w:r>
+      <w:bookmarkEnd w:id="804433918"/>
+      <w:r>
+        <w:rPr/>
+        <w:t xml:space="preserve"> </w:t>
+      </w:r>
+    </w:p>
+    <w:p>
+      <w:pPr>
+        <w:pStyle w:val="Normal"/>
+        <w:rPr>
+          <w:i w:val="1"/>
+          <w:iCs w:val="1"/>
+        </w:rPr>
+      </w:pPr>
+      <w:r>
+        <w:rPr>
+          <w:b w:val="1"/>
+          <w:bCs w:val="1"/>
+          <w:i w:val="1"/>
+          <w:iCs w:val="1"/>
+        </w:rPr>
+        <w:t>Retail</w:t>
+      </w:r>
+      <w:r>
+        <w:rPr>
+          <w:b w:val="1"/>
+          <w:bCs w:val="1"/>
+          <w:i w:val="1"/>
+          <w:iCs w:val="1"/>
+        </w:rPr>
+        <w:t xml:space="preserve"> </w:t>
+      </w:r>
+      <w:r>
+        <w:rPr>
+          <w:i w:val="1"/>
+          <w:iCs w:val="1"/>
+        </w:rPr>
+        <w:t>:</w:t>
+      </w:r>
+      <w:r>
+        <w:rPr>
+          <w:i w:val="1"/>
+          <w:iCs w:val="1"/>
+        </w:rPr>
+        <w:t xml:space="preserve"> Licencia de venta al por menor en la tienda de Microsoft o </w:t>
+      </w:r>
+      <w:r>
+        <w:rPr>
+          <w:i w:val="1"/>
+          <w:iCs w:val="1"/>
+        </w:rPr>
+        <w:t>distribuidores</w:t>
+      </w:r>
+      <w:r>
+        <w:rPr>
+          <w:i w:val="1"/>
+          <w:iCs w:val="1"/>
+        </w:rPr>
+        <w:t xml:space="preserve"> autorizados. Transferible entre equipos y con soporte técnico.</w:t>
+      </w:r>
+      <w:r>
+        <w:br/>
+      </w:r>
+      <w:r>
+        <w:rPr>
+          <w:b w:val="1"/>
+          <w:bCs w:val="1"/>
+          <w:i w:val="1"/>
+          <w:iCs w:val="1"/>
+        </w:rPr>
+        <w:t xml:space="preserve">Adobe </w:t>
+      </w:r>
+      <w:bookmarkStart w:name="_Int_hKjV3oYq" w:id="1820288658"/>
+      <w:bookmarkStart w:name="_Int_Onu0VE9h" w:id="1899355236"/>
+      <w:r>
+        <w:rPr>
+          <w:b w:val="1"/>
+          <w:bCs w:val="1"/>
+          <w:i w:val="1"/>
+          <w:iCs w:val="1"/>
+        </w:rPr>
+        <w:t>Photoshop</w:t>
+      </w:r>
+      <w:r>
+        <w:rPr>
+          <w:i w:val="1"/>
+          <w:iCs w:val="1"/>
+        </w:rPr>
+        <w:t xml:space="preserve"> :</w:t>
+      </w:r>
+      <w:bookmarkEnd w:id="1899355236"/>
+      <w:r>
+        <w:rPr>
+          <w:i w:val="1"/>
+          <w:iCs w:val="1"/>
+        </w:rPr>
+        <w:t xml:space="preserve"> </w:t>
+      </w:r>
+      <w:r>
+        <w:rPr>
+          <w:i w:val="1"/>
+          <w:iCs w:val="1"/>
+        </w:rPr>
+        <w:t>La licencia es de pago, pero caduca y se tiene que renovar a través de una suscripción.</w:t>
+      </w:r>
+      <w:bookmarkEnd w:id="1820288658"/>
+    </w:p>
+    <w:p>
+      <w:pPr>
+        <w:pStyle w:val="Normal"/>
+        <w:rPr>
+          <w:i w:val="1"/>
+          <w:iCs w:val="1"/>
+          <w:lang w:val="en-US"/>
+        </w:rPr>
+      </w:pPr>
+      <w:r>
+        <w:rPr>
+          <w:u w:val="single"/>
+          <w:lang w:val="en-US"/>
+        </w:rPr>
+        <w:t xml:space="preserve">Código </w:t>
+      </w:r>
+      <w:r>
+        <w:rPr>
+          <w:u w:val="single"/>
+          <w:lang w:val="en-US"/>
+        </w:rPr>
+        <w:t>abierto</w:t>
+      </w:r>
+      <w:r>
+        <w:rPr>
+          <w:u w:val="single"/>
+          <w:lang w:val="en-US"/>
+        </w:rPr>
+        <w:t xml:space="preserve"> robustas </w:t>
+      </w:r>
+      <w:r>
+        <w:rPr>
+          <w:u w:val="single"/>
+          <w:lang w:val="en-US"/>
+        </w:rPr>
+        <w:t>fuertes</w:t>
+      </w:r>
+      <w:r>
+        <w:rPr>
+          <w:lang w:val="en-US"/>
+        </w:rPr>
+        <w:t xml:space="preserve"> :</w:t>
+      </w:r>
+      <w:r>
+        <w:rPr>
+          <w:lang w:val="en-US"/>
+        </w:rPr>
+        <w:t xml:space="preserve">  </w:t>
+      </w:r>
+    </w:p>
+    <w:p>
+      <w:pPr>
+        <w:pStyle w:val="Normal"/>
+        <w:rPr>
+          <w:i w:val="1"/>
+          <w:iCs w:val="1"/>
+          <w:lang w:val="es-ES"/>
+        </w:rPr>
+      </w:pPr>
+      <w:r>
+        <w:rPr>
+          <w:b w:val="1"/>
+          <w:bCs w:val="1"/>
+          <w:i w:val="1"/>
+          <w:iCs w:val="1"/>
+          <w:lang w:val="es-ES"/>
+        </w:rPr>
+        <w:t xml:space="preserve">GNU General Public </w:t>
+      </w:r>
+      <w:r>
+        <w:rPr>
+          <w:b w:val="1"/>
+          <w:bCs w:val="1"/>
+          <w:i w:val="1"/>
+          <w:iCs w:val="1"/>
+          <w:lang w:val="es-ES"/>
+        </w:rPr>
+        <w:t>License</w:t>
+      </w:r>
+      <w:r>
+        <w:rPr>
+          <w:b w:val="1"/>
+          <w:bCs w:val="1"/>
+          <w:i w:val="1"/>
+          <w:iCs w:val="1"/>
+          <w:lang w:val="es-ES"/>
+        </w:rPr>
+        <w:t xml:space="preserve"> v. </w:t>
+      </w:r>
+      <w:bookmarkStart w:name="_Int_QcWw9Dl5" w:id="492922352"/>
+      <w:r>
+        <w:rPr>
+          <w:b w:val="1"/>
+          <w:bCs w:val="1"/>
+          <w:i w:val="1"/>
+          <w:iCs w:val="1"/>
+          <w:lang w:val="es-ES"/>
+        </w:rPr>
+        <w:t>2.0.</w:t>
+      </w:r>
+      <w:r>
+        <w:rPr>
+          <w:i w:val="1"/>
+          <w:iCs w:val="1"/>
+          <w:lang w:val="es-ES"/>
+        </w:rPr>
+        <w:t xml:space="preserve"> :</w:t>
+      </w:r>
+      <w:bookmarkEnd w:id="492922352"/>
+      <w:r>
+        <w:rPr>
+          <w:i w:val="1"/>
+          <w:iCs w:val="1"/>
+          <w:lang w:val="es-ES"/>
+        </w:rPr>
+        <w:t xml:space="preserve"> Copyleft</w:t>
+      </w:r>
+      <w:r>
+        <w:br/>
+      </w:r>
+      <w:r>
+        <w:rPr>
+          <w:b w:val="1"/>
+          <w:bCs w:val="1"/>
+          <w:i w:val="1"/>
+          <w:iCs w:val="1"/>
+          <w:lang w:val="es-ES"/>
+        </w:rPr>
+        <w:t xml:space="preserve">Eclipse Public </w:t>
+      </w:r>
+      <w:r>
+        <w:rPr>
+          <w:b w:val="1"/>
+          <w:bCs w:val="1"/>
+          <w:i w:val="1"/>
+          <w:iCs w:val="1"/>
+          <w:lang w:val="es-ES"/>
+        </w:rPr>
+        <w:t>License</w:t>
+      </w:r>
+      <w:r>
+        <w:rPr>
+          <w:i w:val="1"/>
+          <w:iCs w:val="1"/>
+          <w:lang w:val="es-ES"/>
+        </w:rPr>
+        <w:t xml:space="preserve"> :</w:t>
+      </w:r>
+      <w:r>
+        <w:rPr>
+          <w:i w:val="1"/>
+          <w:iCs w:val="1"/>
+          <w:lang w:val="es-ES"/>
+        </w:rPr>
+        <w:t xml:space="preserve"> Código abierto. Permite uso comercial. Mantener derechos de autor.</w:t>
+      </w:r>
+      <w:r>
+        <w:br/>
+      </w:r>
+      <w:r>
+        <w:rPr>
+          <w:b w:val="1"/>
+          <w:bCs w:val="1"/>
+          <w:i w:val="1"/>
+          <w:iCs w:val="1"/>
+          <w:lang w:val="es-ES"/>
+        </w:rPr>
+        <w:t xml:space="preserve">OpenSSL </w:t>
+      </w:r>
+      <w:bookmarkStart w:name="_Int_GoY55r2F" w:id="1940586703"/>
+      <w:r>
+        <w:rPr>
+          <w:b w:val="1"/>
+          <w:bCs w:val="1"/>
+          <w:i w:val="1"/>
+          <w:iCs w:val="1"/>
+          <w:lang w:val="es-ES"/>
+        </w:rPr>
+        <w:t>License</w:t>
+      </w:r>
+      <w:r>
+        <w:rPr>
+          <w:i w:val="1"/>
+          <w:iCs w:val="1"/>
+          <w:lang w:val="es-ES"/>
+        </w:rPr>
+        <w:t xml:space="preserve"> :</w:t>
+      </w:r>
+      <w:r>
+        <w:rPr>
+          <w:i w:val="1"/>
+          <w:iCs w:val="1"/>
+          <w:lang w:val="es-ES"/>
+        </w:rPr>
+        <w:t xml:space="preserve"> (Apache License 2.0)</w:t>
+      </w:r>
+      <w:bookmarkEnd w:id="1940586703"/>
+    </w:p>
+    <w:p>
+      <w:pPr>
+        <w:pStyle w:val="Normal"/>
+        <w:rPr>
+          <w:i w:val="1"/>
+          <w:iCs w:val="1"/>
+        </w:rPr>
+      </w:pPr>
+      <w:r>
+        <w:rPr>
+          <w:u w:val="single"/>
+        </w:rPr>
+        <w:t xml:space="preserve">Código abierto robustas </w:t>
+      </w:r>
+      <w:bookmarkStart w:name="_Int_pXWCEQrJ" w:id="902082552"/>
+      <w:r>
+        <w:rPr>
+          <w:u w:val="single"/>
+        </w:rPr>
+        <w:t>débiles</w:t>
+      </w:r>
+      <w:r>
+        <w:rPr/>
+        <w:t xml:space="preserve"> :</w:t>
+      </w:r>
+      <w:bookmarkEnd w:id="902082552"/>
+      <w:r>
+        <w:rPr/>
+        <w:t xml:space="preserve"> </w:t>
+      </w:r>
+    </w:p>
+    <w:p>
+      <w:pPr>
+        <w:pStyle w:val="Normal"/>
+        <w:rPr>
+          <w:i w:val="1"/>
+          <w:iCs w:val="1"/>
+          <w:lang w:val="en-US"/>
+        </w:rPr>
+      </w:pPr>
+      <w:r>
+        <w:rPr>
+          <w:b w:val="1"/>
+          <w:bCs w:val="1"/>
+          <w:i w:val="1"/>
+          <w:iCs w:val="1"/>
+          <w:lang w:val="en-US"/>
+        </w:rPr>
+        <w:t xml:space="preserve">Mozilla Public </w:t>
+      </w:r>
+      <w:bookmarkStart w:name="_Int_iHhWgWn9" w:id="771899124"/>
+      <w:r>
+        <w:rPr>
+          <w:b w:val="1"/>
+          <w:bCs w:val="1"/>
+          <w:i w:val="1"/>
+          <w:iCs w:val="1"/>
+          <w:lang w:val="en-US"/>
+        </w:rPr>
+        <w:t>License</w:t>
+      </w:r>
+      <w:r>
+        <w:rPr>
+          <w:i w:val="1"/>
+          <w:iCs w:val="1"/>
+          <w:lang w:val="en-US"/>
+        </w:rPr>
+        <w:t xml:space="preserve"> :</w:t>
+      </w:r>
+      <w:bookmarkEnd w:id="771899124"/>
+      <w:r>
+        <w:rPr>
+          <w:i w:val="1"/>
+          <w:iCs w:val="1"/>
+          <w:lang w:val="en-US"/>
+        </w:rPr>
+        <w:t xml:space="preserve"> </w:t>
+      </w:r>
+      <w:r>
+        <w:br/>
+      </w:r>
+      <w:r>
+        <w:rPr>
+          <w:b w:val="1"/>
+          <w:bCs w:val="1"/>
+          <w:i w:val="1"/>
+          <w:iCs w:val="1"/>
+          <w:lang w:val="en-US"/>
+        </w:rPr>
+        <w:t>EUPL</w:t>
+      </w:r>
+      <w:r>
+        <w:rPr>
+          <w:i w:val="1"/>
+          <w:iCs w:val="1"/>
+          <w:lang w:val="en-US"/>
+        </w:rPr>
+        <w:t xml:space="preserve"> :</w:t>
+      </w:r>
+      <w:r>
+        <w:br/>
+      </w:r>
+      <w:r>
+        <w:rPr>
+          <w:b w:val="1"/>
+          <w:bCs w:val="1"/>
+          <w:i w:val="1"/>
+          <w:iCs w:val="1"/>
+          <w:lang w:val="en-US"/>
+        </w:rPr>
+        <w:t xml:space="preserve">Apple Source License v. </w:t>
+      </w:r>
+      <w:bookmarkStart w:name="_Int_q1gubYzH" w:id="942627623"/>
+      <w:r>
+        <w:rPr>
+          <w:b w:val="1"/>
+          <w:bCs w:val="1"/>
+          <w:i w:val="1"/>
+          <w:iCs w:val="1"/>
+          <w:lang w:val="en-US"/>
+        </w:rPr>
+        <w:t>2.0.</w:t>
+      </w:r>
+      <w:r>
+        <w:rPr>
+          <w:i w:val="1"/>
+          <w:iCs w:val="1"/>
+          <w:lang w:val="en-US"/>
+        </w:rPr>
+        <w:t xml:space="preserve"> :</w:t>
+      </w:r>
+      <w:bookmarkEnd w:id="942627623"/>
+    </w:p>
+    <w:p>
+      <w:pPr>
+        <w:pStyle w:val="Normal"/>
+        <w:rPr>
+          <w:i w:val="1"/>
+          <w:iCs w:val="1"/>
+        </w:rPr>
+      </w:pPr>
+      <w:r>
+        <w:rPr>
+          <w:u w:val="single"/>
+        </w:rPr>
+        <w:t xml:space="preserve">Código abierto </w:t>
+      </w:r>
+      <w:bookmarkStart w:name="_Int_2wOWNsbJ" w:id="1711188472"/>
+      <w:r>
+        <w:rPr>
+          <w:u w:val="single"/>
+        </w:rPr>
+        <w:t>permisivas</w:t>
+      </w:r>
+      <w:r>
+        <w:rPr/>
+        <w:t xml:space="preserve"> :</w:t>
+      </w:r>
+      <w:bookmarkEnd w:id="1711188472"/>
+      <w:r>
+        <w:rPr/>
+        <w:t xml:space="preserve"> </w:t>
+      </w:r>
+    </w:p>
+    <w:p>
+      <w:pPr>
+        <w:pStyle w:val="Normal"/>
+        <w:rPr>
+          <w:i w:val="1"/>
+          <w:iCs w:val="1"/>
+          <w:lang w:val="en-US"/>
+        </w:rPr>
+      </w:pPr>
+      <w:r>
+        <w:rPr>
+          <w:b w:val="1"/>
+          <w:bCs w:val="1"/>
+          <w:i w:val="1"/>
+          <w:iCs w:val="1"/>
+          <w:lang w:val="en-US"/>
+        </w:rPr>
+        <w:t xml:space="preserve">MIT </w:t>
+      </w:r>
+      <w:r>
+        <w:rPr>
+          <w:b w:val="1"/>
+          <w:bCs w:val="1"/>
+          <w:i w:val="1"/>
+          <w:iCs w:val="1"/>
+          <w:lang w:val="en-US"/>
+        </w:rPr>
+        <w:t>License</w:t>
+      </w:r>
+      <w:r>
+        <w:rPr>
+          <w:i w:val="1"/>
+          <w:iCs w:val="1"/>
+          <w:lang w:val="en-US"/>
+        </w:rPr>
+        <w:t xml:space="preserve"> :</w:t>
+      </w:r>
+      <w:r>
+        <w:br/>
+      </w:r>
+      <w:r>
+        <w:rPr>
+          <w:b w:val="1"/>
+          <w:bCs w:val="1"/>
+          <w:i w:val="1"/>
+          <w:iCs w:val="1"/>
+          <w:lang w:val="en-US"/>
+        </w:rPr>
+        <w:t xml:space="preserve">Apache </w:t>
+      </w:r>
+      <w:r>
+        <w:rPr>
+          <w:b w:val="1"/>
+          <w:bCs w:val="1"/>
+          <w:i w:val="1"/>
+          <w:iCs w:val="1"/>
+          <w:lang w:val="en-US"/>
+        </w:rPr>
+        <w:t>License</w:t>
+      </w:r>
+      <w:r>
+        <w:rPr>
+          <w:b w:val="1"/>
+          <w:bCs w:val="1"/>
+          <w:i w:val="1"/>
+          <w:iCs w:val="1"/>
+          <w:lang w:val="en-US"/>
+        </w:rPr>
+        <w:t xml:space="preserve"> v. 1.1.</w:t>
+      </w:r>
+      <w:r>
+        <w:rPr>
+          <w:i w:val="1"/>
+          <w:iCs w:val="1"/>
+          <w:lang w:val="en-US"/>
+        </w:rPr>
+        <w:t xml:space="preserve"> :</w:t>
+      </w:r>
+      <w:r>
+        <w:br/>
+      </w:r>
+      <w:r>
+        <w:rPr>
+          <w:b w:val="1"/>
+          <w:bCs w:val="1"/>
+          <w:i w:val="1"/>
+          <w:iCs w:val="1"/>
+          <w:lang w:val="en-US"/>
+        </w:rPr>
+        <w:t xml:space="preserve">BSD </w:t>
+      </w:r>
+      <w:bookmarkStart w:name="_Int_u14OiYTo" w:id="786575150"/>
+      <w:r>
+        <w:rPr>
+          <w:b w:val="1"/>
+          <w:bCs w:val="1"/>
+          <w:i w:val="1"/>
+          <w:iCs w:val="1"/>
+          <w:lang w:val="en-US"/>
+        </w:rPr>
+        <w:t>License</w:t>
+      </w:r>
+      <w:r>
+        <w:rPr>
+          <w:i w:val="1"/>
+          <w:iCs w:val="1"/>
+          <w:lang w:val="en-US"/>
+        </w:rPr>
+        <w:t xml:space="preserve"> :</w:t>
+      </w:r>
+      <w:bookmarkEnd w:id="786575150"/>
+    </w:p>
+    <w:p>
+      <w:pPr>
+        <w:pStyle w:val="Normal"/>
+        <w:rPr>
+          <w:i w:val="1"/>
+          <w:iCs w:val="1"/>
+        </w:rPr>
+      </w:pPr>
+      <w:r>
+        <w:rPr>
+          <w:u w:val="single"/>
+        </w:rPr>
+        <w:t xml:space="preserve">Dominio </w:t>
+      </w:r>
+      <w:bookmarkStart w:name="_Int_WeaA8FST" w:id="1430791908"/>
+      <w:r>
+        <w:rPr>
+          <w:u w:val="single"/>
+        </w:rPr>
+        <w:t>público</w:t>
+      </w:r>
+      <w:r>
+        <w:rPr/>
+        <w:t xml:space="preserve"> :</w:t>
+      </w:r>
+      <w:bookmarkEnd w:id="1430791908"/>
+      <w:r>
+        <w:rPr/>
+        <w:t xml:space="preserve"> </w:t>
+      </w:r>
+    </w:p>
+    <w:p>
+      <w:pPr>
+        <w:pStyle w:val="Normal"/>
+      </w:pPr>
+      <w:r>
+        <w:rPr>
+          <w:b w:val="1"/>
+          <w:bCs w:val="1"/>
+          <w:i w:val="1"/>
+          <w:iCs w:val="1"/>
+        </w:rPr>
+        <w:t xml:space="preserve">CC0 </w:t>
+      </w:r>
+      <w:r>
+        <w:rPr>
+          <w:i w:val="1"/>
+          <w:iCs w:val="1"/>
+        </w:rPr>
+        <w:t>:</w:t>
+      </w:r>
+      <w:r>
+        <w:br/>
+      </w:r>
+      <w:r>
+        <w:rPr>
+          <w:b w:val="1"/>
+          <w:bCs w:val="1"/>
+          <w:i w:val="1"/>
+          <w:iCs w:val="1"/>
+        </w:rPr>
+        <w:t>Unlicense</w:t>
+      </w:r>
+      <w:r>
+        <w:rPr>
+          <w:i w:val="1"/>
+          <w:iCs w:val="1"/>
+        </w:rPr>
+        <w:t xml:space="preserve"> :</w:t>
+      </w:r>
+      <w:r>
+        <w:br/>
+      </w:r>
+      <w:r>
+        <w:rPr>
+          <w:b w:val="1"/>
+          <w:bCs w:val="1"/>
+          <w:i w:val="1"/>
+          <w:iCs w:val="1"/>
+        </w:rPr>
+        <w:t>WTFPL</w:t>
+      </w:r>
+      <w:r>
+        <w:rPr>
+          <w:i w:val="1"/>
+          <w:iCs w:val="1"/>
+        </w:rPr>
+        <w:t xml:space="preserve"> :</w:t>
+      </w:r>
+      <w:r>
+        <w:br/>
+      </w:r>
+      <w:r>
+        <w:br/>
+      </w:r>
+    </w:p>
+    <w:p>
+      <w:pPr>
+        <w:pStyle w:val="Normal"/>
+        <w:rPr>
+          <w:lang w:val="en-US"/>
+        </w:rPr>
+      </w:pPr>
+      <w:r>
+        <w:br/>
+      </w:r>
+    </w:p>
+    <w:p>
+      <w:pPr>
+        <w:pStyle w:val="Normal"/>
+      </w:pPr>
+    </w:p>
+    <w:p>
+      <w:pPr>
+        <w:pStyle w:val="Normal"/>
+      </w:pPr>
+      <w:r>
+        <w:br/>
+      </w:r>
+    </w:p>
+    <w:p>
+      <w:pPr>
+        <w:pStyle w:val="Normal"/>
+      </w:pPr>
     </w:p>
     <w:p>
       <w:pPr>
         <w:pStyle w:val="Heading2"/>
       </w:pPr>
-      <w:bookmarkStart w:name="_Toc1919253877" w:id="1662035296"/>
+      <w:bookmarkStart w:name="_Toc399201739" w:id="1380771996"/>
       <w:r>
         <w:rPr/>
         <w:t>Comparación entre licencias</w:t>
       </w:r>
-      <w:bookmarkEnd w:id="1662035296"/>
+      <w:bookmarkEnd w:id="1380771996"/>
     </w:p>
     <w:p>
       <w:pPr>
@@ -597,7 +1412,7 @@
           <w:bCs w:val="1"/>
         </w:rPr>
       </w:pPr>
-      <w:bookmarkStart w:name="_Toc422482387" w:id="1562353554"/>
+      <w:bookmarkStart w:name="_Toc1517806272" w:id="1343324054"/>
       <w:r>
         <w:rPr>
           <w:b w:val="1"/>
@@ -605,7 +1420,7 @@
         </w:rPr>
         <w:t>Requisitos</w:t>
       </w:r>
-      <w:bookmarkEnd w:id="1562353554"/>
+      <w:bookmarkEnd w:id="1343324054"/>
     </w:p>
     <w:p>
       <w:pPr>
@@ -616,7 +1431,7 @@
         <w:ind w:left="0" w:right="0"/>
         <w:jc w:val="left"/>
       </w:pPr>
-      <w:bookmarkStart w:name="_Toc1908650395" w:id="1829366863"/>
+      <w:bookmarkStart w:name="_Toc1060950956" w:id="1401901114"/>
       <w:r>
         <w:rPr/>
         <w:t>R</w:t>
@@ -625,7 +1440,7 @@
         <w:rPr/>
         <w:t>equisitos de Hardware</w:t>
       </w:r>
-      <w:bookmarkEnd w:id="1829366863"/>
+      <w:bookmarkEnd w:id="1401901114"/>
     </w:p>
     <w:p>
       <w:pPr>
@@ -653,7 +1468,7 @@
           <w:iCs w:val="1"/>
           <w:u w:val="none"/>
         </w:rPr>
-        <w:t>Entre 1 y 1.5 GHz.</w:t>
+        <w:t>Entre 1 y 1.5 GHz</w:t>
       </w:r>
     </w:p>
     <w:p>
@@ -678,6 +1493,8 @@
       </w:r>
       <w:r>
         <w:rPr>
+          <w:i w:val="1"/>
+          <w:iCs w:val="1"/>
           <w:u w:val="none"/>
         </w:rPr>
         <w:t>260 MB</w:t>
@@ -705,6 +1522,8 @@
       </w:r>
       <w:r>
         <w:rPr>
+          <w:i w:val="1"/>
+          <w:iCs w:val="1"/>
           <w:u w:val="none"/>
         </w:rPr>
         <w:t>5 MB</w:t>
@@ -732,6 +1551,8 @@
       </w:r>
       <w:r>
         <w:rPr>
+          <w:i w:val="1"/>
+          <w:iCs w:val="1"/>
           <w:u w:val="none"/>
         </w:rPr>
         <w:t>Requiere conexión a internet para poder utilizar las funciones de localización en mapa interactivo, y para el registro de movimientos en la página web.</w:t>
@@ -754,7 +1575,7 @@
         <w:ind w:left="0" w:right="0"/>
         <w:jc w:val="left"/>
       </w:pPr>
-      <w:bookmarkStart w:name="_Toc1859130345" w:id="1129459843"/>
+      <w:bookmarkStart w:name="_Toc1663264036" w:id="570745839"/>
       <w:r>
         <w:rPr/>
         <w:t>R</w:t>
@@ -763,7 +1584,7 @@
         <w:rPr/>
         <w:t>equisitos de Software</w:t>
       </w:r>
-      <w:bookmarkEnd w:id="1129459843"/>
+      <w:bookmarkEnd w:id="570745839"/>
     </w:p>
     <w:p>
       <w:pPr>
@@ -1043,6 +1864,11 @@
     <w:p>
       <w:pPr>
         <w:pStyle w:val="Normal"/>
+        <w:rPr>
+          <w:i w:val="1"/>
+          <w:iCs w:val="1"/>
+          <w:u w:val="none"/>
+        </w:rPr>
       </w:pPr>
       <w:r>
         <w:rPr>
@@ -1065,60 +1891,11 @@
     <w:p>
       <w:pPr>
         <w:pStyle w:val="Normal"/>
-        <w:spacing w:before="240" w:beforeAutospacing="off" w:after="240" w:afterAutospacing="off"/>
-      </w:pPr>
-      <w:r>
-        <w:rPr>
-          <w:u w:val="single"/>
-        </w:rPr>
-        <w:t>Servidor</w:t>
-      </w:r>
-      <w:r>
-        <w:br/>
-      </w:r>
-      <w:r>
-        <w:rPr>
-          <w:i w:val="1"/>
-          <w:iCs w:val="1"/>
-          <w:u w:val="none"/>
-        </w:rPr>
-        <w:t xml:space="preserve">Algunas funciones del programa están vinculadas con el siguiente servidor </w:t>
-      </w:r>
-      <w:bookmarkStart w:name="_Int_PC0UU3qx" w:id="1201115950"/>
-      <w:r>
-        <w:rPr>
-          <w:i w:val="1"/>
-          <w:iCs w:val="1"/>
-          <w:u w:val="none"/>
-        </w:rPr>
-        <w:t>web</w:t>
-      </w:r>
-      <w:r>
-        <w:rPr>
-          <w:i w:val="1"/>
-          <w:iCs w:val="1"/>
-          <w:u w:val="none"/>
-        </w:rPr>
-        <w:t xml:space="preserve"> </w:t>
-      </w:r>
-      <w:r>
-        <w:rPr>
-          <w:i w:val="1"/>
-          <w:iCs w:val="1"/>
-          <w:u w:val="none"/>
-        </w:rPr>
-        <w:t>:</w:t>
-      </w:r>
-      <w:bookmarkEnd w:id="1201115950"/>
-      <w:r>
-        <w:rPr>
-          <w:i w:val="1"/>
-          <w:iCs w:val="1"/>
-          <w:u w:val="single"/>
-        </w:rPr>
-        <w:t xml:space="preserve"> </w:t>
-      </w:r>
-      <w:r>
+        <w:suppressLineNumbers w:val="0"/>
+        <w:bidi w:val="0"/>
+        <w:spacing w:before="240" w:beforeAutospacing="off" w:after="240" w:afterAutospacing="off" w:line="279" w:lineRule="auto"/>
+        <w:ind w:left="0" w:right="0"/>
+        <w:jc w:val="left"/>
         <w:rPr>
           <w:rFonts w:ascii="Aptos" w:hAnsi="Aptos" w:eastAsia="Aptos" w:cs="Aptos"/>
           <w:i w:val="1"/>
@@ -1128,16 +1905,126 @@
           <w:szCs w:val="24"/>
           <w:lang w:val="es-ES"/>
         </w:rPr>
+      </w:pPr>
+      <w:r>
+        <w:rPr>
+          <w:u w:val="single"/>
+        </w:rPr>
+        <w:t>Servidor</w:t>
+      </w:r>
+      <w:r>
+        <w:br/>
+      </w:r>
+      <w:r>
+        <w:rPr>
+          <w:i w:val="1"/>
+          <w:iCs w:val="1"/>
+          <w:u w:val="none"/>
+        </w:rPr>
+        <w:t xml:space="preserve">Algunas funciones del programa están vinculadas con el siguiente servidor </w:t>
+      </w:r>
+      <w:bookmarkStart w:name="_Int_PC0UU3qx" w:id="1201115950"/>
+      <w:r>
+        <w:rPr>
+          <w:i w:val="1"/>
+          <w:iCs w:val="1"/>
+          <w:u w:val="none"/>
+        </w:rPr>
+        <w:t>web</w:t>
+      </w:r>
+      <w:r>
+        <w:rPr>
+          <w:i w:val="1"/>
+          <w:iCs w:val="1"/>
+          <w:u w:val="none"/>
+        </w:rPr>
+        <w:t xml:space="preserve"> </w:t>
+      </w:r>
+      <w:r>
+        <w:rPr>
+          <w:i w:val="1"/>
+          <w:iCs w:val="1"/>
+          <w:u w:val="none"/>
+        </w:rPr>
+        <w:t>:</w:t>
+      </w:r>
+      <w:bookmarkEnd w:id="1201115950"/>
+      <w:r>
+        <w:rPr>
+          <w:i w:val="1"/>
+          <w:iCs w:val="1"/>
+          <w:u w:val="none"/>
+        </w:rPr>
+        <w:t xml:space="preserve"> </w:t>
+      </w:r>
+      <w:r>
+        <w:rPr>
+          <w:rFonts w:ascii="Aptos" w:hAnsi="Aptos" w:eastAsia="Aptos" w:cs="Aptos"/>
+          <w:i w:val="1"/>
+          <w:iCs w:val="1"/>
+          <w:noProof w:val="0"/>
+          <w:sz w:val="24"/>
+          <w:szCs w:val="24"/>
+          <w:u w:val="none"/>
+          <w:lang w:val="es-ES"/>
+        </w:rPr>
         <w:t>52.44.197.21</w:t>
       </w:r>
-    </w:p>
-    <w:p>
-      <w:pPr>
-        <w:pStyle w:val="Normal"/>
-        <w:rPr>
-          <w:i w:val="1"/>
-          <w:iCs w:val="1"/>
+      <w:r>
+        <w:br/>
+      </w:r>
+      <w:r>
+        <w:rPr>
+          <w:rFonts w:ascii="Aptos" w:hAnsi="Aptos" w:eastAsia="Aptos" w:cs="Aptos"/>
+          <w:i w:val="1"/>
+          <w:iCs w:val="1"/>
+          <w:noProof w:val="0"/>
+          <w:sz w:val="24"/>
+          <w:szCs w:val="24"/>
           <w:u w:val="none"/>
+          <w:lang w:val="es-ES"/>
+        </w:rPr>
+        <w:t>Versión Chrome</w:t>
+      </w:r>
+      <w:bookmarkStart w:name="_Int_izmYSkhS" w:id="1287169969"/>
+      <w:r>
+        <w:rPr>
+          <w:rFonts w:ascii="Aptos" w:hAnsi="Aptos" w:eastAsia="Aptos" w:cs="Aptos"/>
+          <w:i w:val="1"/>
+          <w:iCs w:val="1"/>
+          <w:noProof w:val="0"/>
+          <w:sz w:val="24"/>
+          <w:szCs w:val="24"/>
+          <w:u w:val="none"/>
+          <w:lang w:val="es-ES"/>
+        </w:rPr>
+        <w:t xml:space="preserve"> :</w:t>
+      </w:r>
+      <w:bookmarkEnd w:id="1287169969"/>
+      <w:r>
+        <w:rPr>
+          <w:rFonts w:ascii="Aptos" w:hAnsi="Aptos" w:eastAsia="Aptos" w:cs="Aptos"/>
+          <w:i w:val="1"/>
+          <w:iCs w:val="1"/>
+          <w:noProof w:val="0"/>
+          <w:sz w:val="24"/>
+          <w:szCs w:val="24"/>
+          <w:u w:val="none"/>
+          <w:lang w:val="es-ES"/>
+        </w:rPr>
+        <w:t xml:space="preserve"> Chrome 148</w:t>
+      </w:r>
+      <w:r>
+        <w:br/>
+      </w:r>
+    </w:p>
+    <w:p>
+      <w:pPr>
+        <w:pStyle w:val="Normal"/>
+        <w:rPr>
+          <w:i w:val="1"/>
+          <w:iCs w:val="1"/>
+          <w:u w:val="none"/>
         </w:rPr>
       </w:pPr>
       <w:r>
@@ -1228,7 +2115,7 @@
           <w:bCs w:val="1"/>
         </w:rPr>
       </w:pPr>
-      <w:bookmarkStart w:name="_Toc272745850" w:id="200191874"/>
+      <w:bookmarkStart w:name="_Toc77101453" w:id="131007922"/>
       <w:r>
         <w:rPr>
           <w:b w:val="1"/>
@@ -1236,7 +2123,7 @@
         </w:rPr>
         <w:t>Instalación</w:t>
       </w:r>
-      <w:bookmarkEnd w:id="200191874"/>
+      <w:bookmarkEnd w:id="131007922"/>
     </w:p>
     <w:p>
       <w:pPr>
@@ -1251,7 +2138,7 @@
           <w:bCs w:val="1"/>
         </w:rPr>
       </w:pPr>
-      <w:bookmarkStart w:name="_Toc1287449758" w:id="653416996"/>
+      <w:bookmarkStart w:name="_Toc81259772" w:id="1747516886"/>
       <w:r>
         <w:rPr>
           <w:b w:val="1"/>
@@ -1259,7 +2146,7 @@
         </w:rPr>
         <w:t>Guía de uso</w:t>
       </w:r>
-      <w:bookmarkEnd w:id="653416996"/>
+      <w:bookmarkEnd w:id="1747516886"/>
     </w:p>
     <w:p>
       <w:pPr>
@@ -1270,7 +2157,7 @@
           <w:bCs w:val="1"/>
         </w:rPr>
       </w:pPr>
-      <w:bookmarkStart w:name="_Toc540836682" w:id="894805128"/>
+      <w:bookmarkStart w:name="_Toc2133818568" w:id="1758806372"/>
       <w:r>
         <w:rPr>
           <w:b w:val="1"/>
@@ -1278,7 +2165,7 @@
         </w:rPr>
         <w:t>Problemas frecuentes y solución</w:t>
       </w:r>
-      <w:bookmarkEnd w:id="894805128"/>
+      <w:bookmarkEnd w:id="1758806372"/>
     </w:p>
     <w:p/>
     <w:p/>
@@ -1664,6 +2551,24 @@
 <file path=word/intelligence2.xml><?xml version="1.0" encoding="utf-8"?>
 <int2:intelligence xmlns:int2="http://schemas.microsoft.com/office/intelligence/2020/intelligence">
   <int2:observations>
+    <int2:textHash int2:hashCode="Rrt+PC8NAaOqSj" int2:id="qMjHCwBo">
+      <int2:state int2:type="spell" int2:value="Rejected"/>
+    </int2:textHash>
+    <int2:textHash int2:hashCode="vNK/uVbbUgpC4F" int2:id="CTUN6MNB">
+      <int2:state int2:type="spell" int2:value="Rejected"/>
+    </int2:textHash>
+    <int2:textHash int2:hashCode="CxkbMqEdi9EkbM" int2:id="OOTuh9Jo">
+      <int2:state int2:type="spell" int2:value="Rejected"/>
+    </int2:textHash>
+    <int2:textHash int2:hashCode="euv8k3kA9StEvs" int2:id="bAzBxNWS">
+      <int2:state int2:type="spell" int2:value="Rejected"/>
+    </int2:textHash>
+    <int2:textHash int2:hashCode="go0zipsEIhycvi" int2:id="9EjYPp20">
+      <int2:state int2:type="spell" int2:value="Rejected"/>
+    </int2:textHash>
+    <int2:textHash int2:hashCode="I0VxKbhx1pCjtN" int2:id="4PwW5ekP">
+      <int2:state int2:type="spell" int2:value="Rejected"/>
+    </int2:textHash>
     <int2:textHash int2:hashCode="JOdFHfBe1c1M8Q" int2:id="BGhmqRsD">
       <int2:state int2:type="spell" int2:value="Rejected"/>
     </int2:textHash>
@@ -1679,6 +2584,63 @@
     <int2:textHash int2:hashCode="9+LyU1u5NhH3uV" int2:id="wxPVyvBi">
       <int2:state int2:type="spell" int2:value="Rejected"/>
     </int2:textHash>
+    <int2:bookmark int2:bookmarkName="_Int_iHhWgWn9" int2:invalidationBookmarkName="" int2:hashCode="GgOKH3Y34D2IMf" int2:id="Cf0Eqnvv">
+      <int2:state int2:type="gram" int2:value="Rejected"/>
+    </int2:bookmark>
+    <int2:bookmark int2:bookmarkName="_Int_QcWw9Dl5" int2:invalidationBookmarkName="" int2:hashCode="j3/5UV1kd056GV" int2:id="Gi6bCd1X">
+      <int2:state int2:type="gram" int2:value="Rejected"/>
+    </int2:bookmark>
+    <int2:bookmark int2:bookmarkName="_Int_Onu0VE9h" int2:invalidationBookmarkName="" int2:hashCode="xo9HxJxlI02xYk" int2:id="feySPG9E">
+      <int2:state int2:type="gram" int2:value="Rejected"/>
+    </int2:bookmark>
+    <int2:bookmark int2:bookmarkName="_Int_u14OiYTo" int2:invalidationBookmarkName="" int2:hashCode="GgOKH3Y34D2IMf" int2:id="101Ef1Cr">
+      <int2:state int2:type="gram" int2:value="Rejected"/>
+    </int2:bookmark>
+    <int2:bookmark int2:bookmarkName="_Int_q1gubYzH" int2:invalidationBookmarkName="" int2:hashCode="j3/5UV1kd056GV" int2:id="8LUwlDHM">
+      <int2:state int2:type="gram" int2:value="Rejected"/>
+    </int2:bookmark>
+    <int2:bookmark int2:bookmarkName="_Int_GoY55r2F" int2:invalidationBookmarkName="" int2:hashCode="GgOKH3Y34D2IMf" int2:id="Ayckn7Mz">
+      <int2:state int2:type="gram" int2:value="Rejected"/>
+    </int2:bookmark>
+    <int2:bookmark int2:bookmarkName="_Int_hKjV3oYq" int2:invalidationBookmarkName="" int2:hashCode="xo9HxJxlI02xYk" int2:id="LRd5z0Xt">
+      <int2:state int2:type="gram" int2:value="Rejected"/>
+    </int2:bookmark>
+    <int2:bookmark int2:bookmarkName="_Int_pXWCEQrJ" int2:invalidationBookmarkName="" int2:hashCode="oyYTSSFghkGb9z" int2:id="40REclGI">
+      <int2:state int2:type="gram" int2:value="Rejected"/>
+    </int2:bookmark>
+    <int2:bookmark int2:bookmarkName="_Int_WeaA8FST" int2:invalidationBookmarkName="" int2:hashCode="3PfC+GJZBDhYvZ" int2:id="ByMekUOA">
+      <int2:state int2:type="gram" int2:value="Rejected"/>
+    </int2:bookmark>
+    <int2:bookmark int2:bookmarkName="_Int_2wOWNsbJ" int2:invalidationBookmarkName="" int2:hashCode="mzu2CnX9I5dePd" int2:id="hXjOlsew">
+      <int2:state int2:type="gram" int2:value="Rejected"/>
+    </int2:bookmark>
+    <int2:bookmark int2:bookmarkName="_Int_Wy9nliN4" int2:invalidationBookmarkName="" int2:hashCode="mzu2CnX9I5dePd" int2:id="RrE5JG0A">
+      <int2:state int2:type="gram" int2:value="Rejected"/>
+    </int2:bookmark>
+    <int2:bookmark int2:bookmarkName="_Int_BNGyn2rD" int2:invalidationBookmarkName="" int2:hashCode="JS5tuGqORwI101" int2:id="JD3COfX1">
+      <int2:state int2:type="gram" int2:value="Rejected"/>
+    </int2:bookmark>
+    <int2:bookmark int2:bookmarkName="_Int_A2EOY0AI" int2:invalidationBookmarkName="" int2:hashCode="3PfC+GJZBDhYvZ" int2:id="14I4MeYv">
+      <int2:state int2:type="gram" int2:value="Rejected"/>
+    </int2:bookmark>
+    <int2:bookmark int2:bookmarkName="_Int_kX4wvsCi" int2:invalidationBookmarkName="" int2:hashCode="3PfC+GJZBDhYvZ" int2:id="U553FoWv">
+      <int2:state int2:type="gram" int2:value="Rejected"/>
+    </int2:bookmark>
+    <int2:bookmark int2:bookmarkName="_Int_FwNksKla" int2:invalidationBookmarkName="" int2:hashCode="JS5tuGqORwI101" int2:id="oO1CVZKr">
+      <int2:state int2:type="gram" int2:value="Rejected"/>
+    </int2:bookmark>
+    <int2:bookmark int2:bookmarkName="_Int_BkbyaetL" int2:invalidationBookmarkName="" int2:hashCode="oyYTSSFghkGb9z" int2:id="4FmXv0ks">
+      <int2:state int2:type="gram" int2:value="Rejected"/>
+    </int2:bookmark>
+    <int2:bookmark int2:bookmarkName="_Int_1PzHL1Bb" int2:invalidationBookmarkName="" int2:hashCode="kVILneHS+H1FUH" int2:id="H07xXBvG">
+      <int2:state int2:type="gram" int2:value="Rejected"/>
+    </int2:bookmark>
+    <int2:bookmark int2:bookmarkName="_Int_4QRaorbY" int2:invalidationBookmarkName="" int2:hashCode="mzu2CnX9I5dePd" int2:id="a82qQU7s">
+      <int2:state int2:type="gram" int2:value="Rejected"/>
+    </int2:bookmark>
+    <int2:bookmark int2:bookmarkName="_Int_izmYSkhS" int2:invalidationBookmarkName="" int2:hashCode="3haxrba8DazZMj" int2:id="E6a5AK7R">
+      <int2:state int2:type="gram" int2:value="Rejected"/>
+    </int2:bookmark>
     <int2:bookmark int2:bookmarkName="_Int_PC0UU3qx" int2:invalidationBookmarkName="" int2:hashCode="KOUfLdXGd6UHXG" int2:id="Z7IcNzX5">
       <int2:state int2:type="gram" int2:value="Rejected"/>
     </int2:bookmark>

</xml_diff>

<commit_message>
Manual de usuario - Licencias terminadas
</commit_message>
<xml_diff>
--- a/Programacion/Manual de usuario/Manual de usuario.docx
+++ b/Programacion/Manual de usuario/Manual de usuario.docx
@@ -651,6 +651,11 @@
     <w:p>
       <w:pPr>
         <w:pStyle w:val="Normal"/>
+        <w:suppressLineNumbers w:val="0"/>
+        <w:bidi w:val="0"/>
+        <w:spacing w:before="0" w:beforeAutospacing="off" w:after="160" w:afterAutospacing="off" w:line="279" w:lineRule="auto"/>
+        <w:ind w:left="0" w:right="0"/>
+        <w:jc w:val="left"/>
         <w:rPr>
           <w:i w:val="1"/>
           <w:iCs w:val="1"/>
@@ -660,20 +665,22 @@
         <w:rPr>
           <w:u w:val="single"/>
         </w:rPr>
-        <w:t xml:space="preserve">Código </w:t>
+        <w:t xml:space="preserve">Software </w:t>
+      </w:r>
+      <w:bookmarkStart w:name="_Int_Vri9LjKR" w:id="333783046"/>
+      <w:r>
+        <w:rPr>
+          <w:u w:val="single"/>
+        </w:rPr>
+        <w:t>propietario</w:t>
       </w:r>
       <w:bookmarkStart w:name="_Int_BNGyn2rD" w:id="804433918"/>
-      <w:r>
-        <w:rPr>
-          <w:u w:val="single"/>
-        </w:rPr>
-        <w:t>cerrado</w:t>
-      </w:r>
       <w:r>
         <w:rPr/>
         <w:t xml:space="preserve"> :</w:t>
       </w:r>
       <w:bookmarkEnd w:id="804433918"/>
+      <w:bookmarkEnd w:id="333783046"/>
       <w:r>
         <w:rPr/>
         <w:t xml:space="preserve"> </w:t>
@@ -745,7 +752,6 @@
         </w:rPr>
         <w:t xml:space="preserve">Adobe </w:t>
       </w:r>
-      <w:bookmarkStart w:name="_Int_hKjV3oYq" w:id="1820288658"/>
       <w:bookmarkStart w:name="_Int_Onu0VE9h" w:id="1899355236"/>
       <w:r>
         <w:rPr>
@@ -778,11 +784,15 @@
         </w:rPr>
         <w:t>La licencia es de pago, pero caduca y se tiene que renovar a través de una suscripción.</w:t>
       </w:r>
-      <w:bookmarkEnd w:id="1820288658"/>
     </w:p>
     <w:p>
       <w:pPr>
         <w:pStyle w:val="Normal"/>
+        <w:suppressLineNumbers w:val="0"/>
+        <w:bidi w:val="0"/>
+        <w:spacing w:before="0" w:beforeAutospacing="off" w:after="160" w:afterAutospacing="off" w:line="279" w:lineRule="auto"/>
+        <w:ind w:left="0" w:right="0"/>
+        <w:jc w:val="left"/>
         <w:rPr>
           <w:i w:val="1"/>
           <w:iCs w:val="1"/>
@@ -794,28 +804,14 @@
           <w:u w:val="single"/>
           <w:lang w:val="en-US"/>
         </w:rPr>
-        <w:t xml:space="preserve">Código </w:t>
+        <w:t>C</w:t>
       </w:r>
       <w:r>
         <w:rPr>
           <w:u w:val="single"/>
           <w:lang w:val="en-US"/>
         </w:rPr>
-        <w:t>abierto</w:t>
-      </w:r>
-      <w:r>
-        <w:rPr>
-          <w:u w:val="single"/>
-          <w:lang w:val="en-US"/>
-        </w:rPr>
-        <w:t xml:space="preserve"> robustas </w:t>
-      </w:r>
-      <w:r>
-        <w:rPr>
-          <w:u w:val="single"/>
-          <w:lang w:val="en-US"/>
-        </w:rPr>
-        <w:t>fuertes</w:t>
+        <w:t>opyleft fuerte</w:t>
       </w:r>
       <w:r>
         <w:rPr>
@@ -833,11 +829,6 @@
     <w:p>
       <w:pPr>
         <w:pStyle w:val="Normal"/>
-        <w:rPr>
-          <w:i w:val="1"/>
-          <w:iCs w:val="1"/>
-          <w:lang w:val="es-ES"/>
-        </w:rPr>
       </w:pPr>
       <w:r>
         <w:rPr>
@@ -869,7 +860,7 @@
         </w:rPr>
         <w:t xml:space="preserve"> v. </w:t>
       </w:r>
-      <w:bookmarkStart w:name="_Int_QcWw9Dl5" w:id="492922352"/>
+      <w:bookmarkStart w:name="_Int_LTK0zGtF" w:id="1825119616"/>
       <w:r>
         <w:rPr>
           <w:b w:val="1"/>
@@ -878,28 +869,9 @@
           <w:iCs w:val="1"/>
           <w:lang w:val="es-ES"/>
         </w:rPr>
-        <w:t>2.0.</w:t>
-      </w:r>
-      <w:r>
-        <w:rPr>
-          <w:i w:val="1"/>
-          <w:iCs w:val="1"/>
-          <w:lang w:val="es-ES"/>
-        </w:rPr>
-        <w:t xml:space="preserve"> :</w:t>
-      </w:r>
-      <w:bookmarkEnd w:id="492922352"/>
-      <w:r>
-        <w:rPr>
-          <w:i w:val="1"/>
-          <w:iCs w:val="1"/>
-          <w:lang w:val="es-ES"/>
-        </w:rPr>
-        <w:t xml:space="preserve"> Copyleft</w:t>
-      </w:r>
-      <w:r>
-        <w:br/>
-      </w:r>
+        <w:t>3</w:t>
+      </w:r>
+      <w:bookmarkStart w:name="_Int_QcWw9Dl5" w:id="492922352"/>
       <w:r>
         <w:rPr>
           <w:b w:val="1"/>
@@ -908,7 +880,52 @@
           <w:iCs w:val="1"/>
           <w:lang w:val="es-ES"/>
         </w:rPr>
-        <w:t xml:space="preserve">Eclipse Public </w:t>
+        <w:t>.0.</w:t>
+      </w:r>
+      <w:r>
+        <w:rPr>
+          <w:i w:val="1"/>
+          <w:iCs w:val="1"/>
+          <w:lang w:val="es-ES"/>
+        </w:rPr>
+        <w:t xml:space="preserve"> :</w:t>
+      </w:r>
+      <w:bookmarkEnd w:id="492922352"/>
+      <w:bookmarkEnd w:id="1825119616"/>
+      <w:r>
+        <w:rPr>
+          <w:i w:val="1"/>
+          <w:iCs w:val="1"/>
+          <w:lang w:val="es-ES"/>
+        </w:rPr>
+        <w:t xml:space="preserve"> </w:t>
+      </w:r>
+      <w:r>
+        <w:rPr>
+          <w:i w:val="1"/>
+          <w:iCs w:val="1"/>
+          <w:lang w:val="es-ES"/>
+        </w:rPr>
+        <w:t xml:space="preserve">El software puede usarse </w:t>
+      </w:r>
+      <w:r>
+        <w:rPr>
+          <w:i w:val="1"/>
+          <w:iCs w:val="1"/>
+          <w:lang w:val="es-ES"/>
+        </w:rPr>
+        <w:t>bajo unas condiciones mínimas</w:t>
+      </w:r>
+      <w:r>
+        <w:rPr>
+          <w:i w:val="1"/>
+          <w:iCs w:val="1"/>
+          <w:lang w:val="es-ES"/>
+        </w:rPr>
+        <w:t>, pero cualquier derivado debe mantener las mismas libertades.</w:t>
+      </w:r>
+      <w:r>
+        <w:br/>
       </w:r>
       <w:r>
         <w:rPr>
@@ -918,26 +935,7 @@
           <w:iCs w:val="1"/>
           <w:lang w:val="es-ES"/>
         </w:rPr>
-        <w:t>License</w:t>
-      </w:r>
-      <w:r>
-        <w:rPr>
-          <w:i w:val="1"/>
-          <w:iCs w:val="1"/>
-          <w:lang w:val="es-ES"/>
-        </w:rPr>
-        <w:t xml:space="preserve"> :</w:t>
-      </w:r>
-      <w:r>
-        <w:rPr>
-          <w:i w:val="1"/>
-          <w:iCs w:val="1"/>
-          <w:lang w:val="es-ES"/>
-        </w:rPr>
-        <w:t xml:space="preserve"> Código abierto. Permite uso comercial. Mantener derechos de autor.</w:t>
-      </w:r>
-      <w:r>
-        <w:br/>
+        <w:t xml:space="preserve">Eclipse Public </w:t>
       </w:r>
       <w:r>
         <w:rPr>
@@ -947,9 +945,137 @@
           <w:iCs w:val="1"/>
           <w:lang w:val="es-ES"/>
         </w:rPr>
-        <w:t xml:space="preserve">OpenSSL </w:t>
-      </w:r>
-      <w:bookmarkStart w:name="_Int_GoY55r2F" w:id="1940586703"/>
+        <w:t>License</w:t>
+      </w:r>
+      <w:r>
+        <w:rPr>
+          <w:i w:val="1"/>
+          <w:iCs w:val="1"/>
+          <w:lang w:val="es-ES"/>
+        </w:rPr>
+        <w:t xml:space="preserve"> :</w:t>
+      </w:r>
+      <w:r>
+        <w:rPr>
+          <w:i w:val="1"/>
+          <w:iCs w:val="1"/>
+          <w:lang w:val="es-ES"/>
+        </w:rPr>
+        <w:t xml:space="preserve"> </w:t>
+      </w:r>
+      <w:r>
+        <w:rPr>
+          <w:i w:val="1"/>
+          <w:iCs w:val="1"/>
+          <w:lang w:val="es-ES"/>
+        </w:rPr>
+        <w:t xml:space="preserve">El software puede usarse </w:t>
+      </w:r>
+      <w:r>
+        <w:rPr>
+          <w:i w:val="1"/>
+          <w:iCs w:val="1"/>
+          <w:lang w:val="es-ES"/>
+        </w:rPr>
+        <w:t>bajo unas condiciones mínimas</w:t>
+      </w:r>
+      <w:r>
+        <w:rPr>
+          <w:i w:val="1"/>
+          <w:iCs w:val="1"/>
+          <w:lang w:val="es-ES"/>
+        </w:rPr>
+        <w:t>, pero</w:t>
+      </w:r>
+      <w:r>
+        <w:rPr>
+          <w:i w:val="1"/>
+          <w:iCs w:val="1"/>
+          <w:lang w:val="es-ES"/>
+        </w:rPr>
+        <w:t xml:space="preserve"> un derivado puede combinar partes de código abierto con partes de código cerrado</w:t>
+      </w:r>
+      <w:r>
+        <w:rPr>
+          <w:i w:val="1"/>
+          <w:iCs w:val="1"/>
+          <w:lang w:val="es-ES"/>
+        </w:rPr>
+        <w:t xml:space="preserve"> (No tiene </w:t>
+      </w:r>
+      <w:bookmarkStart w:name="_Int_mo6XNs1U" w:id="1743440449"/>
+      <w:r>
+        <w:rPr>
+          <w:i w:val="1"/>
+          <w:iCs w:val="1"/>
+          <w:lang w:val="es-ES"/>
+        </w:rPr>
+        <w:t>por qu</w:t>
+      </w:r>
+      <w:r>
+        <w:rPr>
+          <w:i w:val="1"/>
+          <w:iCs w:val="1"/>
+          <w:lang w:val="es-ES"/>
+        </w:rPr>
+        <w:t>é</w:t>
+      </w:r>
+      <w:bookmarkEnd w:id="1743440449"/>
+      <w:r>
+        <w:rPr>
+          <w:i w:val="1"/>
+          <w:iCs w:val="1"/>
+          <w:lang w:val="es-ES"/>
+        </w:rPr>
+        <w:t xml:space="preserve"> afectar a todo el proyecto)</w:t>
+      </w:r>
+      <w:r>
+        <w:rPr>
+          <w:i w:val="1"/>
+          <w:iCs w:val="1"/>
+          <w:lang w:val="es-ES"/>
+        </w:rPr>
+        <w:t>.</w:t>
+      </w:r>
+    </w:p>
+    <w:p>
+      <w:pPr>
+        <w:pStyle w:val="Normal"/>
+        <w:suppressLineNumbers w:val="0"/>
+        <w:bidi w:val="0"/>
+        <w:spacing w:before="0" w:beforeAutospacing="off" w:after="160" w:afterAutospacing="off" w:line="279" w:lineRule="auto"/>
+        <w:ind w:left="0" w:right="0"/>
+        <w:jc w:val="left"/>
+      </w:pPr>
+      <w:r>
+        <w:rPr>
+          <w:u w:val="single"/>
+        </w:rPr>
+        <w:t xml:space="preserve">Copyleft </w:t>
+      </w:r>
+      <w:bookmarkStart w:name="_Int_geqKrWBl" w:id="262962573"/>
+      <w:r>
+        <w:rPr>
+          <w:u w:val="single"/>
+        </w:rPr>
+        <w:t>débil</w:t>
+      </w:r>
+      <w:bookmarkStart w:name="_Int_pXWCEQrJ" w:id="902082552"/>
+      <w:r>
+        <w:rPr/>
+        <w:t xml:space="preserve"> :</w:t>
+      </w:r>
+      <w:bookmarkEnd w:id="902082552"/>
+      <w:bookmarkEnd w:id="262962573"/>
+      <w:r>
+        <w:rPr/>
+        <w:t xml:space="preserve"> </w:t>
+      </w:r>
+    </w:p>
+    <w:p>
+      <w:pPr>
+        <w:pStyle w:val="Normal"/>
+      </w:pPr>
       <w:r>
         <w:rPr>
           <w:b w:val="1"/>
@@ -958,25 +1084,544 @@
           <w:iCs w:val="1"/>
           <w:lang w:val="es-ES"/>
         </w:rPr>
+        <w:t xml:space="preserve">Apache </w:t>
+      </w:r>
+      <w:r>
+        <w:rPr>
+          <w:b w:val="1"/>
+          <w:bCs w:val="1"/>
+          <w:i w:val="1"/>
+          <w:iCs w:val="1"/>
+          <w:lang w:val="es-ES"/>
+        </w:rPr>
         <w:t>License</w:t>
       </w:r>
       <w:r>
         <w:rPr>
+          <w:b w:val="1"/>
+          <w:bCs w:val="1"/>
           <w:i w:val="1"/>
           <w:iCs w:val="1"/>
           <w:lang w:val="es-ES"/>
         </w:rPr>
+        <w:t xml:space="preserve"> v </w:t>
+      </w:r>
+      <w:bookmarkStart w:name="_Int_U7HCu94M" w:id="191233352"/>
+      <w:r>
+        <w:rPr>
+          <w:b w:val="1"/>
+          <w:bCs w:val="1"/>
+          <w:i w:val="1"/>
+          <w:iCs w:val="1"/>
+          <w:lang w:val="es-ES"/>
+        </w:rPr>
+        <w:t>2.0.</w:t>
+      </w:r>
+      <w:r>
+        <w:rPr>
+          <w:i w:val="1"/>
+          <w:iCs w:val="1"/>
+          <w:lang w:val="es-ES"/>
+        </w:rPr>
         <w:t xml:space="preserve"> :</w:t>
       </w:r>
+      <w:bookmarkEnd w:id="191233352"/>
       <w:r>
         <w:rPr>
           <w:i w:val="1"/>
           <w:iCs w:val="1"/>
           <w:lang w:val="es-ES"/>
         </w:rPr>
-        <w:t xml:space="preserve"> (Apache License 2.0)</w:t>
-      </w:r>
-      <w:bookmarkEnd w:id="1940586703"/>
+        <w:t xml:space="preserve"> El software puede usarse bajo unas condiciones mínimas, pero siempre manteniendo los avisos de los derechos de autor y el texto de la licencia. La licencia es muy detallada y da más seguridad jurídica.</w:t>
+      </w:r>
+      <w:r>
+        <w:br/>
+      </w:r>
+      <w:r>
+        <w:rPr>
+          <w:b w:val="1"/>
+          <w:bCs w:val="1"/>
+          <w:i w:val="1"/>
+          <w:iCs w:val="1"/>
+          <w:lang w:val="en-US"/>
+        </w:rPr>
+        <w:t xml:space="preserve">Mozilla Public </w:t>
+      </w:r>
+      <w:bookmarkStart w:name="_Int_iHhWgWn9" w:id="771899124"/>
+      <w:r>
+        <w:rPr>
+          <w:b w:val="1"/>
+          <w:bCs w:val="1"/>
+          <w:i w:val="1"/>
+          <w:iCs w:val="1"/>
+          <w:lang w:val="en-US"/>
+        </w:rPr>
+        <w:t>License</w:t>
+      </w:r>
+      <w:r>
+        <w:rPr>
+          <w:i w:val="1"/>
+          <w:iCs w:val="1"/>
+          <w:lang w:val="en-US"/>
+        </w:rPr>
+        <w:t xml:space="preserve"> :</w:t>
+      </w:r>
+      <w:bookmarkEnd w:id="771899124"/>
+      <w:r>
+        <w:rPr>
+          <w:i w:val="1"/>
+          <w:iCs w:val="1"/>
+          <w:lang w:val="en-US"/>
+        </w:rPr>
+        <w:t xml:space="preserve"> </w:t>
+      </w:r>
+      <w:r>
+        <w:rPr>
+          <w:i w:val="1"/>
+          <w:iCs w:val="1"/>
+          <w:lang w:val="en-US"/>
+        </w:rPr>
+        <w:t xml:space="preserve">El software </w:t>
+      </w:r>
+      <w:r>
+        <w:rPr>
+          <w:i w:val="1"/>
+          <w:iCs w:val="1"/>
+          <w:lang w:val="en-US"/>
+        </w:rPr>
+        <w:t>puede</w:t>
+      </w:r>
+      <w:r>
+        <w:rPr>
+          <w:i w:val="1"/>
+          <w:iCs w:val="1"/>
+          <w:lang w:val="en-US"/>
+        </w:rPr>
+        <w:t xml:space="preserve"> </w:t>
+      </w:r>
+      <w:r>
+        <w:rPr>
+          <w:i w:val="1"/>
+          <w:iCs w:val="1"/>
+          <w:lang w:val="en-US"/>
+        </w:rPr>
+        <w:t>usarse</w:t>
+      </w:r>
+      <w:r>
+        <w:rPr>
+          <w:i w:val="1"/>
+          <w:iCs w:val="1"/>
+          <w:lang w:val="es-ES"/>
+        </w:rPr>
+        <w:t xml:space="preserve"> bajo unas condiciones mínimas</w:t>
+      </w:r>
+      <w:r>
+        <w:rPr>
+          <w:i w:val="1"/>
+          <w:iCs w:val="1"/>
+          <w:lang w:val="en-US"/>
+        </w:rPr>
+        <w:t xml:space="preserve">. También se </w:t>
+      </w:r>
+      <w:r>
+        <w:rPr>
+          <w:i w:val="1"/>
+          <w:iCs w:val="1"/>
+          <w:lang w:val="en-US"/>
+        </w:rPr>
+        <w:t>puede</w:t>
+      </w:r>
+      <w:r>
+        <w:rPr>
+          <w:i w:val="1"/>
+          <w:iCs w:val="1"/>
+          <w:lang w:val="en-US"/>
+        </w:rPr>
+        <w:t xml:space="preserve"> </w:t>
+      </w:r>
+      <w:r>
+        <w:rPr>
+          <w:i w:val="1"/>
+          <w:iCs w:val="1"/>
+          <w:lang w:val="en-US"/>
+        </w:rPr>
+        <w:t>insertar</w:t>
+      </w:r>
+      <w:r>
+        <w:rPr>
+          <w:i w:val="1"/>
+          <w:iCs w:val="1"/>
+          <w:lang w:val="en-US"/>
+        </w:rPr>
+        <w:t xml:space="preserve"> </w:t>
+      </w:r>
+      <w:r>
+        <w:rPr>
+          <w:i w:val="1"/>
+          <w:iCs w:val="1"/>
+          <w:lang w:val="en-US"/>
+        </w:rPr>
+        <w:t>en</w:t>
+      </w:r>
+      <w:r>
+        <w:rPr>
+          <w:i w:val="1"/>
+          <w:iCs w:val="1"/>
+          <w:lang w:val="en-US"/>
+        </w:rPr>
+        <w:t xml:space="preserve"> un </w:t>
+      </w:r>
+      <w:r>
+        <w:rPr>
+          <w:i w:val="1"/>
+          <w:iCs w:val="1"/>
+          <w:lang w:val="en-US"/>
+        </w:rPr>
+        <w:t>proyecto</w:t>
+      </w:r>
+      <w:r>
+        <w:rPr>
+          <w:i w:val="1"/>
+          <w:iCs w:val="1"/>
+          <w:lang w:val="en-US"/>
+        </w:rPr>
+        <w:t xml:space="preserve"> de </w:t>
+      </w:r>
+      <w:r>
+        <w:rPr>
+          <w:i w:val="1"/>
+          <w:iCs w:val="1"/>
+          <w:lang w:val="en-US"/>
+        </w:rPr>
+        <w:t>código</w:t>
+      </w:r>
+      <w:r>
+        <w:rPr>
+          <w:i w:val="1"/>
+          <w:iCs w:val="1"/>
+          <w:lang w:val="en-US"/>
+        </w:rPr>
+        <w:t xml:space="preserve"> </w:t>
+      </w:r>
+      <w:r>
+        <w:rPr>
+          <w:i w:val="1"/>
+          <w:iCs w:val="1"/>
+          <w:lang w:val="en-US"/>
+        </w:rPr>
+        <w:t>cerrado</w:t>
+      </w:r>
+      <w:r>
+        <w:rPr>
+          <w:i w:val="1"/>
+          <w:iCs w:val="1"/>
+          <w:lang w:val="en-US"/>
+        </w:rPr>
+        <w:t xml:space="preserve"> </w:t>
+      </w:r>
+      <w:r>
+        <w:rPr>
+          <w:i w:val="1"/>
+          <w:iCs w:val="1"/>
+          <w:lang w:val="es-ES"/>
+        </w:rPr>
+        <w:t xml:space="preserve">(No tiene </w:t>
+      </w:r>
+      <w:bookmarkStart w:name="_Int_bjfWwamN" w:id="1539482335"/>
+      <w:r>
+        <w:rPr>
+          <w:i w:val="1"/>
+          <w:iCs w:val="1"/>
+          <w:lang w:val="es-ES"/>
+        </w:rPr>
+        <w:t>por qué</w:t>
+      </w:r>
+      <w:bookmarkEnd w:id="1539482335"/>
+      <w:r>
+        <w:rPr>
+          <w:i w:val="1"/>
+          <w:iCs w:val="1"/>
+          <w:lang w:val="es-ES"/>
+        </w:rPr>
+        <w:t xml:space="preserve"> afectar a todo el proyecto)</w:t>
+      </w:r>
+      <w:r>
+        <w:rPr>
+          <w:i w:val="1"/>
+          <w:iCs w:val="1"/>
+          <w:lang w:val="en-US"/>
+        </w:rPr>
+        <w:t>.</w:t>
+      </w:r>
+      <w:r>
+        <w:br/>
+      </w:r>
+      <w:r>
+        <w:rPr>
+          <w:b w:val="1"/>
+          <w:bCs w:val="1"/>
+          <w:i w:val="1"/>
+          <w:iCs w:val="1"/>
+          <w:lang w:val="en-US"/>
+        </w:rPr>
+        <w:t>EUPL</w:t>
+      </w:r>
+      <w:r>
+        <w:rPr>
+          <w:i w:val="1"/>
+          <w:iCs w:val="1"/>
+          <w:lang w:val="en-US"/>
+        </w:rPr>
+        <w:t xml:space="preserve"> :</w:t>
+      </w:r>
+      <w:r>
+        <w:rPr>
+          <w:i w:val="1"/>
+          <w:iCs w:val="1"/>
+          <w:lang w:val="en-US"/>
+        </w:rPr>
+        <w:t xml:space="preserve"> Esta es la </w:t>
+      </w:r>
+      <w:r>
+        <w:rPr>
+          <w:i w:val="1"/>
+          <w:iCs w:val="1"/>
+          <w:lang w:val="en-US"/>
+        </w:rPr>
+        <w:t>Licencia</w:t>
+      </w:r>
+      <w:r>
+        <w:rPr>
+          <w:i w:val="1"/>
+          <w:iCs w:val="1"/>
+          <w:lang w:val="en-US"/>
+        </w:rPr>
+        <w:t xml:space="preserve"> Pública de la Unión Europea.</w:t>
+      </w:r>
+      <w:r>
+        <w:rPr>
+          <w:i w:val="1"/>
+          <w:iCs w:val="1"/>
+          <w:lang w:val="en-US"/>
+        </w:rPr>
+        <w:t xml:space="preserve"> </w:t>
+      </w:r>
+      <w:r>
+        <w:rPr>
+          <w:i w:val="1"/>
+          <w:iCs w:val="1"/>
+          <w:lang w:val="en-US"/>
+        </w:rPr>
+        <w:t>Permite</w:t>
+      </w:r>
+      <w:r>
+        <w:rPr>
+          <w:i w:val="1"/>
+          <w:iCs w:val="1"/>
+          <w:lang w:val="en-US"/>
+        </w:rPr>
+        <w:t xml:space="preserve"> </w:t>
+      </w:r>
+      <w:r>
+        <w:rPr>
+          <w:i w:val="1"/>
+          <w:iCs w:val="1"/>
+          <w:lang w:val="en-US"/>
+        </w:rPr>
+        <w:t>utilizar</w:t>
+      </w:r>
+      <w:r>
+        <w:rPr>
+          <w:i w:val="1"/>
+          <w:iCs w:val="1"/>
+          <w:lang w:val="en-US"/>
+        </w:rPr>
+        <w:t xml:space="preserve"> </w:t>
+      </w:r>
+      <w:r>
+        <w:rPr>
+          <w:i w:val="1"/>
+          <w:iCs w:val="1"/>
+          <w:lang w:val="en-US"/>
+        </w:rPr>
+        <w:t>el</w:t>
+      </w:r>
+      <w:r>
+        <w:rPr>
+          <w:i w:val="1"/>
+          <w:iCs w:val="1"/>
+          <w:lang w:val="en-US"/>
+        </w:rPr>
+        <w:t xml:space="preserve"> software </w:t>
+      </w:r>
+      <w:r>
+        <w:rPr>
+          <w:i w:val="1"/>
+          <w:iCs w:val="1"/>
+          <w:lang w:val="es-ES"/>
+        </w:rPr>
+        <w:t>bajo unas condiciones mínimas</w:t>
+      </w:r>
+      <w:r>
+        <w:rPr>
+          <w:i w:val="1"/>
+          <w:iCs w:val="1"/>
+          <w:lang w:val="en-US"/>
+        </w:rPr>
+        <w:t xml:space="preserve">, </w:t>
+      </w:r>
+      <w:r>
+        <w:rPr>
+          <w:i w:val="1"/>
+          <w:iCs w:val="1"/>
+          <w:lang w:val="en-US"/>
+        </w:rPr>
+        <w:t>manteniendo</w:t>
+      </w:r>
+      <w:r>
+        <w:rPr>
+          <w:i w:val="1"/>
+          <w:iCs w:val="1"/>
+          <w:lang w:val="en-US"/>
+        </w:rPr>
+        <w:t xml:space="preserve"> </w:t>
+      </w:r>
+      <w:r>
+        <w:rPr>
+          <w:i w:val="1"/>
+          <w:iCs w:val="1"/>
+          <w:lang w:val="en-US"/>
+        </w:rPr>
+        <w:t>siempre</w:t>
+      </w:r>
+      <w:r>
+        <w:rPr>
+          <w:i w:val="1"/>
+          <w:iCs w:val="1"/>
+          <w:lang w:val="en-US"/>
+        </w:rPr>
+        <w:t xml:space="preserve"> la </w:t>
+      </w:r>
+      <w:r>
+        <w:rPr>
+          <w:i w:val="1"/>
+          <w:iCs w:val="1"/>
+          <w:lang w:val="en-US"/>
+        </w:rPr>
+        <w:t>licencia</w:t>
+      </w:r>
+      <w:r>
+        <w:rPr>
+          <w:i w:val="1"/>
+          <w:iCs w:val="1"/>
+          <w:lang w:val="en-US"/>
+        </w:rPr>
+        <w:t xml:space="preserve"> original. </w:t>
+      </w:r>
+      <w:r>
+        <w:rPr>
+          <w:i w:val="1"/>
+          <w:iCs w:val="1"/>
+          <w:lang w:val="en-US"/>
+        </w:rPr>
+        <w:t>Está</w:t>
+      </w:r>
+      <w:r>
+        <w:rPr>
+          <w:i w:val="1"/>
+          <w:iCs w:val="1"/>
+          <w:lang w:val="en-US"/>
+        </w:rPr>
+        <w:t xml:space="preserve"> </w:t>
+      </w:r>
+      <w:r>
+        <w:rPr>
+          <w:i w:val="1"/>
+          <w:iCs w:val="1"/>
+          <w:lang w:val="en-US"/>
+        </w:rPr>
+        <w:t>diseñada</w:t>
+      </w:r>
+      <w:r>
+        <w:rPr>
+          <w:i w:val="1"/>
+          <w:iCs w:val="1"/>
+          <w:lang w:val="en-US"/>
+        </w:rPr>
+        <w:t xml:space="preserve"> para ser compatible con las </w:t>
+      </w:r>
+      <w:r>
+        <w:rPr>
+          <w:i w:val="1"/>
+          <w:iCs w:val="1"/>
+          <w:lang w:val="en-US"/>
+        </w:rPr>
+        <w:t>leyes</w:t>
+      </w:r>
+      <w:r>
+        <w:rPr>
+          <w:i w:val="1"/>
+          <w:iCs w:val="1"/>
+          <w:lang w:val="en-US"/>
+        </w:rPr>
+        <w:t xml:space="preserve"> de </w:t>
+      </w:r>
+      <w:r>
+        <w:rPr>
+          <w:i w:val="1"/>
+          <w:iCs w:val="1"/>
+          <w:lang w:val="en-US"/>
+        </w:rPr>
+        <w:t>los</w:t>
+      </w:r>
+      <w:r>
+        <w:rPr>
+          <w:i w:val="1"/>
+          <w:iCs w:val="1"/>
+          <w:lang w:val="en-US"/>
+        </w:rPr>
+        <w:t xml:space="preserve"> </w:t>
+      </w:r>
+      <w:r>
+        <w:rPr>
+          <w:i w:val="1"/>
+          <w:iCs w:val="1"/>
+          <w:lang w:val="en-US"/>
+        </w:rPr>
+        <w:t>países</w:t>
+      </w:r>
+      <w:r>
+        <w:rPr>
+          <w:i w:val="1"/>
+          <w:iCs w:val="1"/>
+          <w:lang w:val="en-US"/>
+        </w:rPr>
+        <w:t xml:space="preserve"> </w:t>
+      </w:r>
+      <w:r>
+        <w:rPr>
+          <w:i w:val="1"/>
+          <w:iCs w:val="1"/>
+          <w:lang w:val="en-US"/>
+        </w:rPr>
+        <w:t>miembros</w:t>
+      </w:r>
+      <w:r>
+        <w:rPr>
+          <w:i w:val="1"/>
+          <w:iCs w:val="1"/>
+          <w:lang w:val="en-US"/>
+        </w:rPr>
+        <w:t xml:space="preserve"> de la Unión Europea.</w:t>
+      </w:r>
+      <w:r>
+        <w:rPr>
+          <w:i w:val="1"/>
+          <w:iCs w:val="1"/>
+          <w:lang w:val="en-US"/>
+        </w:rPr>
+        <w:t xml:space="preserve"> Compatible con otras licencias.</w:t>
+      </w:r>
     </w:p>
     <w:p>
       <w:pPr>
@@ -990,20 +1635,531 @@
         <w:rPr>
           <w:u w:val="single"/>
         </w:rPr>
-        <w:t xml:space="preserve">Código abierto robustas </w:t>
-      </w:r>
-      <w:bookmarkStart w:name="_Int_pXWCEQrJ" w:id="902082552"/>
+        <w:t xml:space="preserve">Código </w:t>
+      </w:r>
+      <w:bookmarkStart w:name="_Int_hu64dXz0" w:id="2052037325"/>
       <w:r>
         <w:rPr>
           <w:u w:val="single"/>
         </w:rPr>
-        <w:t>débiles</w:t>
+        <w:t>abierto</w:t>
+      </w:r>
+      <w:r>
+        <w:rPr>
+          <w:u w:val="none"/>
+        </w:rPr>
+        <w:t xml:space="preserve"> </w:t>
+      </w:r>
+      <w:bookmarkStart w:name="_Int_2wOWNsbJ" w:id="1711188472"/>
+      <w:r>
+        <w:rPr/>
+        <w:t>:</w:t>
+      </w:r>
+      <w:bookmarkEnd w:id="1711188472"/>
+      <w:bookmarkEnd w:id="2052037325"/>
+      <w:r>
+        <w:rPr/>
+        <w:t xml:space="preserve"> </w:t>
+      </w:r>
+    </w:p>
+    <w:p>
+      <w:pPr>
+        <w:pStyle w:val="Normal"/>
+      </w:pPr>
+      <w:r>
+        <w:rPr>
+          <w:b w:val="1"/>
+          <w:bCs w:val="1"/>
+          <w:i w:val="1"/>
+          <w:iCs w:val="1"/>
+          <w:lang w:val="en-US"/>
+        </w:rPr>
+        <w:t xml:space="preserve">MIT </w:t>
+      </w:r>
+      <w:bookmarkStart w:name="_Int_TJnZtODn" w:id="814973230"/>
+      <w:r>
+        <w:rPr>
+          <w:b w:val="1"/>
+          <w:bCs w:val="1"/>
+          <w:i w:val="1"/>
+          <w:iCs w:val="1"/>
+          <w:lang w:val="en-US"/>
+        </w:rPr>
+        <w:t>License</w:t>
+      </w:r>
+      <w:r>
+        <w:rPr>
+          <w:i w:val="1"/>
+          <w:iCs w:val="1"/>
+          <w:lang w:val="en-US"/>
+        </w:rPr>
+        <w:t xml:space="preserve"> :</w:t>
+      </w:r>
+      <w:bookmarkEnd w:id="814973230"/>
+      <w:r>
+        <w:rPr>
+          <w:i w:val="1"/>
+          <w:iCs w:val="1"/>
+          <w:lang w:val="en-US"/>
+        </w:rPr>
+        <w:t xml:space="preserve"> El software </w:t>
+      </w:r>
+      <w:r>
+        <w:rPr>
+          <w:i w:val="1"/>
+          <w:iCs w:val="1"/>
+          <w:lang w:val="en-US"/>
+        </w:rPr>
+        <w:t>puede</w:t>
+      </w:r>
+      <w:r>
+        <w:rPr>
+          <w:i w:val="1"/>
+          <w:iCs w:val="1"/>
+          <w:lang w:val="en-US"/>
+        </w:rPr>
+        <w:t xml:space="preserve"> </w:t>
+      </w:r>
+      <w:r>
+        <w:rPr>
+          <w:i w:val="1"/>
+          <w:iCs w:val="1"/>
+          <w:lang w:val="en-US"/>
+        </w:rPr>
+        <w:t>usarse</w:t>
+      </w:r>
+      <w:r>
+        <w:rPr>
+          <w:i w:val="1"/>
+          <w:iCs w:val="1"/>
+          <w:lang w:val="en-US"/>
+        </w:rPr>
+        <w:t xml:space="preserve"> </w:t>
+      </w:r>
+      <w:r>
+        <w:rPr>
+          <w:i w:val="1"/>
+          <w:iCs w:val="1"/>
+          <w:lang w:val="es-ES"/>
+        </w:rPr>
+        <w:t>bajo unas condiciones mínimas</w:t>
+      </w:r>
+      <w:r>
+        <w:rPr>
+          <w:i w:val="1"/>
+          <w:iCs w:val="1"/>
+          <w:lang w:val="en-US"/>
+        </w:rPr>
+        <w:t xml:space="preserve">, </w:t>
+      </w:r>
+      <w:r>
+        <w:rPr>
+          <w:i w:val="1"/>
+          <w:iCs w:val="1"/>
+          <w:lang w:val="en-US"/>
+        </w:rPr>
+        <w:t>pero</w:t>
+      </w:r>
+      <w:r>
+        <w:rPr>
+          <w:i w:val="1"/>
+          <w:iCs w:val="1"/>
+          <w:lang w:val="en-US"/>
+        </w:rPr>
+        <w:t xml:space="preserve"> </w:t>
+      </w:r>
+      <w:r>
+        <w:rPr>
+          <w:i w:val="1"/>
+          <w:iCs w:val="1"/>
+          <w:lang w:val="en-US"/>
+        </w:rPr>
+        <w:t>manteniendo</w:t>
+      </w:r>
+      <w:r>
+        <w:rPr>
+          <w:i w:val="1"/>
+          <w:iCs w:val="1"/>
+          <w:lang w:val="en-US"/>
+        </w:rPr>
+        <w:t xml:space="preserve"> </w:t>
+      </w:r>
+      <w:r>
+        <w:rPr>
+          <w:i w:val="1"/>
+          <w:iCs w:val="1"/>
+          <w:lang w:val="en-US"/>
+        </w:rPr>
+        <w:t>siempre</w:t>
+      </w:r>
+      <w:r>
+        <w:rPr>
+          <w:i w:val="1"/>
+          <w:iCs w:val="1"/>
+          <w:lang w:val="en-US"/>
+        </w:rPr>
+        <w:t xml:space="preserve"> </w:t>
+      </w:r>
+      <w:r>
+        <w:rPr>
+          <w:i w:val="1"/>
+          <w:iCs w:val="1"/>
+          <w:lang w:val="en-US"/>
+        </w:rPr>
+        <w:t>el</w:t>
+      </w:r>
+      <w:r>
+        <w:rPr>
+          <w:i w:val="1"/>
+          <w:iCs w:val="1"/>
+          <w:lang w:val="en-US"/>
+        </w:rPr>
+        <w:t xml:space="preserve"> copyright y </w:t>
+      </w:r>
+      <w:r>
+        <w:rPr>
+          <w:i w:val="1"/>
+          <w:iCs w:val="1"/>
+          <w:lang w:val="en-US"/>
+        </w:rPr>
+        <w:t>el</w:t>
+      </w:r>
+      <w:r>
+        <w:rPr>
+          <w:i w:val="1"/>
+          <w:iCs w:val="1"/>
+          <w:lang w:val="en-US"/>
+        </w:rPr>
+        <w:t xml:space="preserve"> </w:t>
+      </w:r>
+      <w:r>
+        <w:rPr>
+          <w:i w:val="1"/>
+          <w:iCs w:val="1"/>
+          <w:lang w:val="en-US"/>
+        </w:rPr>
+        <w:t>texto</w:t>
+      </w:r>
+      <w:r>
+        <w:rPr>
+          <w:i w:val="1"/>
+          <w:iCs w:val="1"/>
+          <w:lang w:val="en-US"/>
+        </w:rPr>
+        <w:t xml:space="preserve"> de la </w:t>
+      </w:r>
+      <w:r>
+        <w:rPr>
+          <w:i w:val="1"/>
+          <w:iCs w:val="1"/>
+          <w:lang w:val="en-US"/>
+        </w:rPr>
+        <w:t>licencia</w:t>
+      </w:r>
+      <w:r>
+        <w:rPr>
+          <w:i w:val="1"/>
+          <w:iCs w:val="1"/>
+          <w:lang w:val="en-US"/>
+        </w:rPr>
+        <w:t>.</w:t>
+      </w:r>
+      <w:r>
+        <w:rPr>
+          <w:i w:val="1"/>
+          <w:iCs w:val="1"/>
+          <w:lang w:val="en-US"/>
+        </w:rPr>
+        <w:t xml:space="preserve"> La </w:t>
+      </w:r>
+      <w:r>
+        <w:rPr>
+          <w:i w:val="1"/>
+          <w:iCs w:val="1"/>
+          <w:lang w:val="en-US"/>
+        </w:rPr>
+        <w:t>licencia</w:t>
+      </w:r>
+      <w:r>
+        <w:rPr>
+          <w:i w:val="1"/>
+          <w:iCs w:val="1"/>
+          <w:lang w:val="en-US"/>
+        </w:rPr>
+        <w:t xml:space="preserve"> es </w:t>
+      </w:r>
+      <w:r>
+        <w:rPr>
+          <w:i w:val="1"/>
+          <w:iCs w:val="1"/>
+          <w:lang w:val="en-US"/>
+        </w:rPr>
+        <w:t>más</w:t>
+      </w:r>
+      <w:r>
+        <w:rPr>
+          <w:i w:val="1"/>
+          <w:iCs w:val="1"/>
+          <w:lang w:val="en-US"/>
+        </w:rPr>
+        <w:t xml:space="preserve"> simple </w:t>
+      </w:r>
+      <w:r>
+        <w:rPr>
+          <w:i w:val="1"/>
+          <w:iCs w:val="1"/>
+          <w:lang w:val="en-US"/>
+        </w:rPr>
+        <w:t>que</w:t>
+      </w:r>
+      <w:r>
+        <w:rPr>
+          <w:i w:val="1"/>
+          <w:iCs w:val="1"/>
+          <w:lang w:val="en-US"/>
+        </w:rPr>
+        <w:t xml:space="preserve"> la Apache 2.0.</w:t>
+      </w:r>
+      <w:r>
+        <w:br/>
+      </w:r>
+      <w:r>
+        <w:rPr>
+          <w:b w:val="1"/>
+          <w:bCs w:val="1"/>
+          <w:i w:val="1"/>
+          <w:iCs w:val="1"/>
+          <w:lang w:val="en-US"/>
+        </w:rPr>
+        <w:t xml:space="preserve">Apache </w:t>
+      </w:r>
+      <w:r>
+        <w:rPr>
+          <w:b w:val="1"/>
+          <w:bCs w:val="1"/>
+          <w:i w:val="1"/>
+          <w:iCs w:val="1"/>
+          <w:lang w:val="en-US"/>
+        </w:rPr>
+        <w:t>License</w:t>
+      </w:r>
+      <w:r>
+        <w:rPr>
+          <w:b w:val="1"/>
+          <w:bCs w:val="1"/>
+          <w:i w:val="1"/>
+          <w:iCs w:val="1"/>
+          <w:lang w:val="en-US"/>
+        </w:rPr>
+        <w:t xml:space="preserve"> v. </w:t>
+      </w:r>
+      <w:bookmarkStart w:name="_Int_pFmKXfSS" w:id="422401100"/>
+      <w:r>
+        <w:rPr>
+          <w:b w:val="1"/>
+          <w:bCs w:val="1"/>
+          <w:i w:val="1"/>
+          <w:iCs w:val="1"/>
+          <w:lang w:val="en-US"/>
+        </w:rPr>
+        <w:t>1.1.</w:t>
+      </w:r>
+      <w:r>
+        <w:rPr>
+          <w:i w:val="1"/>
+          <w:iCs w:val="1"/>
+          <w:lang w:val="en-US"/>
+        </w:rPr>
+        <w:t xml:space="preserve"> :</w:t>
+      </w:r>
+      <w:bookmarkEnd w:id="422401100"/>
+      <w:r>
+        <w:rPr>
+          <w:i w:val="1"/>
+          <w:iCs w:val="1"/>
+          <w:lang w:val="en-US"/>
+        </w:rPr>
+        <w:t xml:space="preserve"> </w:t>
+      </w:r>
+      <w:r>
+        <w:rPr>
+          <w:i w:val="1"/>
+          <w:iCs w:val="1"/>
+          <w:lang w:val="en-US"/>
+        </w:rPr>
+        <w:t xml:space="preserve">El software </w:t>
+      </w:r>
+      <w:r>
+        <w:rPr>
+          <w:i w:val="1"/>
+          <w:iCs w:val="1"/>
+          <w:lang w:val="en-US"/>
+        </w:rPr>
+        <w:t>puede</w:t>
+      </w:r>
+      <w:r>
+        <w:rPr>
+          <w:i w:val="1"/>
+          <w:iCs w:val="1"/>
+          <w:lang w:val="en-US"/>
+        </w:rPr>
+        <w:t xml:space="preserve"> </w:t>
+      </w:r>
+      <w:r>
+        <w:rPr>
+          <w:i w:val="1"/>
+          <w:iCs w:val="1"/>
+          <w:lang w:val="en-US"/>
+        </w:rPr>
+        <w:t>usarse</w:t>
+      </w:r>
+      <w:r>
+        <w:rPr>
+          <w:i w:val="1"/>
+          <w:iCs w:val="1"/>
+          <w:lang w:val="en-US"/>
+        </w:rPr>
+        <w:t xml:space="preserve"> </w:t>
+      </w:r>
+      <w:r>
+        <w:rPr>
+          <w:i w:val="1"/>
+          <w:iCs w:val="1"/>
+          <w:lang w:val="es-ES"/>
+        </w:rPr>
+        <w:t>bajo unas condiciones mínimas</w:t>
+      </w:r>
+      <w:r>
+        <w:rPr>
+          <w:i w:val="1"/>
+          <w:iCs w:val="1"/>
+          <w:lang w:val="en-US"/>
+        </w:rPr>
+        <w:t xml:space="preserve">, </w:t>
+      </w:r>
+      <w:r>
+        <w:rPr>
+          <w:i w:val="1"/>
+          <w:iCs w:val="1"/>
+          <w:lang w:val="en-US"/>
+        </w:rPr>
+        <w:t>pero</w:t>
+      </w:r>
+      <w:r>
+        <w:rPr>
+          <w:i w:val="1"/>
+          <w:iCs w:val="1"/>
+          <w:lang w:val="en-US"/>
+        </w:rPr>
+        <w:t xml:space="preserve"> </w:t>
+      </w:r>
+      <w:r>
+        <w:rPr>
+          <w:i w:val="1"/>
+          <w:iCs w:val="1"/>
+          <w:lang w:val="en-US"/>
+        </w:rPr>
+        <w:t>manteniendo</w:t>
+      </w:r>
+      <w:r>
+        <w:rPr>
+          <w:i w:val="1"/>
+          <w:iCs w:val="1"/>
+          <w:lang w:val="en-US"/>
+        </w:rPr>
+        <w:t xml:space="preserve"> </w:t>
+      </w:r>
+      <w:r>
+        <w:rPr>
+          <w:i w:val="1"/>
+          <w:iCs w:val="1"/>
+          <w:lang w:val="en-US"/>
+        </w:rPr>
+        <w:t>el</w:t>
+      </w:r>
+      <w:r>
+        <w:rPr>
+          <w:i w:val="1"/>
+          <w:iCs w:val="1"/>
+          <w:lang w:val="en-US"/>
+        </w:rPr>
+        <w:t xml:space="preserve"> copyright y </w:t>
+      </w:r>
+      <w:r>
+        <w:rPr>
+          <w:i w:val="1"/>
+          <w:iCs w:val="1"/>
+          <w:lang w:val="en-US"/>
+        </w:rPr>
+        <w:t>el</w:t>
+      </w:r>
+      <w:r>
+        <w:rPr>
+          <w:i w:val="1"/>
+          <w:iCs w:val="1"/>
+          <w:lang w:val="en-US"/>
+        </w:rPr>
+        <w:t xml:space="preserve"> </w:t>
+      </w:r>
+      <w:r>
+        <w:rPr>
+          <w:i w:val="1"/>
+          <w:iCs w:val="1"/>
+          <w:lang w:val="en-US"/>
+        </w:rPr>
+        <w:t>descargo</w:t>
+      </w:r>
+      <w:r>
+        <w:rPr>
+          <w:i w:val="1"/>
+          <w:iCs w:val="1"/>
+          <w:lang w:val="en-US"/>
+        </w:rPr>
+        <w:t xml:space="preserve"> de </w:t>
+      </w:r>
+      <w:r>
+        <w:rPr>
+          <w:i w:val="1"/>
+          <w:iCs w:val="1"/>
+          <w:lang w:val="en-US"/>
+        </w:rPr>
+        <w:t>responsabilidad</w:t>
+      </w:r>
+      <w:r>
+        <w:rPr>
+          <w:i w:val="1"/>
+          <w:iCs w:val="1"/>
+          <w:lang w:val="en-US"/>
+        </w:rPr>
+        <w:t>.</w:t>
+      </w:r>
+    </w:p>
+    <w:p>
+      <w:pPr>
+        <w:pStyle w:val="Normal"/>
+        <w:rPr>
+          <w:i w:val="1"/>
+          <w:iCs w:val="1"/>
+        </w:rPr>
+      </w:pPr>
+      <w:r>
+        <w:rPr>
+          <w:u w:val="single"/>
+        </w:rPr>
+        <w:t xml:space="preserve">Dominio </w:t>
+      </w:r>
+      <w:bookmarkStart w:name="_Int_WeaA8FST" w:id="1430791908"/>
+      <w:r>
+        <w:rPr>
+          <w:u w:val="single"/>
+        </w:rPr>
+        <w:t>público</w:t>
       </w:r>
       <w:r>
         <w:rPr/>
         <w:t xml:space="preserve"> :</w:t>
       </w:r>
-      <w:bookmarkEnd w:id="902082552"/>
+      <w:bookmarkEnd w:id="1430791908"/>
       <w:r>
         <w:rPr/>
         <w:t xml:space="preserve"> </w:t>
@@ -1013,9 +2169,7 @@
       <w:pPr>
         <w:pStyle w:val="Normal"/>
         <w:rPr>
-          <w:i w:val="1"/>
-          <w:iCs w:val="1"/>
-          <w:lang w:val="en-US"/>
+          <w:lang w:val="es-ES"/>
         </w:rPr>
       </w:pPr>
       <w:r>
@@ -1024,379 +2178,265 @@
           <w:bCs w:val="1"/>
           <w:i w:val="1"/>
           <w:iCs w:val="1"/>
-          <w:lang w:val="en-US"/>
-        </w:rPr>
-        <w:t xml:space="preserve">Mozilla Public </w:t>
-      </w:r>
-      <w:bookmarkStart w:name="_Int_iHhWgWn9" w:id="771899124"/>
+          <w:lang w:val="es-ES"/>
+        </w:rPr>
+        <w:t>CC</w:t>
+      </w:r>
+      <w:bookmarkStart w:name="_Int_evyyiED0" w:id="471761478"/>
       <w:r>
         <w:rPr>
           <w:b w:val="1"/>
           <w:bCs w:val="1"/>
           <w:i w:val="1"/>
           <w:iCs w:val="1"/>
-          <w:lang w:val="en-US"/>
-        </w:rPr>
-        <w:t>License</w:t>
-      </w:r>
-      <w:r>
-        <w:rPr>
-          <w:i w:val="1"/>
-          <w:iCs w:val="1"/>
-          <w:lang w:val="en-US"/>
-        </w:rPr>
-        <w:t xml:space="preserve"> :</w:t>
-      </w:r>
-      <w:bookmarkEnd w:id="771899124"/>
-      <w:r>
-        <w:rPr>
-          <w:i w:val="1"/>
-          <w:iCs w:val="1"/>
-          <w:lang w:val="en-US"/>
-        </w:rPr>
-        <w:t xml:space="preserve"> </w:t>
+          <w:lang w:val="es-ES"/>
+        </w:rPr>
+        <w:t xml:space="preserve">0 </w:t>
+      </w:r>
+      <w:r>
+        <w:rPr>
+          <w:i w:val="1"/>
+          <w:iCs w:val="1"/>
+          <w:lang w:val="es-ES"/>
+        </w:rPr>
+        <w:t>:</w:t>
+      </w:r>
+      <w:bookmarkEnd w:id="471761478"/>
+      <w:r>
+        <w:rPr>
+          <w:i w:val="1"/>
+          <w:iCs w:val="1"/>
+          <w:lang w:val="es-ES"/>
+        </w:rPr>
+        <w:t xml:space="preserve"> Creative Commons Zero. Sin restricción, atribución, o garantías.</w:t>
       </w:r>
       <w:r>
         <w:br/>
       </w:r>
       <w:r>
+        <w:br/>
+      </w:r>
+    </w:p>
+    <w:p>
+      <w:pPr>
+        <w:pStyle w:val="Normal"/>
+        <w:rPr>
+          <w:lang w:val="en-US"/>
+        </w:rPr>
+      </w:pPr>
+      <w:r>
+        <w:br/>
+      </w:r>
+    </w:p>
+    <w:p>
+      <w:pPr>
+        <w:pStyle w:val="Normal"/>
+      </w:pPr>
+    </w:p>
+    <w:p>
+      <w:pPr>
+        <w:pStyle w:val="Normal"/>
+      </w:pPr>
+      <w:r>
+        <w:br/>
+      </w:r>
+    </w:p>
+    <w:p>
+      <w:pPr>
+        <w:pStyle w:val="Normal"/>
+      </w:pPr>
+    </w:p>
+    <w:p>
+      <w:pPr>
+        <w:pStyle w:val="Heading2"/>
+      </w:pPr>
+      <w:bookmarkStart w:name="_Toc399201739" w:id="1380771996"/>
+      <w:r>
+        <w:rPr/>
+        <w:t>Comparación entre licencias</w:t>
+      </w:r>
+      <w:bookmarkEnd w:id="1380771996"/>
+    </w:p>
+    <w:p>
+      <w:pPr>
+        <w:pStyle w:val="Normal"/>
+        <w:suppressLineNumbers w:val="0"/>
+        <w:bidi w:val="0"/>
+        <w:spacing w:before="0" w:beforeAutospacing="off" w:after="160" w:afterAutospacing="off" w:line="279" w:lineRule="auto"/>
+        <w:ind w:left="0" w:right="0"/>
+        <w:jc w:val="left"/>
         <w:rPr>
           <w:b w:val="1"/>
           <w:bCs w:val="1"/>
-          <w:i w:val="1"/>
-          <w:iCs w:val="1"/>
-          <w:lang w:val="en-US"/>
-        </w:rPr>
-        <w:t>EUPL</w:t>
-      </w:r>
-      <w:r>
-        <w:rPr>
-          <w:i w:val="1"/>
-          <w:iCs w:val="1"/>
-          <w:lang w:val="en-US"/>
-        </w:rPr>
-        <w:t xml:space="preserve"> :</w:t>
-      </w:r>
-      <w:r>
-        <w:br/>
-      </w:r>
+        </w:rPr>
+      </w:pPr>
       <w:r>
         <w:rPr>
           <w:b w:val="1"/>
           <w:bCs w:val="1"/>
-          <w:i w:val="1"/>
-          <w:iCs w:val="1"/>
-          <w:lang w:val="en-US"/>
-        </w:rPr>
-        <w:t xml:space="preserve">Apple Source License v. </w:t>
-      </w:r>
-      <w:bookmarkStart w:name="_Int_q1gubYzH" w:id="942627623"/>
+        </w:rPr>
+        <w:t xml:space="preserve">GNU General Public </w:t>
+      </w:r>
       <w:r>
         <w:rPr>
           <w:b w:val="1"/>
           <w:bCs w:val="1"/>
-          <w:i w:val="1"/>
-          <w:iCs w:val="1"/>
-          <w:lang w:val="en-US"/>
-        </w:rPr>
-        <w:t>2.0.</w:t>
-      </w:r>
-      <w:r>
-        <w:rPr>
-          <w:i w:val="1"/>
-          <w:iCs w:val="1"/>
-          <w:lang w:val="en-US"/>
-        </w:rPr>
-        <w:t xml:space="preserve"> :</w:t>
-      </w:r>
-      <w:bookmarkEnd w:id="942627623"/>
-    </w:p>
-    <w:p>
-      <w:pPr>
-        <w:pStyle w:val="Normal"/>
-        <w:rPr>
-          <w:i w:val="1"/>
-          <w:iCs w:val="1"/>
-        </w:rPr>
-      </w:pPr>
-      <w:r>
-        <w:rPr>
-          <w:u w:val="single"/>
-        </w:rPr>
-        <w:t xml:space="preserve">Código abierto </w:t>
-      </w:r>
-      <w:bookmarkStart w:name="_Int_2wOWNsbJ" w:id="1711188472"/>
-      <w:r>
-        <w:rPr>
-          <w:u w:val="single"/>
-        </w:rPr>
-        <w:t>permisivas</w:t>
-      </w:r>
-      <w:r>
-        <w:rPr/>
-        <w:t xml:space="preserve"> :</w:t>
-      </w:r>
-      <w:bookmarkEnd w:id="1711188472"/>
-      <w:r>
-        <w:rPr/>
-        <w:t xml:space="preserve"> </w:t>
-      </w:r>
-    </w:p>
-    <w:p>
-      <w:pPr>
-        <w:pStyle w:val="Normal"/>
-        <w:rPr>
-          <w:i w:val="1"/>
-          <w:iCs w:val="1"/>
-          <w:lang w:val="en-US"/>
-        </w:rPr>
-      </w:pPr>
+        </w:rPr>
+        <w:t>License</w:t>
+      </w:r>
       <w:r>
         <w:rPr>
           <w:b w:val="1"/>
           <w:bCs w:val="1"/>
-          <w:i w:val="1"/>
-          <w:iCs w:val="1"/>
-          <w:lang w:val="en-US"/>
-        </w:rPr>
-        <w:t xml:space="preserve">MIT </w:t>
-      </w:r>
-      <w:r>
-        <w:rPr>
-          <w:b w:val="1"/>
-          <w:bCs w:val="1"/>
-          <w:i w:val="1"/>
-          <w:iCs w:val="1"/>
-          <w:lang w:val="en-US"/>
+        </w:rPr>
+        <w:t xml:space="preserve"> v. 3.0 / Apache v. 2.0 / MIT</w:t>
+      </w:r>
+    </w:p>
+    <w:p>
+      <w:pPr>
+        <w:pStyle w:val="Normal"/>
+        <w:suppressLineNumbers w:val="0"/>
+        <w:bidi w:val="0"/>
+        <w:spacing w:before="0" w:beforeAutospacing="off" w:after="160" w:afterAutospacing="off" w:line="279" w:lineRule="auto"/>
+        <w:ind w:left="0" w:right="0"/>
+        <w:jc w:val="left"/>
+        <w:rPr>
+          <w:b w:val="0"/>
+          <w:bCs w:val="0"/>
+          <w:i w:val="1"/>
+          <w:iCs w:val="1"/>
+        </w:rPr>
+      </w:pPr>
+      <w:r>
+        <w:rPr>
+          <w:b w:val="0"/>
+          <w:bCs w:val="0"/>
+          <w:i w:val="1"/>
+          <w:iCs w:val="1"/>
+        </w:rPr>
+        <w:t>Un software bajo la licencia GNU GPL 3.0 puede ejecutarse, modificarse</w:t>
+      </w:r>
+      <w:r>
+        <w:rPr>
+          <w:b w:val="0"/>
+          <w:bCs w:val="0"/>
+          <w:i w:val="1"/>
+          <w:iCs w:val="1"/>
+        </w:rPr>
+        <w:t xml:space="preserve"> y compartirse, pero siempre bajo la misma licencia. Si se inserta dentro de un proyecto mayor, este proyecto también tiene que utilizar la misma licencia.</w:t>
+      </w:r>
+    </w:p>
+    <w:p>
+      <w:pPr>
+        <w:pStyle w:val="Normal"/>
+        <w:suppressLineNumbers w:val="0"/>
+        <w:bidi w:val="0"/>
+        <w:spacing w:before="0" w:beforeAutospacing="off" w:after="160" w:afterAutospacing="off" w:line="279" w:lineRule="auto"/>
+        <w:ind w:left="0" w:right="0"/>
+        <w:jc w:val="left"/>
+        <w:rPr>
+          <w:b w:val="0"/>
+          <w:bCs w:val="0"/>
+          <w:i w:val="1"/>
+          <w:iCs w:val="1"/>
+        </w:rPr>
+      </w:pPr>
+      <w:r>
+        <w:rPr>
+          <w:b w:val="0"/>
+          <w:bCs w:val="0"/>
+          <w:i w:val="1"/>
+          <w:iCs w:val="1"/>
+        </w:rPr>
+        <w:t xml:space="preserve">Apache </w:t>
+      </w:r>
+      <w:r>
+        <w:rPr>
+          <w:b w:val="0"/>
+          <w:bCs w:val="0"/>
+          <w:i w:val="1"/>
+          <w:iCs w:val="1"/>
         </w:rPr>
         <w:t>License</w:t>
       </w:r>
       <w:r>
         <w:rPr>
-          <w:i w:val="1"/>
-          <w:iCs w:val="1"/>
-          <w:lang w:val="en-US"/>
-        </w:rPr>
-        <w:t xml:space="preserve"> :</w:t>
-      </w:r>
-      <w:r>
-        <w:br/>
-      </w:r>
-      <w:r>
-        <w:rPr>
-          <w:b w:val="1"/>
-          <w:bCs w:val="1"/>
-          <w:i w:val="1"/>
-          <w:iCs w:val="1"/>
-          <w:lang w:val="en-US"/>
-        </w:rPr>
-        <w:t xml:space="preserve">Apache </w:t>
-      </w:r>
-      <w:r>
-        <w:rPr>
-          <w:b w:val="1"/>
-          <w:bCs w:val="1"/>
-          <w:i w:val="1"/>
-          <w:iCs w:val="1"/>
-          <w:lang w:val="en-US"/>
-        </w:rPr>
-        <w:t>License</w:t>
-      </w:r>
-      <w:r>
-        <w:rPr>
-          <w:b w:val="1"/>
-          <w:bCs w:val="1"/>
-          <w:i w:val="1"/>
-          <w:iCs w:val="1"/>
-          <w:lang w:val="en-US"/>
-        </w:rPr>
-        <w:t xml:space="preserve"> v. 1.1.</w:t>
-      </w:r>
-      <w:r>
-        <w:rPr>
-          <w:i w:val="1"/>
-          <w:iCs w:val="1"/>
-          <w:lang w:val="en-US"/>
-        </w:rPr>
-        <w:t xml:space="preserve"> :</w:t>
-      </w:r>
-      <w:r>
-        <w:br/>
-      </w:r>
-      <w:r>
-        <w:rPr>
-          <w:b w:val="1"/>
-          <w:bCs w:val="1"/>
-          <w:i w:val="1"/>
-          <w:iCs w:val="1"/>
-          <w:lang w:val="en-US"/>
-        </w:rPr>
-        <w:t xml:space="preserve">BSD </w:t>
-      </w:r>
-      <w:bookmarkStart w:name="_Int_u14OiYTo" w:id="786575150"/>
-      <w:r>
-        <w:rPr>
-          <w:b w:val="1"/>
-          <w:bCs w:val="1"/>
-          <w:i w:val="1"/>
-          <w:iCs w:val="1"/>
-          <w:lang w:val="en-US"/>
-        </w:rPr>
-        <w:t>License</w:t>
-      </w:r>
-      <w:r>
-        <w:rPr>
-          <w:i w:val="1"/>
-          <w:iCs w:val="1"/>
-          <w:lang w:val="en-US"/>
-        </w:rPr>
-        <w:t xml:space="preserve"> :</w:t>
-      </w:r>
-      <w:bookmarkEnd w:id="786575150"/>
+          <w:b w:val="0"/>
+          <w:bCs w:val="0"/>
+          <w:i w:val="1"/>
+          <w:iCs w:val="1"/>
+        </w:rPr>
+        <w:t xml:space="preserve"> 2.0 y MIT funcionan igual</w:t>
+      </w:r>
+      <w:r>
+        <w:rPr>
+          <w:b w:val="0"/>
+          <w:bCs w:val="0"/>
+          <w:i w:val="1"/>
+          <w:iCs w:val="1"/>
+        </w:rPr>
+        <w:t xml:space="preserve"> que la GNU GPL 3.0, pero al insertarse en un proyecto, este no tiene que cambiar su licencia, pero tiene que mantener el copyright</w:t>
+      </w:r>
+      <w:r>
+        <w:rPr>
+          <w:b w:val="0"/>
+          <w:bCs w:val="0"/>
+          <w:i w:val="1"/>
+          <w:iCs w:val="1"/>
+        </w:rPr>
+        <w:t xml:space="preserve"> </w:t>
+      </w:r>
+      <w:r>
+        <w:rPr>
+          <w:b w:val="0"/>
+          <w:bCs w:val="0"/>
+          <w:i w:val="1"/>
+          <w:iCs w:val="1"/>
+        </w:rPr>
+        <w:t>y un aviso con la licencia original del código.</w:t>
+      </w:r>
     </w:p>
     <w:p>
       <w:pPr>
         <w:pStyle w:val="Normal"/>
-        <w:rPr>
-          <w:i w:val="1"/>
-          <w:iCs w:val="1"/>
-        </w:rPr>
-      </w:pPr>
-      <w:r>
-        <w:rPr>
-          <w:u w:val="single"/>
-        </w:rPr>
-        <w:t xml:space="preserve">Dominio </w:t>
-      </w:r>
-      <w:bookmarkStart w:name="_Int_WeaA8FST" w:id="1430791908"/>
-      <w:r>
-        <w:rPr>
-          <w:u w:val="single"/>
-        </w:rPr>
-        <w:t>público</w:t>
-      </w:r>
-      <w:r>
-        <w:rPr/>
-        <w:t xml:space="preserve"> :</w:t>
-      </w:r>
-      <w:bookmarkEnd w:id="1430791908"/>
-      <w:r>
-        <w:rPr/>
-        <w:t xml:space="preserve"> </w:t>
-      </w:r>
-    </w:p>
-    <w:p>
-      <w:pPr>
-        <w:pStyle w:val="Normal"/>
-      </w:pPr>
-      <w:r>
-        <w:rPr>
-          <w:b w:val="1"/>
-          <w:bCs w:val="1"/>
-          <w:i w:val="1"/>
-          <w:iCs w:val="1"/>
-        </w:rPr>
-        <w:t xml:space="preserve">CC0 </w:t>
-      </w:r>
-      <w:r>
-        <w:rPr>
-          <w:i w:val="1"/>
-          <w:iCs w:val="1"/>
-        </w:rPr>
-        <w:t>:</w:t>
-      </w:r>
-      <w:r>
-        <w:br/>
-      </w:r>
-      <w:r>
-        <w:rPr>
-          <w:b w:val="1"/>
-          <w:bCs w:val="1"/>
-          <w:i w:val="1"/>
-          <w:iCs w:val="1"/>
-        </w:rPr>
-        <w:t>Unlicense</w:t>
-      </w:r>
-      <w:r>
-        <w:rPr>
-          <w:i w:val="1"/>
-          <w:iCs w:val="1"/>
-        </w:rPr>
-        <w:t xml:space="preserve"> :</w:t>
-      </w:r>
-      <w:r>
-        <w:br/>
-      </w:r>
-      <w:r>
-        <w:rPr>
-          <w:b w:val="1"/>
-          <w:bCs w:val="1"/>
-          <w:i w:val="1"/>
-          <w:iCs w:val="1"/>
-        </w:rPr>
-        <w:t>WTFPL</w:t>
-      </w:r>
-      <w:r>
-        <w:rPr>
-          <w:i w:val="1"/>
-          <w:iCs w:val="1"/>
-        </w:rPr>
-        <w:t xml:space="preserve"> :</w:t>
-      </w:r>
-      <w:r>
-        <w:br/>
-      </w:r>
-      <w:r>
-        <w:br/>
-      </w:r>
-    </w:p>
-    <w:p>
-      <w:pPr>
-        <w:pStyle w:val="Normal"/>
-        <w:rPr>
-          <w:lang w:val="en-US"/>
-        </w:rPr>
-      </w:pPr>
-      <w:r>
-        <w:br/>
-      </w:r>
-    </w:p>
-    <w:p>
-      <w:pPr>
-        <w:pStyle w:val="Normal"/>
-      </w:pPr>
-    </w:p>
-    <w:p>
-      <w:pPr>
-        <w:pStyle w:val="Normal"/>
-      </w:pPr>
-      <w:r>
-        <w:br/>
-      </w:r>
-    </w:p>
-    <w:p>
-      <w:pPr>
-        <w:pStyle w:val="Normal"/>
-      </w:pPr>
-    </w:p>
-    <w:p>
-      <w:pPr>
-        <w:pStyle w:val="Heading2"/>
-      </w:pPr>
-      <w:bookmarkStart w:name="_Toc399201739" w:id="1380771996"/>
-      <w:r>
-        <w:rPr/>
-        <w:t>Comparación entre licencias</w:t>
-      </w:r>
-      <w:bookmarkEnd w:id="1380771996"/>
-    </w:p>
-    <w:p>
-      <w:pPr>
-        <w:pStyle w:val="Normal"/>
-      </w:pPr>
-      <w:r>
-        <w:rPr/>
-        <w:t>(Mínimo tres licencias: MIT, GPL v3, Apache 2.0)</w:t>
+        <w:suppressLineNumbers w:val="0"/>
+        <w:bidi w:val="0"/>
+        <w:spacing w:before="0" w:beforeAutospacing="off" w:after="160" w:afterAutospacing="off" w:line="279" w:lineRule="auto"/>
+        <w:ind w:left="0" w:right="0"/>
+        <w:jc w:val="left"/>
+        <w:rPr>
+          <w:b w:val="0"/>
+          <w:bCs w:val="0"/>
+          <w:i w:val="1"/>
+          <w:iCs w:val="1"/>
+        </w:rPr>
+      </w:pPr>
+      <w:r>
+        <w:rPr>
+          <w:b w:val="0"/>
+          <w:bCs w:val="0"/>
+          <w:i w:val="1"/>
+          <w:iCs w:val="1"/>
+        </w:rPr>
+        <w:t xml:space="preserve">La diferencia entre la licencia Apache 2.0 y la MIT está en el tratamiento de las patentes, el cual, en la Apache 2.0 se especifica, </w:t>
+      </w:r>
+      <w:r>
+        <w:rPr>
+          <w:b w:val="0"/>
+          <w:bCs w:val="0"/>
+          <w:i w:val="1"/>
+          <w:iCs w:val="1"/>
+        </w:rPr>
+        <w:t>mientras que en la MIT</w:t>
+      </w:r>
+      <w:r>
+        <w:rPr>
+          <w:b w:val="0"/>
+          <w:bCs w:val="0"/>
+          <w:i w:val="1"/>
+          <w:iCs w:val="1"/>
+        </w:rPr>
+        <w:t xml:space="preserve"> no se trata por mantener la simplicidad.</w:t>
       </w:r>
     </w:p>
     <w:p>
@@ -1619,7 +2659,6 @@
         </w:rPr>
         <w:t xml:space="preserve">Versión de la </w:t>
       </w:r>
-      <w:bookmarkStart w:name="_Int_PbJygJwA" w:id="488373760"/>
       <w:r>
         <w:rPr>
           <w:i w:val="1"/>
@@ -1627,7 +2666,6 @@
         </w:rPr>
         <w:t>dependencia :</w:t>
       </w:r>
-      <w:bookmarkEnd w:id="488373760"/>
       <w:r>
         <w:rPr>
           <w:i w:val="1"/>
@@ -1669,7 +2707,6 @@
         </w:rPr>
         <w:t xml:space="preserve">Versión de la </w:t>
       </w:r>
-      <w:bookmarkStart w:name="_Int_jrHdhtML" w:id="445121096"/>
       <w:r>
         <w:rPr>
           <w:i w:val="1"/>
@@ -1677,7 +2714,6 @@
         </w:rPr>
         <w:t>codificación :</w:t>
       </w:r>
-      <w:bookmarkEnd w:id="445121096"/>
       <w:r>
         <w:rPr>
           <w:i w:val="1"/>
@@ -1695,7 +2731,6 @@
         </w:rPr>
         <w:t xml:space="preserve">Versión Java </w:t>
       </w:r>
-      <w:bookmarkStart w:name="_Int_kv2hkcxo" w:id="2098512541"/>
       <w:r>
         <w:rPr>
           <w:i w:val="1"/>
@@ -1703,7 +2738,6 @@
         </w:rPr>
         <w:t>utilizada :</w:t>
       </w:r>
-      <w:bookmarkEnd w:id="2098512541"/>
       <w:r>
         <w:rPr>
           <w:i w:val="1"/>
@@ -1792,7 +2826,6 @@
         </w:rPr>
         <w:t xml:space="preserve">Desarrollada </w:t>
       </w:r>
-      <w:bookmarkStart w:name="_Int_zKYrNJ0a" w:id="1264186406"/>
       <w:r>
         <w:rPr>
           <w:i w:val="1"/>
@@ -1801,7 +2834,6 @@
         </w:rPr>
         <w:t>en :</w:t>
       </w:r>
-      <w:bookmarkEnd w:id="1264186406"/>
       <w:r>
         <w:rPr>
           <w:i w:val="1"/>
@@ -1821,7 +2853,6 @@
         </w:rPr>
         <w:t xml:space="preserve">Versión de </w:t>
       </w:r>
-      <w:bookmarkStart w:name="_Int_zTGp3K9f" w:id="2044014223"/>
       <w:r>
         <w:rPr>
           <w:i w:val="1"/>
@@ -1830,7 +2861,6 @@
         </w:rPr>
         <w:t>MySQL :</w:t>
       </w:r>
-      <w:bookmarkEnd w:id="2044014223"/>
       <w:r>
         <w:rPr>
           <w:i w:val="1"/>
@@ -1923,7 +2953,6 @@
         </w:rPr>
         <w:t xml:space="preserve">Algunas funciones del programa están vinculadas con el siguiente servidor </w:t>
       </w:r>
-      <w:bookmarkStart w:name="_Int_PC0UU3qx" w:id="1201115950"/>
       <w:r>
         <w:rPr>
           <w:i w:val="1"/>
@@ -1948,7 +2977,6 @@
         </w:rPr>
         <w:t>:</w:t>
       </w:r>
-      <w:bookmarkEnd w:id="1201115950"/>
       <w:r>
         <w:rPr>
           <w:i w:val="1"/>
@@ -1986,7 +3014,6 @@
         </w:rPr>
         <w:t>Versión Chrome</w:t>
       </w:r>
-      <w:bookmarkStart w:name="_Int_izmYSkhS" w:id="1287169969"/>
       <w:r>
         <w:rPr>
           <w:rFonts w:ascii="Aptos" w:hAnsi="Aptos" w:eastAsia="Aptos" w:cs="Aptos"/>
@@ -2000,7 +3027,6 @@
         </w:rPr>
         <w:t xml:space="preserve"> :</w:t>
       </w:r>
-      <w:bookmarkEnd w:id="1287169969"/>
       <w:r>
         <w:rPr>
           <w:rFonts w:ascii="Aptos" w:hAnsi="Aptos" w:eastAsia="Aptos" w:cs="Aptos"/>
@@ -2044,7 +3070,6 @@
         </w:rPr>
         <w:t xml:space="preserve">Sistema operativo </w:t>
       </w:r>
-      <w:bookmarkStart w:name="_Int_Mzr5bTw3" w:id="1425172146"/>
       <w:r>
         <w:rPr>
           <w:i w:val="1"/>
@@ -2053,7 +3078,6 @@
         </w:rPr>
         <w:t>utilizado :</w:t>
       </w:r>
-      <w:bookmarkEnd w:id="1425172146"/>
       <w:r>
         <w:rPr>
           <w:i w:val="1"/>
@@ -2551,6 +3575,93 @@
 <file path=word/intelligence2.xml><?xml version="1.0" encoding="utf-8"?>
 <int2:intelligence xmlns:int2="http://schemas.microsoft.com/office/intelligence/2020/intelligence">
   <int2:observations>
+    <int2:textHash int2:hashCode="hRdKhY2AT6IxU4" int2:id="9oxHLqgl">
+      <int2:state int2:type="spell" int2:value="Rejected"/>
+    </int2:textHash>
+    <int2:textHash int2:hashCode="XicHniNN0ZqAw7" int2:id="Ro8AuwMY">
+      <int2:state int2:type="spell" int2:value="Rejected"/>
+    </int2:textHash>
+    <int2:textHash int2:hashCode="evDxxgcmQJjbNV" int2:id="clhPyGeZ">
+      <int2:state int2:type="spell" int2:value="Rejected"/>
+    </int2:textHash>
+    <int2:textHash int2:hashCode="6BNpycLgNJFQMk" int2:id="EJ8aVH3Y">
+      <int2:state int2:type="spell" int2:value="Rejected"/>
+    </int2:textHash>
+    <int2:textHash int2:hashCode="LjYtK0ovlYnUBM" int2:id="fQJvqK0T">
+      <int2:state int2:type="spell" int2:value="Rejected"/>
+    </int2:textHash>
+    <int2:textHash int2:hashCode="V7XKRZ746ZWtAA" int2:id="kAf2pVbM">
+      <int2:state int2:type="spell" int2:value="Rejected"/>
+    </int2:textHash>
+    <int2:textHash int2:hashCode="kXrHCTkR7GgDU3" int2:id="xpg2oCY3">
+      <int2:state int2:type="spell" int2:value="Rejected"/>
+    </int2:textHash>
+    <int2:textHash int2:hashCode="6mMVUfVWn2Et1w" int2:id="T3HRzkPF">
+      <int2:state int2:type="spell" int2:value="Rejected"/>
+    </int2:textHash>
+    <int2:textHash int2:hashCode="mPx7NHYPrOXiaL" int2:id="TMVJxFwS">
+      <int2:state int2:type="spell" int2:value="Rejected"/>
+    </int2:textHash>
+    <int2:textHash int2:hashCode="HuSJ1tCRHaY8PG" int2:id="Av8iDELD">
+      <int2:state int2:type="spell" int2:value="Rejected"/>
+    </int2:textHash>
+    <int2:textHash int2:hashCode="LRCAegk7AaKM2C" int2:id="FOqNVdNH">
+      <int2:state int2:type="spell" int2:value="Rejected"/>
+    </int2:textHash>
+    <int2:textHash int2:hashCode="YIRUI8gdImtgrX" int2:id="0WQi5Wgo">
+      <int2:state int2:type="spell" int2:value="Rejected"/>
+    </int2:textHash>
+    <int2:textHash int2:hashCode="ccYa/T5sArXkwr" int2:id="oUfyqkMC">
+      <int2:state int2:type="spell" int2:value="Rejected"/>
+    </int2:textHash>
+    <int2:textHash int2:hashCode="pNKUakEeaiXJHK" int2:id="Q8JSVFR7">
+      <int2:state int2:type="spell" int2:value="Rejected"/>
+    </int2:textHash>
+    <int2:textHash int2:hashCode="dIwGx6Y0mc//nZ" int2:id="zcClWeGw">
+      <int2:state int2:type="spell" int2:value="Rejected"/>
+    </int2:textHash>
+    <int2:textHash int2:hashCode="4C8Wh1I+5/32R1" int2:id="We7TVI8k">
+      <int2:state int2:type="spell" int2:value="Rejected"/>
+    </int2:textHash>
+    <int2:textHash int2:hashCode="wpuIcwU0qeWTFq" int2:id="KkBwKnRE">
+      <int2:state int2:type="spell" int2:value="Rejected"/>
+    </int2:textHash>
+    <int2:textHash int2:hashCode="CUsP4OMChUrxMR" int2:id="aggn7iO1">
+      <int2:state int2:type="spell" int2:value="Rejected"/>
+    </int2:textHash>
+    <int2:textHash int2:hashCode="FWzm1l/TGpXl7t" int2:id="oj1jBceZ">
+      <int2:state int2:type="spell" int2:value="Rejected"/>
+    </int2:textHash>
+    <int2:textHash int2:hashCode="mhc+TeQs5v22K0" int2:id="Jfa0Nr3V">
+      <int2:state int2:type="spell" int2:value="Rejected"/>
+    </int2:textHash>
+    <int2:textHash int2:hashCode="5IrimIOm7vh4bJ" int2:id="lQXMslam">
+      <int2:state int2:type="spell" int2:value="Rejected"/>
+    </int2:textHash>
+    <int2:textHash int2:hashCode="KlzE4Eudh8VdEN" int2:id="kRVq8HLH">
+      <int2:state int2:type="spell" int2:value="Rejected"/>
+    </int2:textHash>
+    <int2:textHash int2:hashCode="4iRkEhkB4ljk+E" int2:id="jBRAlJd9">
+      <int2:state int2:type="spell" int2:value="Rejected"/>
+    </int2:textHash>
+    <int2:textHash int2:hashCode="lGkOxBgQdQL+FR" int2:id="8lShD3w7">
+      <int2:state int2:type="spell" int2:value="Rejected"/>
+    </int2:textHash>
+    <int2:textHash int2:hashCode="mfwPxprGT52uD5" int2:id="99np0kOr">
+      <int2:state int2:type="spell" int2:value="Rejected"/>
+    </int2:textHash>
+    <int2:textHash int2:hashCode="UqVVWteceKmuzy" int2:id="TGqYBd4u">
+      <int2:state int2:type="spell" int2:value="Rejected"/>
+    </int2:textHash>
+    <int2:textHash int2:hashCode="wKNKS9IaSVZFgb" int2:id="K96PYLNh">
+      <int2:state int2:type="spell" int2:value="Rejected"/>
+    </int2:textHash>
+    <int2:textHash int2:hashCode="Tx6k8J2yqq+wqS" int2:id="R8vBCvKl">
+      <int2:state int2:type="spell" int2:value="Rejected"/>
+    </int2:textHash>
+    <int2:textHash int2:hashCode="/N3CrvjxLw/Tob" int2:id="903KHU3V">
+      <int2:state int2:type="spell" int2:value="Rejected"/>
+    </int2:textHash>
     <int2:textHash int2:hashCode="Rrt+PC8NAaOqSj" int2:id="qMjHCwBo">
       <int2:state int2:type="spell" int2:value="Rejected"/>
     </int2:textHash>
@@ -2584,6 +3695,42 @@
     <int2:textHash int2:hashCode="9+LyU1u5NhH3uV" int2:id="wxPVyvBi">
       <int2:state int2:type="spell" int2:value="Rejected"/>
     </int2:textHash>
+    <int2:bookmark int2:bookmarkName="_Int_bjfWwamN" int2:invalidationBookmarkName="" int2:hashCode="5v+mkZMVuOG47R" int2:id="bwGFllnz">
+      <int2:state int2:type="gram" int2:value="Rejected"/>
+    </int2:bookmark>
+    <int2:bookmark int2:bookmarkName="_Int_mo6XNs1U" int2:invalidationBookmarkName="" int2:hashCode="5v+mkZMVuOG47R" int2:id="L06iP4vc">
+      <int2:state int2:type="gram" int2:value="Rejected"/>
+    </int2:bookmark>
+    <int2:bookmark int2:bookmarkName="_Int_U7HCu94M" int2:invalidationBookmarkName="" int2:hashCode="j3/5UV1kd056GV" int2:id="sykofM2V">
+      <int2:state int2:type="gram" int2:value="Rejected"/>
+    </int2:bookmark>
+    <int2:bookmark int2:bookmarkName="_Int_geqKrWBl" int2:invalidationBookmarkName="" int2:hashCode="OrkU+C2o04kvDc" int2:id="wKktzAUa">
+      <int2:state int2:type="gram" int2:value="Rejected"/>
+    </int2:bookmark>
+    <int2:bookmark int2:bookmarkName="_Int_hu64dXz0" int2:invalidationBookmarkName="" int2:hashCode="qd1rtIQyrrr82B" int2:id="LfXqhQbM">
+      <int2:state int2:type="gram" int2:value="Rejected"/>
+    </int2:bookmark>
+    <int2:bookmark int2:bookmarkName="_Int_Vri9LjKR" int2:invalidationBookmarkName="" int2:hashCode="hcBEPrlMQejWsG" int2:id="9jzN6o5X">
+      <int2:state int2:type="gram" int2:value="Rejected"/>
+    </int2:bookmark>
+    <int2:bookmark int2:bookmarkName="_Int_evyyiED0" int2:invalidationBookmarkName="" int2:hashCode="0WxAKyM+zMcoiS" int2:id="I2dFVq2O">
+      <int2:state int2:type="gram" int2:value="Rejected"/>
+    </int2:bookmark>
+    <int2:bookmark int2:bookmarkName="_Int_pFmKXfSS" int2:invalidationBookmarkName="" int2:hashCode="HHu34FIPSLZPxI" int2:id="61Au87ld">
+      <int2:state int2:type="gram" int2:value="Rejected"/>
+    </int2:bookmark>
+    <int2:bookmark int2:bookmarkName="_Int_TJnZtODn" int2:invalidationBookmarkName="" int2:hashCode="GgOKH3Y34D2IMf" int2:id="6lmNdlWb">
+      <int2:state int2:type="gram" int2:value="Rejected"/>
+    </int2:bookmark>
+    <int2:bookmark int2:bookmarkName="_Int_f0qpi2vl" int2:invalidationBookmarkName="" int2:hashCode="j3/5UV1kd056GV" int2:id="2fdAlmis">
+      <int2:state int2:type="gram" int2:value="Rejected"/>
+    </int2:bookmark>
+    <int2:bookmark int2:bookmarkName="_Int_LTK0zGtF" int2:invalidationBookmarkName="" int2:hashCode="WKWJ1yrZ9QpjLv" int2:id="UTqy53uj">
+      <int2:state int2:type="gram" int2:value="Rejected"/>
+    </int2:bookmark>
+    <int2:bookmark int2:bookmarkName="_Int_MX7gpIkU" int2:invalidationBookmarkName="" int2:hashCode="j3/5UV1kd056GV" int2:id="iLWn6kRD">
+      <int2:state int2:type="gram" int2:value="Rejected"/>
+    </int2:bookmark>
     <int2:bookmark int2:bookmarkName="_Int_iHhWgWn9" int2:invalidationBookmarkName="" int2:hashCode="GgOKH3Y34D2IMf" int2:id="Cf0Eqnvv">
       <int2:state int2:type="gram" int2:value="Rejected"/>
     </int2:bookmark>
@@ -2599,12 +3746,6 @@
     <int2:bookmark int2:bookmarkName="_Int_q1gubYzH" int2:invalidationBookmarkName="" int2:hashCode="j3/5UV1kd056GV" int2:id="8LUwlDHM">
       <int2:state int2:type="gram" int2:value="Rejected"/>
     </int2:bookmark>
-    <int2:bookmark int2:bookmarkName="_Int_GoY55r2F" int2:invalidationBookmarkName="" int2:hashCode="GgOKH3Y34D2IMf" int2:id="Ayckn7Mz">
-      <int2:state int2:type="gram" int2:value="Rejected"/>
-    </int2:bookmark>
-    <int2:bookmark int2:bookmarkName="_Int_hKjV3oYq" int2:invalidationBookmarkName="" int2:hashCode="xo9HxJxlI02xYk" int2:id="LRd5z0Xt">
-      <int2:state int2:type="gram" int2:value="Rejected"/>
-    </int2:bookmark>
     <int2:bookmark int2:bookmarkName="_Int_pXWCEQrJ" int2:invalidationBookmarkName="" int2:hashCode="oyYTSSFghkGb9z" int2:id="40REclGI">
       <int2:state int2:type="gram" int2:value="Rejected"/>
     </int2:bookmark>
@@ -2614,52 +3755,7 @@
     <int2:bookmark int2:bookmarkName="_Int_2wOWNsbJ" int2:invalidationBookmarkName="" int2:hashCode="mzu2CnX9I5dePd" int2:id="hXjOlsew">
       <int2:state int2:type="gram" int2:value="Rejected"/>
     </int2:bookmark>
-    <int2:bookmark int2:bookmarkName="_Int_Wy9nliN4" int2:invalidationBookmarkName="" int2:hashCode="mzu2CnX9I5dePd" int2:id="RrE5JG0A">
-      <int2:state int2:type="gram" int2:value="Rejected"/>
-    </int2:bookmark>
     <int2:bookmark int2:bookmarkName="_Int_BNGyn2rD" int2:invalidationBookmarkName="" int2:hashCode="JS5tuGqORwI101" int2:id="JD3COfX1">
-      <int2:state int2:type="gram" int2:value="Rejected"/>
-    </int2:bookmark>
-    <int2:bookmark int2:bookmarkName="_Int_A2EOY0AI" int2:invalidationBookmarkName="" int2:hashCode="3PfC+GJZBDhYvZ" int2:id="14I4MeYv">
-      <int2:state int2:type="gram" int2:value="Rejected"/>
-    </int2:bookmark>
-    <int2:bookmark int2:bookmarkName="_Int_kX4wvsCi" int2:invalidationBookmarkName="" int2:hashCode="3PfC+GJZBDhYvZ" int2:id="U553FoWv">
-      <int2:state int2:type="gram" int2:value="Rejected"/>
-    </int2:bookmark>
-    <int2:bookmark int2:bookmarkName="_Int_FwNksKla" int2:invalidationBookmarkName="" int2:hashCode="JS5tuGqORwI101" int2:id="oO1CVZKr">
-      <int2:state int2:type="gram" int2:value="Rejected"/>
-    </int2:bookmark>
-    <int2:bookmark int2:bookmarkName="_Int_BkbyaetL" int2:invalidationBookmarkName="" int2:hashCode="oyYTSSFghkGb9z" int2:id="4FmXv0ks">
-      <int2:state int2:type="gram" int2:value="Rejected"/>
-    </int2:bookmark>
-    <int2:bookmark int2:bookmarkName="_Int_1PzHL1Bb" int2:invalidationBookmarkName="" int2:hashCode="kVILneHS+H1FUH" int2:id="H07xXBvG">
-      <int2:state int2:type="gram" int2:value="Rejected"/>
-    </int2:bookmark>
-    <int2:bookmark int2:bookmarkName="_Int_4QRaorbY" int2:invalidationBookmarkName="" int2:hashCode="mzu2CnX9I5dePd" int2:id="a82qQU7s">
-      <int2:state int2:type="gram" int2:value="Rejected"/>
-    </int2:bookmark>
-    <int2:bookmark int2:bookmarkName="_Int_izmYSkhS" int2:invalidationBookmarkName="" int2:hashCode="3haxrba8DazZMj" int2:id="E6a5AK7R">
-      <int2:state int2:type="gram" int2:value="Rejected"/>
-    </int2:bookmark>
-    <int2:bookmark int2:bookmarkName="_Int_PC0UU3qx" int2:invalidationBookmarkName="" int2:hashCode="KOUfLdXGd6UHXG" int2:id="Z7IcNzX5">
-      <int2:state int2:type="gram" int2:value="Rejected"/>
-    </int2:bookmark>
-    <int2:bookmark int2:bookmarkName="_Int_Mzr5bTw3" int2:invalidationBookmarkName="" int2:hashCode="dZz2AW9T19GHMv" int2:id="dRht6v8h">
-      <int2:state int2:type="gram" int2:value="Rejected"/>
-    </int2:bookmark>
-    <int2:bookmark int2:bookmarkName="_Int_zTGp3K9f" int2:invalidationBookmarkName="" int2:hashCode="ByJAIvPv2QIWkt" int2:id="8dwlP4Qx">
-      <int2:state int2:type="gram" int2:value="Rejected"/>
-    </int2:bookmark>
-    <int2:bookmark int2:bookmarkName="_Int_zKYrNJ0a" int2:invalidationBookmarkName="" int2:hashCode="Ad7MnWnzIjN3iR" int2:id="Ty1nUPeE">
-      <int2:state int2:type="gram" int2:value="Rejected"/>
-    </int2:bookmark>
-    <int2:bookmark int2:bookmarkName="_Int_kv2hkcxo" int2:invalidationBookmarkName="" int2:hashCode="xtMwMrtAb35MFM" int2:id="TVS9rXRk">
-      <int2:state int2:type="gram" int2:value="Rejected"/>
-    </int2:bookmark>
-    <int2:bookmark int2:bookmarkName="_Int_jrHdhtML" int2:invalidationBookmarkName="" int2:hashCode="aStH+7q1c4BKLN" int2:id="J7OKhgp2">
-      <int2:state int2:type="gram" int2:value="Rejected"/>
-    </int2:bookmark>
-    <int2:bookmark int2:bookmarkName="_Int_PbJygJwA" int2:invalidationBookmarkName="" int2:hashCode="aylDeju43fGW+e" int2:id="wkXrJSXF">
       <int2:state int2:type="gram" int2:value="Rejected"/>
     </int2:bookmark>
   </int2:observations>

</xml_diff>

<commit_message>
Manual de usuario con licencia
</commit_message>
<xml_diff>
--- a/Programacion/Manual de usuario/Manual de usuario.docx
+++ b/Programacion/Manual de usuario/Manual de usuario.docx
@@ -60,7 +60,7 @@
       <w:pPr>
         <w:pStyle w:val="Heading1"/>
       </w:pPr>
-      <w:bookmarkStart w:name="_Toc2047801213" w:id="2047716878"/>
+      <w:bookmarkStart w:name="_Toc1427686352" w:id="409401187"/>
       <w:r>
         <w:rPr>
           <w:b w:val="1"/>
@@ -72,7 +72,7 @@
       <w:r>
         <w:br/>
       </w:r>
-      <w:bookmarkEnd w:id="2047716878"/>
+      <w:bookmarkEnd w:id="409401187"/>
     </w:p>
     <w:sdt>
       <w:sdtPr>
@@ -102,7 +102,7 @@
           <w:r>
             <w:fldChar w:fldCharType="separate"/>
           </w:r>
-          <w:hyperlink w:anchor="_Toc2047801213">
+          <w:hyperlink w:anchor="_Toc1427686352">
             <w:r>
               <w:rPr>
                 <w:rStyle w:val="Hyperlink"/>
@@ -116,7 +116,7 @@
               <w:fldChar w:fldCharType="begin"/>
             </w:r>
             <w:r>
-              <w:instrText xml:space="preserve">PAGEREF _Toc2047801213 \h</w:instrText>
+              <w:instrText xml:space="preserve">PAGEREF _Toc1427686352 \h</w:instrText>
             </w:r>
             <w:r>
               <w:fldChar w:fldCharType="separate"/>
@@ -142,7 +142,7 @@
               <w:rStyle w:val="Hyperlink"/>
             </w:rPr>
           </w:pPr>
-          <w:hyperlink w:anchor="_Toc544508615">
+          <w:hyperlink w:anchor="_Toc798708136">
             <w:r>
               <w:rPr>
                 <w:rStyle w:val="Hyperlink"/>
@@ -156,7 +156,7 @@
               <w:fldChar w:fldCharType="begin"/>
             </w:r>
             <w:r>
-              <w:instrText xml:space="preserve">PAGEREF _Toc544508615 \h</w:instrText>
+              <w:instrText xml:space="preserve">PAGEREF _Toc798708136 \h</w:instrText>
             </w:r>
             <w:r>
               <w:fldChar w:fldCharType="separate"/>
@@ -182,7 +182,7 @@
               <w:rStyle w:val="Hyperlink"/>
             </w:rPr>
           </w:pPr>
-          <w:hyperlink w:anchor="_Toc859196054">
+          <w:hyperlink w:anchor="_Toc1509843913">
             <w:r>
               <w:rPr>
                 <w:rStyle w:val="Hyperlink"/>
@@ -196,7 +196,7 @@
               <w:fldChar w:fldCharType="begin"/>
             </w:r>
             <w:r>
-              <w:instrText xml:space="preserve">PAGEREF _Toc859196054 \h</w:instrText>
+              <w:instrText xml:space="preserve">PAGEREF _Toc1509843913 \h</w:instrText>
             </w:r>
             <w:r>
               <w:fldChar w:fldCharType="separate"/>
@@ -222,7 +222,7 @@
               <w:rStyle w:val="Hyperlink"/>
             </w:rPr>
           </w:pPr>
-          <w:hyperlink w:anchor="_Toc820899969">
+          <w:hyperlink w:anchor="_Toc905451803">
             <w:r>
               <w:rPr>
                 <w:rStyle w:val="Hyperlink"/>
@@ -236,7 +236,7 @@
               <w:fldChar w:fldCharType="begin"/>
             </w:r>
             <w:r>
-              <w:instrText xml:space="preserve">PAGEREF _Toc820899969 \h</w:instrText>
+              <w:instrText xml:space="preserve">PAGEREF _Toc905451803 \h</w:instrText>
             </w:r>
             <w:r>
               <w:fldChar w:fldCharType="separate"/>
@@ -262,7 +262,7 @@
               <w:rStyle w:val="Hyperlink"/>
             </w:rPr>
           </w:pPr>
-          <w:hyperlink w:anchor="_Toc399201739">
+          <w:hyperlink w:anchor="_Toc511265140">
             <w:r>
               <w:rPr>
                 <w:rStyle w:val="Hyperlink"/>
@@ -276,7 +276,7 @@
               <w:fldChar w:fldCharType="begin"/>
             </w:r>
             <w:r>
-              <w:instrText xml:space="preserve">PAGEREF _Toc399201739 \h</w:instrText>
+              <w:instrText xml:space="preserve">PAGEREF _Toc511265140 \h</w:instrText>
             </w:r>
             <w:r>
               <w:fldChar w:fldCharType="separate"/>
@@ -285,7 +285,7 @@
               <w:rPr>
                 <w:rStyle w:val="Hyperlink"/>
               </w:rPr>
-              <w:t>1</w:t>
+              <w:t>2</w:t>
             </w:r>
             <w:r>
               <w:fldChar w:fldCharType="end"/>
@@ -302,7 +302,7 @@
               <w:rStyle w:val="Hyperlink"/>
             </w:rPr>
           </w:pPr>
-          <w:hyperlink w:anchor="_Toc1517806272">
+          <w:hyperlink w:anchor="_Toc879229880">
             <w:r>
               <w:rPr>
                 <w:rStyle w:val="Hyperlink"/>
@@ -316,7 +316,7 @@
               <w:fldChar w:fldCharType="begin"/>
             </w:r>
             <w:r>
-              <w:instrText xml:space="preserve">PAGEREF _Toc1517806272 \h</w:instrText>
+              <w:instrText xml:space="preserve">PAGEREF _Toc879229880 \h</w:instrText>
             </w:r>
             <w:r>
               <w:fldChar w:fldCharType="separate"/>
@@ -325,7 +325,7 @@
               <w:rPr>
                 <w:rStyle w:val="Hyperlink"/>
               </w:rPr>
-              <w:t>1</w:t>
+              <w:t>3</w:t>
             </w:r>
             <w:r>
               <w:fldChar w:fldCharType="end"/>
@@ -339,7 +339,7 @@
               <w:tab w:val="right" w:leader="dot" w:pos="9015"/>
             </w:tabs>
           </w:pPr>
-          <w:hyperlink w:anchor="_Toc1060950956">
+          <w:hyperlink w:anchor="_Toc1407560729">
             <w:r>
               <w:rPr>
                 <w:rStyle w:val="Hyperlink"/>
@@ -353,7 +353,7 @@
               <w:fldChar w:fldCharType="begin"/>
             </w:r>
             <w:r>
-              <w:instrText xml:space="preserve">PAGEREF _Toc1060950956 \h</w:instrText>
+              <w:instrText xml:space="preserve">PAGEREF _Toc1407560729 \h</w:instrText>
             </w:r>
             <w:r>
               <w:fldChar w:fldCharType="separate"/>
@@ -362,7 +362,7 @@
               <w:rPr>
                 <w:rStyle w:val="Hyperlink"/>
               </w:rPr>
-              <w:t>1</w:t>
+              <w:t>3</w:t>
             </w:r>
             <w:r>
               <w:fldChar w:fldCharType="end"/>
@@ -376,7 +376,7 @@
               <w:tab w:val="right" w:leader="dot" w:pos="9015"/>
             </w:tabs>
           </w:pPr>
-          <w:hyperlink w:anchor="_Toc1663264036">
+          <w:hyperlink w:anchor="_Toc27283976">
             <w:r>
               <w:rPr>
                 <w:rStyle w:val="Hyperlink"/>
@@ -390,7 +390,7 @@
               <w:fldChar w:fldCharType="begin"/>
             </w:r>
             <w:r>
-              <w:instrText xml:space="preserve">PAGEREF _Toc1663264036 \h</w:instrText>
+              <w:instrText xml:space="preserve">PAGEREF _Toc27283976 \h</w:instrText>
             </w:r>
             <w:r>
               <w:fldChar w:fldCharType="separate"/>
@@ -399,7 +399,7 @@
               <w:rPr>
                 <w:rStyle w:val="Hyperlink"/>
               </w:rPr>
-              <w:t>2</w:t>
+              <w:t>3</w:t>
             </w:r>
             <w:r>
               <w:fldChar w:fldCharType="end"/>
@@ -413,7 +413,7 @@
               <w:tab w:val="right" w:leader="dot" w:pos="9015"/>
             </w:tabs>
           </w:pPr>
-          <w:hyperlink w:anchor="_Toc77101453">
+          <w:hyperlink w:anchor="_Toc157029606">
             <w:r>
               <w:rPr>
                 <w:rStyle w:val="Hyperlink"/>
@@ -427,7 +427,7 @@
               <w:fldChar w:fldCharType="begin"/>
             </w:r>
             <w:r>
-              <w:instrText xml:space="preserve">PAGEREF _Toc77101453 \h</w:instrText>
+              <w:instrText xml:space="preserve">PAGEREF _Toc157029606 \h</w:instrText>
             </w:r>
             <w:r>
               <w:fldChar w:fldCharType="separate"/>
@@ -436,7 +436,7 @@
               <w:rPr>
                 <w:rStyle w:val="Hyperlink"/>
               </w:rPr>
-              <w:t>3</w:t>
+              <w:t>4</w:t>
             </w:r>
             <w:r>
               <w:fldChar w:fldCharType="end"/>
@@ -450,7 +450,7 @@
               <w:tab w:val="right" w:leader="dot" w:pos="9015"/>
             </w:tabs>
           </w:pPr>
-          <w:hyperlink w:anchor="_Toc81259772">
+          <w:hyperlink w:anchor="_Toc1228673080">
             <w:r>
               <w:rPr>
                 <w:rStyle w:val="Hyperlink"/>
@@ -464,7 +464,7 @@
               <w:fldChar w:fldCharType="begin"/>
             </w:r>
             <w:r>
-              <w:instrText xml:space="preserve">PAGEREF _Toc81259772 \h</w:instrText>
+              <w:instrText xml:space="preserve">PAGEREF _Toc1228673080 \h</w:instrText>
             </w:r>
             <w:r>
               <w:fldChar w:fldCharType="separate"/>
@@ -473,7 +473,7 @@
               <w:rPr>
                 <w:rStyle w:val="Hyperlink"/>
               </w:rPr>
-              <w:t>3</w:t>
+              <w:t>4</w:t>
             </w:r>
             <w:r>
               <w:fldChar w:fldCharType="end"/>
@@ -487,7 +487,7 @@
               <w:tab w:val="right" w:leader="dot" w:pos="9015"/>
             </w:tabs>
           </w:pPr>
-          <w:hyperlink w:anchor="_Toc2133818568">
+          <w:hyperlink w:anchor="_Toc97740711">
             <w:r>
               <w:rPr>
                 <w:rStyle w:val="Hyperlink"/>
@@ -501,7 +501,7 @@
               <w:fldChar w:fldCharType="begin"/>
             </w:r>
             <w:r>
-              <w:instrText xml:space="preserve">PAGEREF _Toc2133818568 \h</w:instrText>
+              <w:instrText xml:space="preserve">PAGEREF _Toc97740711 \h</w:instrText>
             </w:r>
             <w:r>
               <w:fldChar w:fldCharType="separate"/>
@@ -510,7 +510,7 @@
               <w:rPr>
                 <w:rStyle w:val="Hyperlink"/>
               </w:rPr>
-              <w:t>3</w:t>
+              <w:t>4</w:t>
             </w:r>
             <w:r>
               <w:fldChar w:fldCharType="end"/>
@@ -532,7 +532,7 @@
           <w:bCs w:val="1"/>
         </w:rPr>
       </w:pPr>
-      <w:bookmarkStart w:name="_Toc544508615" w:id="148542406"/>
+      <w:bookmarkStart w:name="_Toc798708136" w:id="772364370"/>
       <w:r>
         <w:rPr>
           <w:b w:val="1"/>
@@ -540,18 +540,18 @@
         </w:rPr>
         <w:t>Licencia</w:t>
       </w:r>
-      <w:bookmarkEnd w:id="148542406"/>
+      <w:bookmarkEnd w:id="772364370"/>
     </w:p>
     <w:p>
       <w:pPr>
         <w:pStyle w:val="Heading2"/>
       </w:pPr>
-      <w:bookmarkStart w:name="_Toc859196054" w:id="610359836"/>
+      <w:bookmarkStart w:name="_Toc1509843913" w:id="312327123"/>
       <w:r>
         <w:rPr/>
         <w:t>Licencia de la aplicación</w:t>
       </w:r>
-      <w:bookmarkEnd w:id="610359836"/>
+      <w:bookmarkEnd w:id="312327123"/>
     </w:p>
     <w:p>
       <w:pPr>
@@ -572,81 +572,6 @@
         </w:rPr>
         <w:t>de software</w:t>
       </w:r>
-    </w:p>
-    <w:p>
-      <w:pPr>
-        <w:pStyle w:val="Normal"/>
-        <w:rPr>
-          <w:u w:val="single"/>
-        </w:rPr>
-      </w:pPr>
-    </w:p>
-    <w:p>
-      <w:pPr>
-        <w:pStyle w:val="Normal"/>
-        <w:rPr>
-          <w:u w:val="single"/>
-        </w:rPr>
-      </w:pPr>
-      <w:r>
-        <w:rPr>
-          <w:u w:val="single"/>
-        </w:rPr>
-        <w:t>Licencia de Creative Commons</w:t>
-      </w:r>
-    </w:p>
-    <w:p>
-      <w:pPr>
-        <w:pStyle w:val="Normal"/>
-        <w:rPr>
-          <w:i w:val="1"/>
-          <w:iCs w:val="1"/>
-          <w:u w:val="single"/>
-        </w:rPr>
-      </w:pPr>
-      <w:r>
-        <w:rPr>
-          <w:i w:val="1"/>
-          <w:iCs w:val="1"/>
-          <w:u w:val="single"/>
-        </w:rPr>
-        <w:t>https://creativecommons.org/chooser/</w:t>
-      </w:r>
-    </w:p>
-    <w:p>
-      <w:pPr>
-        <w:pStyle w:val="Normal"/>
-      </w:pPr>
-    </w:p>
-    <w:p>
-      <w:pPr>
-        <w:pStyle w:val="Normal"/>
-      </w:pPr>
-    </w:p>
-    <w:p>
-      <w:pPr>
-        <w:pStyle w:val="Normal"/>
-      </w:pPr>
-    </w:p>
-    <w:p>
-      <w:pPr>
-        <w:pStyle w:val="Normal"/>
-      </w:pPr>
-    </w:p>
-    <w:p>
-      <w:pPr>
-        <w:pStyle w:val="Heading2"/>
-      </w:pPr>
-      <w:bookmarkStart w:name="_Toc820899969" w:id="331534152"/>
-      <w:r>
-        <w:rPr/>
-        <w:t>Otros tipos de licencia</w:t>
-      </w:r>
-      <w:r>
-        <w:rPr/>
-        <w:t xml:space="preserve"> de software</w:t>
-      </w:r>
-      <w:bookmarkEnd w:id="331534152"/>
     </w:p>
     <w:p>
       <w:pPr>
@@ -659,131 +584,53 @@
         <w:rPr>
           <w:i w:val="1"/>
           <w:iCs w:val="1"/>
-        </w:rPr>
-      </w:pPr>
-      <w:r>
-        <w:rPr>
-          <w:u w:val="single"/>
-        </w:rPr>
-        <w:t xml:space="preserve">Software </w:t>
-      </w:r>
-      <w:bookmarkStart w:name="_Int_Vri9LjKR" w:id="333783046"/>
-      <w:r>
-        <w:rPr>
-          <w:u w:val="single"/>
-        </w:rPr>
-        <w:t>propietario</w:t>
-      </w:r>
-      <w:bookmarkStart w:name="_Int_BNGyn2rD" w:id="804433918"/>
-      <w:r>
-        <w:rPr/>
-        <w:t xml:space="preserve"> :</w:t>
-      </w:r>
-      <w:bookmarkEnd w:id="804433918"/>
-      <w:bookmarkEnd w:id="333783046"/>
-      <w:r>
-        <w:rPr/>
-        <w:t xml:space="preserve"> </w:t>
-      </w:r>
-    </w:p>
-    <w:p>
-      <w:pPr>
-        <w:pStyle w:val="Normal"/>
-        <w:rPr>
-          <w:i w:val="1"/>
-          <w:iCs w:val="1"/>
-        </w:rPr>
-      </w:pPr>
-      <w:r>
-        <w:rPr>
-          <w:b w:val="1"/>
-          <w:bCs w:val="1"/>
-          <w:i w:val="1"/>
-          <w:iCs w:val="1"/>
-        </w:rPr>
-        <w:t>Retail</w:t>
-      </w:r>
-      <w:r>
-        <w:rPr>
-          <w:b w:val="1"/>
-          <w:bCs w:val="1"/>
-          <w:i w:val="1"/>
-          <w:iCs w:val="1"/>
-        </w:rPr>
-        <w:t xml:space="preserve"> </w:t>
-      </w:r>
-      <w:r>
-        <w:rPr>
-          <w:i w:val="1"/>
-          <w:iCs w:val="1"/>
-        </w:rPr>
-        <w:t>:</w:t>
-      </w:r>
-      <w:r>
-        <w:rPr>
-          <w:i w:val="1"/>
-          <w:iCs w:val="1"/>
-        </w:rPr>
-        <w:t xml:space="preserve"> Licencia de venta al por menor en la tienda de Microsoft o </w:t>
-      </w:r>
-      <w:r>
-        <w:rPr>
-          <w:i w:val="1"/>
-          <w:iCs w:val="1"/>
-        </w:rPr>
-        <w:t>distribuidores</w:t>
-      </w:r>
-      <w:r>
-        <w:rPr>
-          <w:i w:val="1"/>
-          <w:iCs w:val="1"/>
-        </w:rPr>
-        <w:t xml:space="preserve"> autorizados. Transferible entre equipos y con soporte técnico.</w:t>
-      </w:r>
-      <w:r>
-        <w:br/>
-      </w:r>
-      <w:r>
-        <w:rPr>
-          <w:b w:val="1"/>
-          <w:bCs w:val="1"/>
-          <w:i w:val="1"/>
-          <w:iCs w:val="1"/>
-        </w:rPr>
-        <w:t xml:space="preserve">Adobe </w:t>
-      </w:r>
-      <w:bookmarkStart w:name="_Int_Onu0VE9h" w:id="1899355236"/>
-      <w:r>
-        <w:rPr>
-          <w:b w:val="1"/>
-          <w:bCs w:val="1"/>
-          <w:i w:val="1"/>
-          <w:iCs w:val="1"/>
-        </w:rPr>
-        <w:t>Photoshop</w:t>
-      </w:r>
-      <w:r>
-        <w:rPr>
-          <w:i w:val="1"/>
-          <w:iCs w:val="1"/>
-        </w:rPr>
-        <w:t xml:space="preserve"> :</w:t>
-      </w:r>
-      <w:bookmarkEnd w:id="1899355236"/>
-      <w:r>
-        <w:rPr>
-          <w:i w:val="1"/>
-          <w:iCs w:val="1"/>
-        </w:rPr>
-        <w:t xml:space="preserve"> </w:t>
-      </w:r>
-      <w:r>
-        <w:rPr>
-          <w:i w:val="1"/>
-          <w:iCs w:val="1"/>
-        </w:rPr>
-        <w:t>La licencia es de pago, pero caduca y se tiene que renovar a través de una suscripción.</w:t>
-      </w:r>
+          <w:u w:val="none"/>
+        </w:rPr>
+      </w:pPr>
+      <w:r>
+        <w:rPr>
+          <w:i w:val="1"/>
+          <w:iCs w:val="1"/>
+          <w:u w:val="none"/>
+        </w:rPr>
+        <w:t>Est</w:t>
+      </w:r>
+      <w:r>
+        <w:rPr>
+          <w:i w:val="1"/>
+          <w:iCs w:val="1"/>
+          <w:u w:val="none"/>
+        </w:rPr>
+        <w:t>a</w:t>
+      </w:r>
+      <w:r>
+        <w:rPr>
+          <w:i w:val="1"/>
+          <w:iCs w:val="1"/>
+          <w:u w:val="none"/>
+        </w:rPr>
+        <w:t xml:space="preserve"> aplicación se distribuye bajo una licencia </w:t>
+      </w:r>
+      <w:bookmarkStart w:name="_Int_Mm7s96Jj" w:id="1175264736"/>
+      <w:r>
+        <w:rPr>
+          <w:i w:val="1"/>
+          <w:iCs w:val="1"/>
+          <w:u w:val="none"/>
+        </w:rPr>
+        <w:t>MIT</w:t>
+      </w:r>
+      <w:bookmarkStart w:name="_Int_PZUOkQCq" w:id="1312044779"/>
+      <w:r>
+        <w:rPr>
+          <w:i w:val="1"/>
+          <w:iCs w:val="1"/>
+          <w:u w:val="none"/>
+        </w:rPr>
+        <w:t>.</w:t>
+      </w:r>
+      <w:bookmarkEnd w:id="1312044779"/>
+      <w:bookmarkEnd w:id="1175264736"/>
     </w:p>
     <w:p>
       <w:pPr>
@@ -796,247 +643,60 @@
         <w:rPr>
           <w:i w:val="1"/>
           <w:iCs w:val="1"/>
-          <w:lang w:val="en-US"/>
-        </w:rPr>
-      </w:pPr>
-      <w:r>
-        <w:rPr>
-          <w:u w:val="single"/>
-          <w:lang w:val="en-US"/>
-        </w:rPr>
-        <w:t>C</w:t>
-      </w:r>
-      <w:r>
-        <w:rPr>
-          <w:u w:val="single"/>
-          <w:lang w:val="en-US"/>
-        </w:rPr>
-        <w:t>opyleft fuerte</w:t>
-      </w:r>
-      <w:r>
-        <w:rPr>
-          <w:lang w:val="en-US"/>
-        </w:rPr>
-        <w:t xml:space="preserve"> :</w:t>
-      </w:r>
-      <w:r>
-        <w:rPr>
-          <w:lang w:val="en-US"/>
-        </w:rPr>
-        <w:t xml:space="preserve">  </w:t>
+          <w:u w:val="none"/>
+        </w:rPr>
+      </w:pPr>
+      <w:r>
+        <w:rPr>
+          <w:i w:val="1"/>
+          <w:iCs w:val="1"/>
+          <w:u w:val="none"/>
+        </w:rPr>
+        <w:t>Esto es así ya que queremos que nuestro programa sea de uso libre</w:t>
+      </w:r>
+      <w:r>
+        <w:rPr>
+          <w:i w:val="1"/>
+          <w:iCs w:val="1"/>
+          <w:u w:val="none"/>
+        </w:rPr>
+        <w:t>, y su licencia lo más simple posible; pero también queremos que siempre se nos dé crédito como creadores del programa original.</w:t>
       </w:r>
     </w:p>
     <w:p>
       <w:pPr>
         <w:pStyle w:val="Normal"/>
       </w:pPr>
-      <w:r>
-        <w:rPr>
-          <w:b w:val="1"/>
-          <w:bCs w:val="1"/>
-          <w:i w:val="1"/>
-          <w:iCs w:val="1"/>
-          <w:lang w:val="es-ES"/>
-        </w:rPr>
-        <w:t xml:space="preserve">GNU General Public </w:t>
-      </w:r>
-      <w:r>
-        <w:rPr>
-          <w:b w:val="1"/>
-          <w:bCs w:val="1"/>
-          <w:i w:val="1"/>
-          <w:iCs w:val="1"/>
-          <w:lang w:val="es-ES"/>
-        </w:rPr>
-        <w:t>License</w:t>
-      </w:r>
-      <w:r>
-        <w:rPr>
-          <w:b w:val="1"/>
-          <w:bCs w:val="1"/>
-          <w:i w:val="1"/>
-          <w:iCs w:val="1"/>
-          <w:lang w:val="es-ES"/>
-        </w:rPr>
-        <w:t xml:space="preserve"> v. </w:t>
-      </w:r>
-      <w:bookmarkStart w:name="_Int_LTK0zGtF" w:id="1825119616"/>
-      <w:r>
-        <w:rPr>
-          <w:b w:val="1"/>
-          <w:bCs w:val="1"/>
-          <w:i w:val="1"/>
-          <w:iCs w:val="1"/>
-          <w:lang w:val="es-ES"/>
-        </w:rPr>
-        <w:t>3</w:t>
-      </w:r>
-      <w:bookmarkStart w:name="_Int_QcWw9Dl5" w:id="492922352"/>
-      <w:r>
-        <w:rPr>
-          <w:b w:val="1"/>
-          <w:bCs w:val="1"/>
-          <w:i w:val="1"/>
-          <w:iCs w:val="1"/>
-          <w:lang w:val="es-ES"/>
-        </w:rPr>
-        <w:t>.0.</w:t>
-      </w:r>
-      <w:r>
-        <w:rPr>
-          <w:i w:val="1"/>
-          <w:iCs w:val="1"/>
-          <w:lang w:val="es-ES"/>
-        </w:rPr>
-        <w:t xml:space="preserve"> :</w:t>
-      </w:r>
-      <w:bookmarkEnd w:id="492922352"/>
-      <w:bookmarkEnd w:id="1825119616"/>
-      <w:r>
-        <w:rPr>
-          <w:i w:val="1"/>
-          <w:iCs w:val="1"/>
-          <w:lang w:val="es-ES"/>
-        </w:rPr>
-        <w:t xml:space="preserve"> </w:t>
-      </w:r>
-      <w:r>
-        <w:rPr>
-          <w:i w:val="1"/>
-          <w:iCs w:val="1"/>
-          <w:lang w:val="es-ES"/>
-        </w:rPr>
-        <w:t xml:space="preserve">El software puede usarse </w:t>
-      </w:r>
-      <w:r>
-        <w:rPr>
-          <w:i w:val="1"/>
-          <w:iCs w:val="1"/>
-          <w:lang w:val="es-ES"/>
-        </w:rPr>
-        <w:t>bajo unas condiciones mínimas</w:t>
-      </w:r>
-      <w:r>
-        <w:rPr>
-          <w:i w:val="1"/>
-          <w:iCs w:val="1"/>
-          <w:lang w:val="es-ES"/>
-        </w:rPr>
-        <w:t>, pero cualquier derivado debe mantener las mismas libertades.</w:t>
-      </w:r>
-      <w:r>
-        <w:br/>
-      </w:r>
-      <w:r>
-        <w:rPr>
-          <w:b w:val="1"/>
-          <w:bCs w:val="1"/>
-          <w:i w:val="1"/>
-          <w:iCs w:val="1"/>
-          <w:lang w:val="es-ES"/>
-        </w:rPr>
-        <w:t xml:space="preserve">Eclipse Public </w:t>
-      </w:r>
-      <w:r>
-        <w:rPr>
-          <w:b w:val="1"/>
-          <w:bCs w:val="1"/>
-          <w:i w:val="1"/>
-          <w:iCs w:val="1"/>
-          <w:lang w:val="es-ES"/>
-        </w:rPr>
-        <w:t>License</w:t>
-      </w:r>
-      <w:r>
-        <w:rPr>
-          <w:i w:val="1"/>
-          <w:iCs w:val="1"/>
-          <w:lang w:val="es-ES"/>
-        </w:rPr>
-        <w:t xml:space="preserve"> :</w:t>
-      </w:r>
-      <w:r>
-        <w:rPr>
-          <w:i w:val="1"/>
-          <w:iCs w:val="1"/>
-          <w:lang w:val="es-ES"/>
-        </w:rPr>
-        <w:t xml:space="preserve"> </w:t>
-      </w:r>
-      <w:r>
-        <w:rPr>
-          <w:i w:val="1"/>
-          <w:iCs w:val="1"/>
-          <w:lang w:val="es-ES"/>
-        </w:rPr>
-        <w:t xml:space="preserve">El software puede usarse </w:t>
-      </w:r>
-      <w:r>
-        <w:rPr>
-          <w:i w:val="1"/>
-          <w:iCs w:val="1"/>
-          <w:lang w:val="es-ES"/>
-        </w:rPr>
-        <w:t>bajo unas condiciones mínimas</w:t>
-      </w:r>
-      <w:r>
-        <w:rPr>
-          <w:i w:val="1"/>
-          <w:iCs w:val="1"/>
-          <w:lang w:val="es-ES"/>
-        </w:rPr>
-        <w:t>, pero</w:t>
-      </w:r>
-      <w:r>
-        <w:rPr>
-          <w:i w:val="1"/>
-          <w:iCs w:val="1"/>
-          <w:lang w:val="es-ES"/>
-        </w:rPr>
-        <w:t xml:space="preserve"> un derivado puede combinar partes de código abierto con partes de código cerrado</w:t>
-      </w:r>
-      <w:r>
-        <w:rPr>
-          <w:i w:val="1"/>
-          <w:iCs w:val="1"/>
-          <w:lang w:val="es-ES"/>
-        </w:rPr>
-        <w:t xml:space="preserve"> (No tiene </w:t>
-      </w:r>
-      <w:bookmarkStart w:name="_Int_mo6XNs1U" w:id="1743440449"/>
-      <w:r>
-        <w:rPr>
-          <w:i w:val="1"/>
-          <w:iCs w:val="1"/>
-          <w:lang w:val="es-ES"/>
-        </w:rPr>
-        <w:t>por qu</w:t>
-      </w:r>
-      <w:r>
-        <w:rPr>
-          <w:i w:val="1"/>
-          <w:iCs w:val="1"/>
-          <w:lang w:val="es-ES"/>
-        </w:rPr>
-        <w:t>é</w:t>
-      </w:r>
-      <w:bookmarkEnd w:id="1743440449"/>
-      <w:r>
-        <w:rPr>
-          <w:i w:val="1"/>
-          <w:iCs w:val="1"/>
-          <w:lang w:val="es-ES"/>
-        </w:rPr>
-        <w:t xml:space="preserve"> afectar a todo el proyecto)</w:t>
-      </w:r>
-      <w:r>
-        <w:rPr>
-          <w:i w:val="1"/>
-          <w:iCs w:val="1"/>
-          <w:lang w:val="es-ES"/>
-        </w:rPr>
-        <w:t>.</w:t>
-      </w:r>
+    </w:p>
+    <w:p>
+      <w:pPr>
+        <w:pStyle w:val="Normal"/>
+      </w:pPr>
+    </w:p>
+    <w:p>
+      <w:pPr>
+        <w:pStyle w:val="Normal"/>
+      </w:pPr>
+    </w:p>
+    <w:p>
+      <w:pPr>
+        <w:pStyle w:val="Normal"/>
+      </w:pPr>
+    </w:p>
+    <w:p>
+      <w:pPr>
+        <w:pStyle w:val="Heading2"/>
+      </w:pPr>
+      <w:bookmarkStart w:name="_Toc905451803" w:id="2058945873"/>
+      <w:r>
+        <w:rPr/>
+        <w:t>Otros tipos de licencia</w:t>
+      </w:r>
+      <w:r>
+        <w:rPr/>
+        <w:t xml:space="preserve"> de software</w:t>
+      </w:r>
+      <w:bookmarkEnd w:id="2058945873"/>
     </w:p>
     <w:p>
       <w:pPr>
@@ -1046,27 +706,31 @@
         <w:spacing w:before="0" w:beforeAutospacing="off" w:after="160" w:afterAutospacing="off" w:line="279" w:lineRule="auto"/>
         <w:ind w:left="0" w:right="0"/>
         <w:jc w:val="left"/>
+        <w:rPr>
+          <w:i w:val="1"/>
+          <w:iCs w:val="1"/>
+        </w:rPr>
       </w:pPr>
       <w:r>
         <w:rPr>
           <w:u w:val="single"/>
         </w:rPr>
-        <w:t xml:space="preserve">Copyleft </w:t>
-      </w:r>
-      <w:bookmarkStart w:name="_Int_geqKrWBl" w:id="262962573"/>
+        <w:t xml:space="preserve">Software </w:t>
+      </w:r>
+      <w:bookmarkStart w:name="_Int_Vri9LjKR" w:id="333783046"/>
       <w:r>
         <w:rPr>
           <w:u w:val="single"/>
         </w:rPr>
-        <w:t>débil</w:t>
-      </w:r>
-      <w:bookmarkStart w:name="_Int_pXWCEQrJ" w:id="902082552"/>
+        <w:t>propietario</w:t>
+      </w:r>
+      <w:bookmarkStart w:name="_Int_BNGyn2rD" w:id="804433918"/>
       <w:r>
         <w:rPr/>
         <w:t xml:space="preserve"> :</w:t>
       </w:r>
-      <w:bookmarkEnd w:id="902082552"/>
-      <w:bookmarkEnd w:id="262962573"/>
+      <w:bookmarkEnd w:id="804433918"/>
+      <w:bookmarkEnd w:id="333783046"/>
       <w:r>
         <w:rPr/>
         <w:t xml:space="preserve"> </w:t>
@@ -1075,6 +739,10 @@
     <w:p>
       <w:pPr>
         <w:pStyle w:val="Normal"/>
+        <w:rPr>
+          <w:i w:val="1"/>
+          <w:iCs w:val="1"/>
+        </w:rPr>
       </w:pPr>
       <w:r>
         <w:rPr>
@@ -1082,9 +750,8 @@
           <w:bCs w:val="1"/>
           <w:i w:val="1"/>
           <w:iCs w:val="1"/>
-          <w:lang w:val="es-ES"/>
-        </w:rPr>
-        <w:t xml:space="preserve">Apache </w:t>
+        </w:rPr>
+        <w:t>Retail</w:t>
       </w:r>
       <w:r>
         <w:rPr>
@@ -1092,9 +759,39 @@
           <w:bCs w:val="1"/>
           <w:i w:val="1"/>
           <w:iCs w:val="1"/>
-          <w:lang w:val="es-ES"/>
-        </w:rPr>
-        <w:t>License</w:t>
+        </w:rPr>
+        <w:t xml:space="preserve"> </w:t>
+      </w:r>
+      <w:r>
+        <w:rPr>
+          <w:i w:val="1"/>
+          <w:iCs w:val="1"/>
+        </w:rPr>
+        <w:t>:</w:t>
+      </w:r>
+      <w:r>
+        <w:rPr>
+          <w:i w:val="1"/>
+          <w:iCs w:val="1"/>
+        </w:rPr>
+        <w:t xml:space="preserve"> Licencia de venta al por menor en la tienda de Microsoft o </w:t>
+      </w:r>
+      <w:r>
+        <w:rPr>
+          <w:i w:val="1"/>
+          <w:iCs w:val="1"/>
+        </w:rPr>
+        <w:t>distribuidores</w:t>
+      </w:r>
+      <w:r>
+        <w:rPr>
+          <w:i w:val="1"/>
+          <w:iCs w:val="1"/>
+        </w:rPr>
+        <w:t xml:space="preserve"> autorizados. Transferible entre equipos y con soporte técnico.</w:t>
+      </w:r>
+      <w:r>
+        <w:br/>
       </w:r>
       <w:r>
         <w:rPr>
@@ -1102,76 +799,31 @@
           <w:bCs w:val="1"/>
           <w:i w:val="1"/>
           <w:iCs w:val="1"/>
-          <w:lang w:val="es-ES"/>
-        </w:rPr>
-        <w:t xml:space="preserve"> v </w:t>
-      </w:r>
-      <w:bookmarkStart w:name="_Int_U7HCu94M" w:id="191233352"/>
+        </w:rPr>
+        <w:t xml:space="preserve">Adobe </w:t>
+      </w:r>
+      <w:bookmarkStart w:name="_Int_Onu0VE9h" w:id="1899355236"/>
       <w:r>
         <w:rPr>
           <w:b w:val="1"/>
           <w:bCs w:val="1"/>
           <w:i w:val="1"/>
           <w:iCs w:val="1"/>
-          <w:lang w:val="es-ES"/>
-        </w:rPr>
-        <w:t>2.0.</w:t>
-      </w:r>
-      <w:r>
-        <w:rPr>
-          <w:i w:val="1"/>
-          <w:iCs w:val="1"/>
-          <w:lang w:val="es-ES"/>
+        </w:rPr>
+        <w:t>Photoshop</w:t>
+      </w:r>
+      <w:r>
+        <w:rPr>
+          <w:i w:val="1"/>
+          <w:iCs w:val="1"/>
         </w:rPr>
         <w:t xml:space="preserve"> :</w:t>
       </w:r>
-      <w:bookmarkEnd w:id="191233352"/>
-      <w:r>
-        <w:rPr>
-          <w:i w:val="1"/>
-          <w:iCs w:val="1"/>
-          <w:lang w:val="es-ES"/>
-        </w:rPr>
-        <w:t xml:space="preserve"> El software puede usarse bajo unas condiciones mínimas, pero siempre manteniendo los avisos de los derechos de autor y el texto de la licencia. La licencia es muy detallada y da más seguridad jurídica.</w:t>
-      </w:r>
-      <w:r>
-        <w:br/>
-      </w:r>
-      <w:r>
-        <w:rPr>
-          <w:b w:val="1"/>
-          <w:bCs w:val="1"/>
-          <w:i w:val="1"/>
-          <w:iCs w:val="1"/>
-          <w:lang w:val="en-US"/>
-        </w:rPr>
-        <w:t xml:space="preserve">Mozilla Public </w:t>
-      </w:r>
-      <w:bookmarkStart w:name="_Int_iHhWgWn9" w:id="771899124"/>
-      <w:r>
-        <w:rPr>
-          <w:b w:val="1"/>
-          <w:bCs w:val="1"/>
-          <w:i w:val="1"/>
-          <w:iCs w:val="1"/>
-          <w:lang w:val="en-US"/>
-        </w:rPr>
-        <w:t>License</w:t>
-      </w:r>
-      <w:r>
-        <w:rPr>
-          <w:i w:val="1"/>
-          <w:iCs w:val="1"/>
-          <w:lang w:val="en-US"/>
-        </w:rPr>
-        <w:t xml:space="preserve"> :</w:t>
-      </w:r>
-      <w:bookmarkEnd w:id="771899124"/>
-      <w:r>
-        <w:rPr>
-          <w:i w:val="1"/>
-          <w:iCs w:val="1"/>
-          <w:lang w:val="en-US"/>
+      <w:bookmarkEnd w:id="1899355236"/>
+      <w:r>
+        <w:rPr>
+          <w:i w:val="1"/>
+          <w:iCs w:val="1"/>
         </w:rPr>
         <w:t xml:space="preserve"> </w:t>
       </w:r>
@@ -1179,1083 +831,9 @@
         <w:rPr>
           <w:i w:val="1"/>
           <w:iCs w:val="1"/>
-          <w:lang w:val="en-US"/>
-        </w:rPr>
-        <w:t xml:space="preserve">El software </w:t>
-      </w:r>
-      <w:r>
-        <w:rPr>
-          <w:i w:val="1"/>
-          <w:iCs w:val="1"/>
-          <w:lang w:val="en-US"/>
-        </w:rPr>
-        <w:t>puede</w:t>
-      </w:r>
-      <w:r>
-        <w:rPr>
-          <w:i w:val="1"/>
-          <w:iCs w:val="1"/>
-          <w:lang w:val="en-US"/>
-        </w:rPr>
-        <w:t xml:space="preserve"> </w:t>
-      </w:r>
-      <w:r>
-        <w:rPr>
-          <w:i w:val="1"/>
-          <w:iCs w:val="1"/>
-          <w:lang w:val="en-US"/>
-        </w:rPr>
-        <w:t>usarse</w:t>
-      </w:r>
-      <w:r>
-        <w:rPr>
-          <w:i w:val="1"/>
-          <w:iCs w:val="1"/>
-          <w:lang w:val="es-ES"/>
-        </w:rPr>
-        <w:t xml:space="preserve"> bajo unas condiciones mínimas</w:t>
-      </w:r>
-      <w:r>
-        <w:rPr>
-          <w:i w:val="1"/>
-          <w:iCs w:val="1"/>
-          <w:lang w:val="en-US"/>
-        </w:rPr>
-        <w:t xml:space="preserve">. También se </w:t>
-      </w:r>
-      <w:r>
-        <w:rPr>
-          <w:i w:val="1"/>
-          <w:iCs w:val="1"/>
-          <w:lang w:val="en-US"/>
-        </w:rPr>
-        <w:t>puede</w:t>
-      </w:r>
-      <w:r>
-        <w:rPr>
-          <w:i w:val="1"/>
-          <w:iCs w:val="1"/>
-          <w:lang w:val="en-US"/>
-        </w:rPr>
-        <w:t xml:space="preserve"> </w:t>
-      </w:r>
-      <w:r>
-        <w:rPr>
-          <w:i w:val="1"/>
-          <w:iCs w:val="1"/>
-          <w:lang w:val="en-US"/>
-        </w:rPr>
-        <w:t>insertar</w:t>
-      </w:r>
-      <w:r>
-        <w:rPr>
-          <w:i w:val="1"/>
-          <w:iCs w:val="1"/>
-          <w:lang w:val="en-US"/>
-        </w:rPr>
-        <w:t xml:space="preserve"> </w:t>
-      </w:r>
-      <w:r>
-        <w:rPr>
-          <w:i w:val="1"/>
-          <w:iCs w:val="1"/>
-          <w:lang w:val="en-US"/>
-        </w:rPr>
-        <w:t>en</w:t>
-      </w:r>
-      <w:r>
-        <w:rPr>
-          <w:i w:val="1"/>
-          <w:iCs w:val="1"/>
-          <w:lang w:val="en-US"/>
-        </w:rPr>
-        <w:t xml:space="preserve"> un </w:t>
-      </w:r>
-      <w:r>
-        <w:rPr>
-          <w:i w:val="1"/>
-          <w:iCs w:val="1"/>
-          <w:lang w:val="en-US"/>
-        </w:rPr>
-        <w:t>proyecto</w:t>
-      </w:r>
-      <w:r>
-        <w:rPr>
-          <w:i w:val="1"/>
-          <w:iCs w:val="1"/>
-          <w:lang w:val="en-US"/>
-        </w:rPr>
-        <w:t xml:space="preserve"> de </w:t>
-      </w:r>
-      <w:r>
-        <w:rPr>
-          <w:i w:val="1"/>
-          <w:iCs w:val="1"/>
-          <w:lang w:val="en-US"/>
-        </w:rPr>
-        <w:t>código</w:t>
-      </w:r>
-      <w:r>
-        <w:rPr>
-          <w:i w:val="1"/>
-          <w:iCs w:val="1"/>
-          <w:lang w:val="en-US"/>
-        </w:rPr>
-        <w:t xml:space="preserve"> </w:t>
-      </w:r>
-      <w:r>
-        <w:rPr>
-          <w:i w:val="1"/>
-          <w:iCs w:val="1"/>
-          <w:lang w:val="en-US"/>
-        </w:rPr>
-        <w:t>cerrado</w:t>
-      </w:r>
-      <w:r>
-        <w:rPr>
-          <w:i w:val="1"/>
-          <w:iCs w:val="1"/>
-          <w:lang w:val="en-US"/>
-        </w:rPr>
-        <w:t xml:space="preserve"> </w:t>
-      </w:r>
-      <w:r>
-        <w:rPr>
-          <w:i w:val="1"/>
-          <w:iCs w:val="1"/>
-          <w:lang w:val="es-ES"/>
-        </w:rPr>
-        <w:t xml:space="preserve">(No tiene </w:t>
-      </w:r>
-      <w:bookmarkStart w:name="_Int_bjfWwamN" w:id="1539482335"/>
-      <w:r>
-        <w:rPr>
-          <w:i w:val="1"/>
-          <w:iCs w:val="1"/>
-          <w:lang w:val="es-ES"/>
-        </w:rPr>
-        <w:t>por qué</w:t>
-      </w:r>
-      <w:bookmarkEnd w:id="1539482335"/>
-      <w:r>
-        <w:rPr>
-          <w:i w:val="1"/>
-          <w:iCs w:val="1"/>
-          <w:lang w:val="es-ES"/>
-        </w:rPr>
-        <w:t xml:space="preserve"> afectar a todo el proyecto)</w:t>
-      </w:r>
-      <w:r>
-        <w:rPr>
-          <w:i w:val="1"/>
-          <w:iCs w:val="1"/>
-          <w:lang w:val="en-US"/>
-        </w:rPr>
-        <w:t>.</w:t>
-      </w:r>
-      <w:r>
-        <w:br/>
-      </w:r>
-      <w:r>
-        <w:rPr>
-          <w:b w:val="1"/>
-          <w:bCs w:val="1"/>
-          <w:i w:val="1"/>
-          <w:iCs w:val="1"/>
-          <w:lang w:val="en-US"/>
-        </w:rPr>
-        <w:t>EUPL</w:t>
-      </w:r>
-      <w:r>
-        <w:rPr>
-          <w:i w:val="1"/>
-          <w:iCs w:val="1"/>
-          <w:lang w:val="en-US"/>
-        </w:rPr>
-        <w:t xml:space="preserve"> :</w:t>
-      </w:r>
-      <w:r>
-        <w:rPr>
-          <w:i w:val="1"/>
-          <w:iCs w:val="1"/>
-          <w:lang w:val="en-US"/>
-        </w:rPr>
-        <w:t xml:space="preserve"> Esta es la </w:t>
-      </w:r>
-      <w:r>
-        <w:rPr>
-          <w:i w:val="1"/>
-          <w:iCs w:val="1"/>
-          <w:lang w:val="en-US"/>
-        </w:rPr>
-        <w:t>Licencia</w:t>
-      </w:r>
-      <w:r>
-        <w:rPr>
-          <w:i w:val="1"/>
-          <w:iCs w:val="1"/>
-          <w:lang w:val="en-US"/>
-        </w:rPr>
-        <w:t xml:space="preserve"> Pública de la Unión Europea.</w:t>
-      </w:r>
-      <w:r>
-        <w:rPr>
-          <w:i w:val="1"/>
-          <w:iCs w:val="1"/>
-          <w:lang w:val="en-US"/>
-        </w:rPr>
-        <w:t xml:space="preserve"> </w:t>
-      </w:r>
-      <w:r>
-        <w:rPr>
-          <w:i w:val="1"/>
-          <w:iCs w:val="1"/>
-          <w:lang w:val="en-US"/>
-        </w:rPr>
-        <w:t>Permite</w:t>
-      </w:r>
-      <w:r>
-        <w:rPr>
-          <w:i w:val="1"/>
-          <w:iCs w:val="1"/>
-          <w:lang w:val="en-US"/>
-        </w:rPr>
-        <w:t xml:space="preserve"> </w:t>
-      </w:r>
-      <w:r>
-        <w:rPr>
-          <w:i w:val="1"/>
-          <w:iCs w:val="1"/>
-          <w:lang w:val="en-US"/>
-        </w:rPr>
-        <w:t>utilizar</w:t>
-      </w:r>
-      <w:r>
-        <w:rPr>
-          <w:i w:val="1"/>
-          <w:iCs w:val="1"/>
-          <w:lang w:val="en-US"/>
-        </w:rPr>
-        <w:t xml:space="preserve"> </w:t>
-      </w:r>
-      <w:r>
-        <w:rPr>
-          <w:i w:val="1"/>
-          <w:iCs w:val="1"/>
-          <w:lang w:val="en-US"/>
-        </w:rPr>
-        <w:t>el</w:t>
-      </w:r>
-      <w:r>
-        <w:rPr>
-          <w:i w:val="1"/>
-          <w:iCs w:val="1"/>
-          <w:lang w:val="en-US"/>
-        </w:rPr>
-        <w:t xml:space="preserve"> software </w:t>
-      </w:r>
-      <w:r>
-        <w:rPr>
-          <w:i w:val="1"/>
-          <w:iCs w:val="1"/>
-          <w:lang w:val="es-ES"/>
-        </w:rPr>
-        <w:t>bajo unas condiciones mínimas</w:t>
-      </w:r>
-      <w:r>
-        <w:rPr>
-          <w:i w:val="1"/>
-          <w:iCs w:val="1"/>
-          <w:lang w:val="en-US"/>
-        </w:rPr>
-        <w:t xml:space="preserve">, </w:t>
-      </w:r>
-      <w:r>
-        <w:rPr>
-          <w:i w:val="1"/>
-          <w:iCs w:val="1"/>
-          <w:lang w:val="en-US"/>
-        </w:rPr>
-        <w:t>manteniendo</w:t>
-      </w:r>
-      <w:r>
-        <w:rPr>
-          <w:i w:val="1"/>
-          <w:iCs w:val="1"/>
-          <w:lang w:val="en-US"/>
-        </w:rPr>
-        <w:t xml:space="preserve"> </w:t>
-      </w:r>
-      <w:r>
-        <w:rPr>
-          <w:i w:val="1"/>
-          <w:iCs w:val="1"/>
-          <w:lang w:val="en-US"/>
-        </w:rPr>
-        <w:t>siempre</w:t>
-      </w:r>
-      <w:r>
-        <w:rPr>
-          <w:i w:val="1"/>
-          <w:iCs w:val="1"/>
-          <w:lang w:val="en-US"/>
-        </w:rPr>
-        <w:t xml:space="preserve"> la </w:t>
-      </w:r>
-      <w:r>
-        <w:rPr>
-          <w:i w:val="1"/>
-          <w:iCs w:val="1"/>
-          <w:lang w:val="en-US"/>
-        </w:rPr>
-        <w:t>licencia</w:t>
-      </w:r>
-      <w:r>
-        <w:rPr>
-          <w:i w:val="1"/>
-          <w:iCs w:val="1"/>
-          <w:lang w:val="en-US"/>
-        </w:rPr>
-        <w:t xml:space="preserve"> original. </w:t>
-      </w:r>
-      <w:r>
-        <w:rPr>
-          <w:i w:val="1"/>
-          <w:iCs w:val="1"/>
-          <w:lang w:val="en-US"/>
-        </w:rPr>
-        <w:t>Está</w:t>
-      </w:r>
-      <w:r>
-        <w:rPr>
-          <w:i w:val="1"/>
-          <w:iCs w:val="1"/>
-          <w:lang w:val="en-US"/>
-        </w:rPr>
-        <w:t xml:space="preserve"> </w:t>
-      </w:r>
-      <w:r>
-        <w:rPr>
-          <w:i w:val="1"/>
-          <w:iCs w:val="1"/>
-          <w:lang w:val="en-US"/>
-        </w:rPr>
-        <w:t>diseñada</w:t>
-      </w:r>
-      <w:r>
-        <w:rPr>
-          <w:i w:val="1"/>
-          <w:iCs w:val="1"/>
-          <w:lang w:val="en-US"/>
-        </w:rPr>
-        <w:t xml:space="preserve"> para ser compatible con las </w:t>
-      </w:r>
-      <w:r>
-        <w:rPr>
-          <w:i w:val="1"/>
-          <w:iCs w:val="1"/>
-          <w:lang w:val="en-US"/>
-        </w:rPr>
-        <w:t>leyes</w:t>
-      </w:r>
-      <w:r>
-        <w:rPr>
-          <w:i w:val="1"/>
-          <w:iCs w:val="1"/>
-          <w:lang w:val="en-US"/>
-        </w:rPr>
-        <w:t xml:space="preserve"> de </w:t>
-      </w:r>
-      <w:r>
-        <w:rPr>
-          <w:i w:val="1"/>
-          <w:iCs w:val="1"/>
-          <w:lang w:val="en-US"/>
-        </w:rPr>
-        <w:t>los</w:t>
-      </w:r>
-      <w:r>
-        <w:rPr>
-          <w:i w:val="1"/>
-          <w:iCs w:val="1"/>
-          <w:lang w:val="en-US"/>
-        </w:rPr>
-        <w:t xml:space="preserve"> </w:t>
-      </w:r>
-      <w:r>
-        <w:rPr>
-          <w:i w:val="1"/>
-          <w:iCs w:val="1"/>
-          <w:lang w:val="en-US"/>
-        </w:rPr>
-        <w:t>países</w:t>
-      </w:r>
-      <w:r>
-        <w:rPr>
-          <w:i w:val="1"/>
-          <w:iCs w:val="1"/>
-          <w:lang w:val="en-US"/>
-        </w:rPr>
-        <w:t xml:space="preserve"> </w:t>
-      </w:r>
-      <w:r>
-        <w:rPr>
-          <w:i w:val="1"/>
-          <w:iCs w:val="1"/>
-          <w:lang w:val="en-US"/>
-        </w:rPr>
-        <w:t>miembros</w:t>
-      </w:r>
-      <w:r>
-        <w:rPr>
-          <w:i w:val="1"/>
-          <w:iCs w:val="1"/>
-          <w:lang w:val="en-US"/>
-        </w:rPr>
-        <w:t xml:space="preserve"> de la Unión Europea.</w:t>
-      </w:r>
-      <w:r>
-        <w:rPr>
-          <w:i w:val="1"/>
-          <w:iCs w:val="1"/>
-          <w:lang w:val="en-US"/>
-        </w:rPr>
-        <w:t xml:space="preserve"> Compatible con otras licencias.</w:t>
-      </w:r>
-    </w:p>
-    <w:p>
-      <w:pPr>
-        <w:pStyle w:val="Normal"/>
-        <w:rPr>
-          <w:i w:val="1"/>
-          <w:iCs w:val="1"/>
-        </w:rPr>
-      </w:pPr>
-      <w:r>
-        <w:rPr>
-          <w:u w:val="single"/>
-        </w:rPr>
-        <w:t xml:space="preserve">Código </w:t>
-      </w:r>
-      <w:bookmarkStart w:name="_Int_hu64dXz0" w:id="2052037325"/>
-      <w:r>
-        <w:rPr>
-          <w:u w:val="single"/>
-        </w:rPr>
-        <w:t>abierto</w:t>
-      </w:r>
-      <w:r>
-        <w:rPr>
-          <w:u w:val="none"/>
-        </w:rPr>
-        <w:t xml:space="preserve"> </w:t>
-      </w:r>
-      <w:bookmarkStart w:name="_Int_2wOWNsbJ" w:id="1711188472"/>
-      <w:r>
-        <w:rPr/>
-        <w:t>:</w:t>
-      </w:r>
-      <w:bookmarkEnd w:id="1711188472"/>
-      <w:bookmarkEnd w:id="2052037325"/>
-      <w:r>
-        <w:rPr/>
-        <w:t xml:space="preserve"> </w:t>
-      </w:r>
-    </w:p>
-    <w:p>
-      <w:pPr>
-        <w:pStyle w:val="Normal"/>
-      </w:pPr>
-      <w:r>
-        <w:rPr>
-          <w:b w:val="1"/>
-          <w:bCs w:val="1"/>
-          <w:i w:val="1"/>
-          <w:iCs w:val="1"/>
-          <w:lang w:val="en-US"/>
-        </w:rPr>
-        <w:t xml:space="preserve">MIT </w:t>
-      </w:r>
-      <w:bookmarkStart w:name="_Int_TJnZtODn" w:id="814973230"/>
-      <w:r>
-        <w:rPr>
-          <w:b w:val="1"/>
-          <w:bCs w:val="1"/>
-          <w:i w:val="1"/>
-          <w:iCs w:val="1"/>
-          <w:lang w:val="en-US"/>
-        </w:rPr>
-        <w:t>License</w:t>
-      </w:r>
-      <w:r>
-        <w:rPr>
-          <w:i w:val="1"/>
-          <w:iCs w:val="1"/>
-          <w:lang w:val="en-US"/>
-        </w:rPr>
-        <w:t xml:space="preserve"> :</w:t>
-      </w:r>
-      <w:bookmarkEnd w:id="814973230"/>
-      <w:r>
-        <w:rPr>
-          <w:i w:val="1"/>
-          <w:iCs w:val="1"/>
-          <w:lang w:val="en-US"/>
-        </w:rPr>
-        <w:t xml:space="preserve"> El software </w:t>
-      </w:r>
-      <w:r>
-        <w:rPr>
-          <w:i w:val="1"/>
-          <w:iCs w:val="1"/>
-          <w:lang w:val="en-US"/>
-        </w:rPr>
-        <w:t>puede</w:t>
-      </w:r>
-      <w:r>
-        <w:rPr>
-          <w:i w:val="1"/>
-          <w:iCs w:val="1"/>
-          <w:lang w:val="en-US"/>
-        </w:rPr>
-        <w:t xml:space="preserve"> </w:t>
-      </w:r>
-      <w:r>
-        <w:rPr>
-          <w:i w:val="1"/>
-          <w:iCs w:val="1"/>
-          <w:lang w:val="en-US"/>
-        </w:rPr>
-        <w:t>usarse</w:t>
-      </w:r>
-      <w:r>
-        <w:rPr>
-          <w:i w:val="1"/>
-          <w:iCs w:val="1"/>
-          <w:lang w:val="en-US"/>
-        </w:rPr>
-        <w:t xml:space="preserve"> </w:t>
-      </w:r>
-      <w:r>
-        <w:rPr>
-          <w:i w:val="1"/>
-          <w:iCs w:val="1"/>
-          <w:lang w:val="es-ES"/>
-        </w:rPr>
-        <w:t>bajo unas condiciones mínimas</w:t>
-      </w:r>
-      <w:r>
-        <w:rPr>
-          <w:i w:val="1"/>
-          <w:iCs w:val="1"/>
-          <w:lang w:val="en-US"/>
-        </w:rPr>
-        <w:t xml:space="preserve">, </w:t>
-      </w:r>
-      <w:r>
-        <w:rPr>
-          <w:i w:val="1"/>
-          <w:iCs w:val="1"/>
-          <w:lang w:val="en-US"/>
-        </w:rPr>
-        <w:t>pero</w:t>
-      </w:r>
-      <w:r>
-        <w:rPr>
-          <w:i w:val="1"/>
-          <w:iCs w:val="1"/>
-          <w:lang w:val="en-US"/>
-        </w:rPr>
-        <w:t xml:space="preserve"> </w:t>
-      </w:r>
-      <w:r>
-        <w:rPr>
-          <w:i w:val="1"/>
-          <w:iCs w:val="1"/>
-          <w:lang w:val="en-US"/>
-        </w:rPr>
-        <w:t>manteniendo</w:t>
-      </w:r>
-      <w:r>
-        <w:rPr>
-          <w:i w:val="1"/>
-          <w:iCs w:val="1"/>
-          <w:lang w:val="en-US"/>
-        </w:rPr>
-        <w:t xml:space="preserve"> </w:t>
-      </w:r>
-      <w:r>
-        <w:rPr>
-          <w:i w:val="1"/>
-          <w:iCs w:val="1"/>
-          <w:lang w:val="en-US"/>
-        </w:rPr>
-        <w:t>siempre</w:t>
-      </w:r>
-      <w:r>
-        <w:rPr>
-          <w:i w:val="1"/>
-          <w:iCs w:val="1"/>
-          <w:lang w:val="en-US"/>
-        </w:rPr>
-        <w:t xml:space="preserve"> </w:t>
-      </w:r>
-      <w:r>
-        <w:rPr>
-          <w:i w:val="1"/>
-          <w:iCs w:val="1"/>
-          <w:lang w:val="en-US"/>
-        </w:rPr>
-        <w:t>el</w:t>
-      </w:r>
-      <w:r>
-        <w:rPr>
-          <w:i w:val="1"/>
-          <w:iCs w:val="1"/>
-          <w:lang w:val="en-US"/>
-        </w:rPr>
-        <w:t xml:space="preserve"> copyright y </w:t>
-      </w:r>
-      <w:r>
-        <w:rPr>
-          <w:i w:val="1"/>
-          <w:iCs w:val="1"/>
-          <w:lang w:val="en-US"/>
-        </w:rPr>
-        <w:t>el</w:t>
-      </w:r>
-      <w:r>
-        <w:rPr>
-          <w:i w:val="1"/>
-          <w:iCs w:val="1"/>
-          <w:lang w:val="en-US"/>
-        </w:rPr>
-        <w:t xml:space="preserve"> </w:t>
-      </w:r>
-      <w:r>
-        <w:rPr>
-          <w:i w:val="1"/>
-          <w:iCs w:val="1"/>
-          <w:lang w:val="en-US"/>
-        </w:rPr>
-        <w:t>texto</w:t>
-      </w:r>
-      <w:r>
-        <w:rPr>
-          <w:i w:val="1"/>
-          <w:iCs w:val="1"/>
-          <w:lang w:val="en-US"/>
-        </w:rPr>
-        <w:t xml:space="preserve"> de la </w:t>
-      </w:r>
-      <w:r>
-        <w:rPr>
-          <w:i w:val="1"/>
-          <w:iCs w:val="1"/>
-          <w:lang w:val="en-US"/>
-        </w:rPr>
-        <w:t>licencia</w:t>
-      </w:r>
-      <w:r>
-        <w:rPr>
-          <w:i w:val="1"/>
-          <w:iCs w:val="1"/>
-          <w:lang w:val="en-US"/>
-        </w:rPr>
-        <w:t>.</w:t>
-      </w:r>
-      <w:r>
-        <w:rPr>
-          <w:i w:val="1"/>
-          <w:iCs w:val="1"/>
-          <w:lang w:val="en-US"/>
-        </w:rPr>
-        <w:t xml:space="preserve"> La </w:t>
-      </w:r>
-      <w:r>
-        <w:rPr>
-          <w:i w:val="1"/>
-          <w:iCs w:val="1"/>
-          <w:lang w:val="en-US"/>
-        </w:rPr>
-        <w:t>licencia</w:t>
-      </w:r>
-      <w:r>
-        <w:rPr>
-          <w:i w:val="1"/>
-          <w:iCs w:val="1"/>
-          <w:lang w:val="en-US"/>
-        </w:rPr>
-        <w:t xml:space="preserve"> es </w:t>
-      </w:r>
-      <w:r>
-        <w:rPr>
-          <w:i w:val="1"/>
-          <w:iCs w:val="1"/>
-          <w:lang w:val="en-US"/>
-        </w:rPr>
-        <w:t>más</w:t>
-      </w:r>
-      <w:r>
-        <w:rPr>
-          <w:i w:val="1"/>
-          <w:iCs w:val="1"/>
-          <w:lang w:val="en-US"/>
-        </w:rPr>
-        <w:t xml:space="preserve"> simple </w:t>
-      </w:r>
-      <w:r>
-        <w:rPr>
-          <w:i w:val="1"/>
-          <w:iCs w:val="1"/>
-          <w:lang w:val="en-US"/>
-        </w:rPr>
-        <w:t>que</w:t>
-      </w:r>
-      <w:r>
-        <w:rPr>
-          <w:i w:val="1"/>
-          <w:iCs w:val="1"/>
-          <w:lang w:val="en-US"/>
-        </w:rPr>
-        <w:t xml:space="preserve"> la Apache 2.0.</w:t>
-      </w:r>
-      <w:r>
-        <w:br/>
-      </w:r>
-      <w:r>
-        <w:rPr>
-          <w:b w:val="1"/>
-          <w:bCs w:val="1"/>
-          <w:i w:val="1"/>
-          <w:iCs w:val="1"/>
-          <w:lang w:val="en-US"/>
-        </w:rPr>
-        <w:t xml:space="preserve">Apache </w:t>
-      </w:r>
-      <w:r>
-        <w:rPr>
-          <w:b w:val="1"/>
-          <w:bCs w:val="1"/>
-          <w:i w:val="1"/>
-          <w:iCs w:val="1"/>
-          <w:lang w:val="en-US"/>
-        </w:rPr>
-        <w:t>License</w:t>
-      </w:r>
-      <w:r>
-        <w:rPr>
-          <w:b w:val="1"/>
-          <w:bCs w:val="1"/>
-          <w:i w:val="1"/>
-          <w:iCs w:val="1"/>
-          <w:lang w:val="en-US"/>
-        </w:rPr>
-        <w:t xml:space="preserve"> v. </w:t>
-      </w:r>
-      <w:bookmarkStart w:name="_Int_pFmKXfSS" w:id="422401100"/>
-      <w:r>
-        <w:rPr>
-          <w:b w:val="1"/>
-          <w:bCs w:val="1"/>
-          <w:i w:val="1"/>
-          <w:iCs w:val="1"/>
-          <w:lang w:val="en-US"/>
-        </w:rPr>
-        <w:t>1.1.</w:t>
-      </w:r>
-      <w:r>
-        <w:rPr>
-          <w:i w:val="1"/>
-          <w:iCs w:val="1"/>
-          <w:lang w:val="en-US"/>
-        </w:rPr>
-        <w:t xml:space="preserve"> :</w:t>
-      </w:r>
-      <w:bookmarkEnd w:id="422401100"/>
-      <w:r>
-        <w:rPr>
-          <w:i w:val="1"/>
-          <w:iCs w:val="1"/>
-          <w:lang w:val="en-US"/>
-        </w:rPr>
-        <w:t xml:space="preserve"> </w:t>
-      </w:r>
-      <w:r>
-        <w:rPr>
-          <w:i w:val="1"/>
-          <w:iCs w:val="1"/>
-          <w:lang w:val="en-US"/>
-        </w:rPr>
-        <w:t xml:space="preserve">El software </w:t>
-      </w:r>
-      <w:r>
-        <w:rPr>
-          <w:i w:val="1"/>
-          <w:iCs w:val="1"/>
-          <w:lang w:val="en-US"/>
-        </w:rPr>
-        <w:t>puede</w:t>
-      </w:r>
-      <w:r>
-        <w:rPr>
-          <w:i w:val="1"/>
-          <w:iCs w:val="1"/>
-          <w:lang w:val="en-US"/>
-        </w:rPr>
-        <w:t xml:space="preserve"> </w:t>
-      </w:r>
-      <w:r>
-        <w:rPr>
-          <w:i w:val="1"/>
-          <w:iCs w:val="1"/>
-          <w:lang w:val="en-US"/>
-        </w:rPr>
-        <w:t>usarse</w:t>
-      </w:r>
-      <w:r>
-        <w:rPr>
-          <w:i w:val="1"/>
-          <w:iCs w:val="1"/>
-          <w:lang w:val="en-US"/>
-        </w:rPr>
-        <w:t xml:space="preserve"> </w:t>
-      </w:r>
-      <w:r>
-        <w:rPr>
-          <w:i w:val="1"/>
-          <w:iCs w:val="1"/>
-          <w:lang w:val="es-ES"/>
-        </w:rPr>
-        <w:t>bajo unas condiciones mínimas</w:t>
-      </w:r>
-      <w:r>
-        <w:rPr>
-          <w:i w:val="1"/>
-          <w:iCs w:val="1"/>
-          <w:lang w:val="en-US"/>
-        </w:rPr>
-        <w:t xml:space="preserve">, </w:t>
-      </w:r>
-      <w:r>
-        <w:rPr>
-          <w:i w:val="1"/>
-          <w:iCs w:val="1"/>
-          <w:lang w:val="en-US"/>
-        </w:rPr>
-        <w:t>pero</w:t>
-      </w:r>
-      <w:r>
-        <w:rPr>
-          <w:i w:val="1"/>
-          <w:iCs w:val="1"/>
-          <w:lang w:val="en-US"/>
-        </w:rPr>
-        <w:t xml:space="preserve"> </w:t>
-      </w:r>
-      <w:r>
-        <w:rPr>
-          <w:i w:val="1"/>
-          <w:iCs w:val="1"/>
-          <w:lang w:val="en-US"/>
-        </w:rPr>
-        <w:t>manteniendo</w:t>
-      </w:r>
-      <w:r>
-        <w:rPr>
-          <w:i w:val="1"/>
-          <w:iCs w:val="1"/>
-          <w:lang w:val="en-US"/>
-        </w:rPr>
-        <w:t xml:space="preserve"> </w:t>
-      </w:r>
-      <w:r>
-        <w:rPr>
-          <w:i w:val="1"/>
-          <w:iCs w:val="1"/>
-          <w:lang w:val="en-US"/>
-        </w:rPr>
-        <w:t>el</w:t>
-      </w:r>
-      <w:r>
-        <w:rPr>
-          <w:i w:val="1"/>
-          <w:iCs w:val="1"/>
-          <w:lang w:val="en-US"/>
-        </w:rPr>
-        <w:t xml:space="preserve"> copyright y </w:t>
-      </w:r>
-      <w:r>
-        <w:rPr>
-          <w:i w:val="1"/>
-          <w:iCs w:val="1"/>
-          <w:lang w:val="en-US"/>
-        </w:rPr>
-        <w:t>el</w:t>
-      </w:r>
-      <w:r>
-        <w:rPr>
-          <w:i w:val="1"/>
-          <w:iCs w:val="1"/>
-          <w:lang w:val="en-US"/>
-        </w:rPr>
-        <w:t xml:space="preserve"> </w:t>
-      </w:r>
-      <w:r>
-        <w:rPr>
-          <w:i w:val="1"/>
-          <w:iCs w:val="1"/>
-          <w:lang w:val="en-US"/>
-        </w:rPr>
-        <w:t>descargo</w:t>
-      </w:r>
-      <w:r>
-        <w:rPr>
-          <w:i w:val="1"/>
-          <w:iCs w:val="1"/>
-          <w:lang w:val="en-US"/>
-        </w:rPr>
-        <w:t xml:space="preserve"> de </w:t>
-      </w:r>
-      <w:r>
-        <w:rPr>
-          <w:i w:val="1"/>
-          <w:iCs w:val="1"/>
-          <w:lang w:val="en-US"/>
-        </w:rPr>
-        <w:t>responsabilidad</w:t>
-      </w:r>
-      <w:r>
-        <w:rPr>
-          <w:i w:val="1"/>
-          <w:iCs w:val="1"/>
-          <w:lang w:val="en-US"/>
-        </w:rPr>
-        <w:t>.</w:t>
-      </w:r>
-    </w:p>
-    <w:p>
-      <w:pPr>
-        <w:pStyle w:val="Normal"/>
-        <w:rPr>
-          <w:i w:val="1"/>
-          <w:iCs w:val="1"/>
-        </w:rPr>
-      </w:pPr>
-      <w:r>
-        <w:rPr>
-          <w:u w:val="single"/>
-        </w:rPr>
-        <w:t xml:space="preserve">Dominio </w:t>
-      </w:r>
-      <w:bookmarkStart w:name="_Int_WeaA8FST" w:id="1430791908"/>
-      <w:r>
-        <w:rPr>
-          <w:u w:val="single"/>
-        </w:rPr>
-        <w:t>público</w:t>
-      </w:r>
-      <w:r>
-        <w:rPr/>
-        <w:t xml:space="preserve"> :</w:t>
-      </w:r>
-      <w:bookmarkEnd w:id="1430791908"/>
-      <w:r>
-        <w:rPr/>
-        <w:t xml:space="preserve"> </w:t>
-      </w:r>
-    </w:p>
-    <w:p>
-      <w:pPr>
-        <w:pStyle w:val="Normal"/>
-        <w:rPr>
-          <w:lang w:val="es-ES"/>
-        </w:rPr>
-      </w:pPr>
-      <w:r>
-        <w:rPr>
-          <w:b w:val="1"/>
-          <w:bCs w:val="1"/>
-          <w:i w:val="1"/>
-          <w:iCs w:val="1"/>
-          <w:lang w:val="es-ES"/>
-        </w:rPr>
-        <w:t>CC</w:t>
-      </w:r>
-      <w:bookmarkStart w:name="_Int_evyyiED0" w:id="471761478"/>
-      <w:r>
-        <w:rPr>
-          <w:b w:val="1"/>
-          <w:bCs w:val="1"/>
-          <w:i w:val="1"/>
-          <w:iCs w:val="1"/>
-          <w:lang w:val="es-ES"/>
-        </w:rPr>
-        <w:t xml:space="preserve">0 </w:t>
-      </w:r>
-      <w:r>
-        <w:rPr>
-          <w:i w:val="1"/>
-          <w:iCs w:val="1"/>
-          <w:lang w:val="es-ES"/>
-        </w:rPr>
-        <w:t>:</w:t>
-      </w:r>
-      <w:bookmarkEnd w:id="471761478"/>
-      <w:r>
-        <w:rPr>
-          <w:i w:val="1"/>
-          <w:iCs w:val="1"/>
-          <w:lang w:val="es-ES"/>
-        </w:rPr>
-        <w:t xml:space="preserve"> Creative Commons Zero. Sin restricción, atribución, o garantías.</w:t>
-      </w:r>
-      <w:r>
-        <w:br/>
-      </w:r>
-      <w:r>
-        <w:br/>
-      </w:r>
-    </w:p>
-    <w:p>
-      <w:pPr>
-        <w:pStyle w:val="Normal"/>
-        <w:rPr>
-          <w:lang w:val="en-US"/>
-        </w:rPr>
-      </w:pPr>
-      <w:r>
-        <w:br/>
-      </w:r>
-    </w:p>
-    <w:p>
-      <w:pPr>
-        <w:pStyle w:val="Normal"/>
-      </w:pPr>
-    </w:p>
-    <w:p>
-      <w:pPr>
-        <w:pStyle w:val="Normal"/>
-      </w:pPr>
-      <w:r>
-        <w:br/>
-      </w:r>
-    </w:p>
-    <w:p>
-      <w:pPr>
-        <w:pStyle w:val="Normal"/>
-      </w:pPr>
-    </w:p>
-    <w:p>
-      <w:pPr>
-        <w:pStyle w:val="Heading2"/>
-      </w:pPr>
-      <w:bookmarkStart w:name="_Toc399201739" w:id="1380771996"/>
-      <w:r>
-        <w:rPr/>
-        <w:t>Comparación entre licencias</w:t>
-      </w:r>
-      <w:bookmarkEnd w:id="1380771996"/>
+        </w:rPr>
+        <w:t>La licencia es de pago, pero caduca y se tiene que renovar a través de una suscripción.</w:t>
+      </w:r>
     </w:p>
     <w:p>
       <w:pPr>
@@ -2266,30 +844,248 @@
         <w:ind w:left="0" w:right="0"/>
         <w:jc w:val="left"/>
         <w:rPr>
+          <w:i w:val="1"/>
+          <w:iCs w:val="1"/>
+          <w:lang w:val="en-US"/>
+        </w:rPr>
+      </w:pPr>
+      <w:r>
+        <w:rPr>
+          <w:u w:val="single"/>
+          <w:lang w:val="en-US"/>
+        </w:rPr>
+        <w:t>C</w:t>
+      </w:r>
+      <w:r>
+        <w:rPr>
+          <w:u w:val="single"/>
+          <w:lang w:val="en-US"/>
+        </w:rPr>
+        <w:t>opyleft fuerte</w:t>
+      </w:r>
+      <w:r>
+        <w:rPr>
+          <w:lang w:val="en-US"/>
+        </w:rPr>
+        <w:t xml:space="preserve"> :</w:t>
+      </w:r>
+      <w:r>
+        <w:rPr>
+          <w:lang w:val="en-US"/>
+        </w:rPr>
+        <w:t xml:space="preserve">  </w:t>
+      </w:r>
+    </w:p>
+    <w:p>
+      <w:pPr>
+        <w:pStyle w:val="Normal"/>
+      </w:pPr>
+      <w:r>
+        <w:rPr>
           <w:b w:val="1"/>
           <w:bCs w:val="1"/>
-        </w:rPr>
-      </w:pPr>
+          <w:i w:val="1"/>
+          <w:iCs w:val="1"/>
+          <w:lang w:val="es-ES"/>
+        </w:rPr>
+        <w:t xml:space="preserve">GNU General Public </w:t>
+      </w:r>
       <w:r>
         <w:rPr>
           <w:b w:val="1"/>
           <w:bCs w:val="1"/>
-        </w:rPr>
-        <w:t xml:space="preserve">GNU General Public </w:t>
+          <w:i w:val="1"/>
+          <w:iCs w:val="1"/>
+          <w:lang w:val="es-ES"/>
+        </w:rPr>
+        <w:t>License</w:t>
       </w:r>
       <w:r>
         <w:rPr>
           <w:b w:val="1"/>
           <w:bCs w:val="1"/>
-        </w:rPr>
-        <w:t>License</w:t>
-      </w:r>
+          <w:i w:val="1"/>
+          <w:iCs w:val="1"/>
+          <w:lang w:val="es-ES"/>
+        </w:rPr>
+        <w:t xml:space="preserve"> v. </w:t>
+      </w:r>
+      <w:bookmarkStart w:name="_Int_LTK0zGtF" w:id="1825119616"/>
       <w:r>
         <w:rPr>
           <w:b w:val="1"/>
           <w:bCs w:val="1"/>
-        </w:rPr>
-        <w:t xml:space="preserve"> v. 3.0 / Apache v. 2.0 / MIT</w:t>
+          <w:i w:val="1"/>
+          <w:iCs w:val="1"/>
+          <w:lang w:val="es-ES"/>
+        </w:rPr>
+        <w:t>3</w:t>
+      </w:r>
+      <w:bookmarkStart w:name="_Int_QcWw9Dl5" w:id="492922352"/>
+      <w:r>
+        <w:rPr>
+          <w:b w:val="1"/>
+          <w:bCs w:val="1"/>
+          <w:i w:val="1"/>
+          <w:iCs w:val="1"/>
+          <w:lang w:val="es-ES"/>
+        </w:rPr>
+        <w:t>.0.</w:t>
+      </w:r>
+      <w:r>
+        <w:rPr>
+          <w:i w:val="1"/>
+          <w:iCs w:val="1"/>
+          <w:lang w:val="es-ES"/>
+        </w:rPr>
+        <w:t xml:space="preserve"> :</w:t>
+      </w:r>
+      <w:bookmarkEnd w:id="492922352"/>
+      <w:bookmarkEnd w:id="1825119616"/>
+      <w:r>
+        <w:rPr>
+          <w:i w:val="1"/>
+          <w:iCs w:val="1"/>
+          <w:lang w:val="es-ES"/>
+        </w:rPr>
+        <w:t xml:space="preserve"> </w:t>
+      </w:r>
+      <w:r>
+        <w:rPr>
+          <w:i w:val="1"/>
+          <w:iCs w:val="1"/>
+          <w:lang w:val="es-ES"/>
+        </w:rPr>
+        <w:t xml:space="preserve">El software puede usarse </w:t>
+      </w:r>
+      <w:r>
+        <w:rPr>
+          <w:i w:val="1"/>
+          <w:iCs w:val="1"/>
+          <w:lang w:val="es-ES"/>
+        </w:rPr>
+        <w:t>bajo unas condiciones mínimas</w:t>
+      </w:r>
+      <w:r>
+        <w:rPr>
+          <w:i w:val="1"/>
+          <w:iCs w:val="1"/>
+          <w:lang w:val="es-ES"/>
+        </w:rPr>
+        <w:t>, pero cualquier derivado debe mantener las mismas libertades.</w:t>
+      </w:r>
+      <w:r>
+        <w:br/>
+      </w:r>
+      <w:r>
+        <w:rPr>
+          <w:b w:val="1"/>
+          <w:bCs w:val="1"/>
+          <w:i w:val="1"/>
+          <w:iCs w:val="1"/>
+          <w:lang w:val="es-ES"/>
+        </w:rPr>
+        <w:t xml:space="preserve">Eclipse Public </w:t>
+      </w:r>
+      <w:r>
+        <w:rPr>
+          <w:b w:val="1"/>
+          <w:bCs w:val="1"/>
+          <w:i w:val="1"/>
+          <w:iCs w:val="1"/>
+          <w:lang w:val="es-ES"/>
+        </w:rPr>
+        <w:t>License</w:t>
+      </w:r>
+      <w:r>
+        <w:rPr>
+          <w:i w:val="1"/>
+          <w:iCs w:val="1"/>
+          <w:lang w:val="es-ES"/>
+        </w:rPr>
+        <w:t xml:space="preserve"> :</w:t>
+      </w:r>
+      <w:r>
+        <w:rPr>
+          <w:i w:val="1"/>
+          <w:iCs w:val="1"/>
+          <w:lang w:val="es-ES"/>
+        </w:rPr>
+        <w:t xml:space="preserve"> </w:t>
+      </w:r>
+      <w:r>
+        <w:rPr>
+          <w:i w:val="1"/>
+          <w:iCs w:val="1"/>
+          <w:lang w:val="es-ES"/>
+        </w:rPr>
+        <w:t xml:space="preserve">El software puede usarse </w:t>
+      </w:r>
+      <w:r>
+        <w:rPr>
+          <w:i w:val="1"/>
+          <w:iCs w:val="1"/>
+          <w:lang w:val="es-ES"/>
+        </w:rPr>
+        <w:t>bajo unas condiciones mínimas</w:t>
+      </w:r>
+      <w:r>
+        <w:rPr>
+          <w:i w:val="1"/>
+          <w:iCs w:val="1"/>
+          <w:lang w:val="es-ES"/>
+        </w:rPr>
+        <w:t>, pero</w:t>
+      </w:r>
+      <w:r>
+        <w:rPr>
+          <w:i w:val="1"/>
+          <w:iCs w:val="1"/>
+          <w:lang w:val="es-ES"/>
+        </w:rPr>
+        <w:t xml:space="preserve"> un derivado puede combinar partes de código abierto con partes de código cerrado</w:t>
+      </w:r>
+      <w:r>
+        <w:rPr>
+          <w:i w:val="1"/>
+          <w:iCs w:val="1"/>
+          <w:lang w:val="es-ES"/>
+        </w:rPr>
+        <w:t xml:space="preserve"> (No tiene </w:t>
+      </w:r>
+      <w:bookmarkStart w:name="_Int_mo6XNs1U" w:id="1743440449"/>
+      <w:r>
+        <w:rPr>
+          <w:i w:val="1"/>
+          <w:iCs w:val="1"/>
+          <w:lang w:val="es-ES"/>
+        </w:rPr>
+        <w:t>por qu</w:t>
+      </w:r>
+      <w:r>
+        <w:rPr>
+          <w:i w:val="1"/>
+          <w:iCs w:val="1"/>
+          <w:lang w:val="es-ES"/>
+        </w:rPr>
+        <w:t>é</w:t>
+      </w:r>
+      <w:bookmarkEnd w:id="1743440449"/>
+      <w:r>
+        <w:rPr>
+          <w:i w:val="1"/>
+          <w:iCs w:val="1"/>
+          <w:lang w:val="es-ES"/>
+        </w:rPr>
+        <w:t xml:space="preserve"> afectar a todo el proyecto)</w:t>
+      </w:r>
+      <w:r>
+        <w:rPr>
+          <w:i w:val="1"/>
+          <w:iCs w:val="1"/>
+          <w:lang w:val="es-ES"/>
+        </w:rPr>
+        <w:t>.</w:t>
       </w:r>
     </w:p>
     <w:p>
@@ -2300,31 +1096,1216 @@
         <w:spacing w:before="0" w:beforeAutospacing="off" w:after="160" w:afterAutospacing="off" w:line="279" w:lineRule="auto"/>
         <w:ind w:left="0" w:right="0"/>
         <w:jc w:val="left"/>
-        <w:rPr>
-          <w:b w:val="0"/>
-          <w:bCs w:val="0"/>
-          <w:i w:val="1"/>
-          <w:iCs w:val="1"/>
-        </w:rPr>
-      </w:pPr>
-      <w:r>
-        <w:rPr>
-          <w:b w:val="0"/>
-          <w:bCs w:val="0"/>
-          <w:i w:val="1"/>
-          <w:iCs w:val="1"/>
-        </w:rPr>
-        <w:t>Un software bajo la licencia GNU GPL 3.0 puede ejecutarse, modificarse</w:t>
-      </w:r>
-      <w:r>
-        <w:rPr>
-          <w:b w:val="0"/>
-          <w:bCs w:val="0"/>
-          <w:i w:val="1"/>
-          <w:iCs w:val="1"/>
-        </w:rPr>
-        <w:t xml:space="preserve"> y compartirse, pero siempre bajo la misma licencia. Si se inserta dentro de un proyecto mayor, este proyecto también tiene que utilizar la misma licencia.</w:t>
-      </w:r>
+      </w:pPr>
+      <w:r>
+        <w:rPr>
+          <w:u w:val="single"/>
+        </w:rPr>
+        <w:t xml:space="preserve">Copyleft </w:t>
+      </w:r>
+      <w:bookmarkStart w:name="_Int_geqKrWBl" w:id="262962573"/>
+      <w:r>
+        <w:rPr>
+          <w:u w:val="single"/>
+        </w:rPr>
+        <w:t>débil</w:t>
+      </w:r>
+      <w:bookmarkStart w:name="_Int_pXWCEQrJ" w:id="902082552"/>
+      <w:r>
+        <w:rPr/>
+        <w:t xml:space="preserve"> :</w:t>
+      </w:r>
+      <w:bookmarkEnd w:id="902082552"/>
+      <w:bookmarkEnd w:id="262962573"/>
+      <w:r>
+        <w:rPr/>
+        <w:t xml:space="preserve"> </w:t>
+      </w:r>
+    </w:p>
+    <w:p>
+      <w:pPr>
+        <w:pStyle w:val="Normal"/>
+      </w:pPr>
+      <w:r>
+        <w:rPr>
+          <w:b w:val="1"/>
+          <w:bCs w:val="1"/>
+          <w:i w:val="1"/>
+          <w:iCs w:val="1"/>
+          <w:lang w:val="es-ES"/>
+        </w:rPr>
+        <w:t xml:space="preserve">Apache </w:t>
+      </w:r>
+      <w:r>
+        <w:rPr>
+          <w:b w:val="1"/>
+          <w:bCs w:val="1"/>
+          <w:i w:val="1"/>
+          <w:iCs w:val="1"/>
+          <w:lang w:val="es-ES"/>
+        </w:rPr>
+        <w:t>License</w:t>
+      </w:r>
+      <w:r>
+        <w:rPr>
+          <w:b w:val="1"/>
+          <w:bCs w:val="1"/>
+          <w:i w:val="1"/>
+          <w:iCs w:val="1"/>
+          <w:lang w:val="es-ES"/>
+        </w:rPr>
+        <w:t xml:space="preserve"> v </w:t>
+      </w:r>
+      <w:bookmarkStart w:name="_Int_U7HCu94M" w:id="191233352"/>
+      <w:r>
+        <w:rPr>
+          <w:b w:val="1"/>
+          <w:bCs w:val="1"/>
+          <w:i w:val="1"/>
+          <w:iCs w:val="1"/>
+          <w:lang w:val="es-ES"/>
+        </w:rPr>
+        <w:t>2.0.</w:t>
+      </w:r>
+      <w:r>
+        <w:rPr>
+          <w:i w:val="1"/>
+          <w:iCs w:val="1"/>
+          <w:lang w:val="es-ES"/>
+        </w:rPr>
+        <w:t xml:space="preserve"> :</w:t>
+      </w:r>
+      <w:bookmarkEnd w:id="191233352"/>
+      <w:r>
+        <w:rPr>
+          <w:i w:val="1"/>
+          <w:iCs w:val="1"/>
+          <w:lang w:val="es-ES"/>
+        </w:rPr>
+        <w:t xml:space="preserve"> El software puede usarse bajo unas condiciones mínimas, pero siempre manteniendo los avisos de los derechos de autor y el texto de la licencia. La licencia es muy detallada y da más seguridad jurídica.</w:t>
+      </w:r>
+      <w:r>
+        <w:br/>
+      </w:r>
+      <w:r>
+        <w:rPr>
+          <w:b w:val="1"/>
+          <w:bCs w:val="1"/>
+          <w:i w:val="1"/>
+          <w:iCs w:val="1"/>
+          <w:lang w:val="en-US"/>
+        </w:rPr>
+        <w:t xml:space="preserve">Mozilla Public </w:t>
+      </w:r>
+      <w:bookmarkStart w:name="_Int_iHhWgWn9" w:id="771899124"/>
+      <w:r>
+        <w:rPr>
+          <w:b w:val="1"/>
+          <w:bCs w:val="1"/>
+          <w:i w:val="1"/>
+          <w:iCs w:val="1"/>
+          <w:lang w:val="en-US"/>
+        </w:rPr>
+        <w:t>License</w:t>
+      </w:r>
+      <w:r>
+        <w:rPr>
+          <w:i w:val="1"/>
+          <w:iCs w:val="1"/>
+          <w:lang w:val="en-US"/>
+        </w:rPr>
+        <w:t xml:space="preserve"> :</w:t>
+      </w:r>
+      <w:bookmarkEnd w:id="771899124"/>
+      <w:r>
+        <w:rPr>
+          <w:i w:val="1"/>
+          <w:iCs w:val="1"/>
+          <w:lang w:val="en-US"/>
+        </w:rPr>
+        <w:t xml:space="preserve"> </w:t>
+      </w:r>
+      <w:r>
+        <w:rPr>
+          <w:i w:val="1"/>
+          <w:iCs w:val="1"/>
+          <w:lang w:val="en-US"/>
+        </w:rPr>
+        <w:t xml:space="preserve">El software </w:t>
+      </w:r>
+      <w:r>
+        <w:rPr>
+          <w:i w:val="1"/>
+          <w:iCs w:val="1"/>
+          <w:lang w:val="en-US"/>
+        </w:rPr>
+        <w:t>puede</w:t>
+      </w:r>
+      <w:r>
+        <w:rPr>
+          <w:i w:val="1"/>
+          <w:iCs w:val="1"/>
+          <w:lang w:val="en-US"/>
+        </w:rPr>
+        <w:t xml:space="preserve"> </w:t>
+      </w:r>
+      <w:r>
+        <w:rPr>
+          <w:i w:val="1"/>
+          <w:iCs w:val="1"/>
+          <w:lang w:val="en-US"/>
+        </w:rPr>
+        <w:t>usarse</w:t>
+      </w:r>
+      <w:r>
+        <w:rPr>
+          <w:i w:val="1"/>
+          <w:iCs w:val="1"/>
+          <w:lang w:val="es-ES"/>
+        </w:rPr>
+        <w:t xml:space="preserve"> bajo unas condiciones mínimas</w:t>
+      </w:r>
+      <w:r>
+        <w:rPr>
+          <w:i w:val="1"/>
+          <w:iCs w:val="1"/>
+          <w:lang w:val="en-US"/>
+        </w:rPr>
+        <w:t xml:space="preserve">. También se </w:t>
+      </w:r>
+      <w:r>
+        <w:rPr>
+          <w:i w:val="1"/>
+          <w:iCs w:val="1"/>
+          <w:lang w:val="en-US"/>
+        </w:rPr>
+        <w:t>puede</w:t>
+      </w:r>
+      <w:r>
+        <w:rPr>
+          <w:i w:val="1"/>
+          <w:iCs w:val="1"/>
+          <w:lang w:val="en-US"/>
+        </w:rPr>
+        <w:t xml:space="preserve"> </w:t>
+      </w:r>
+      <w:r>
+        <w:rPr>
+          <w:i w:val="1"/>
+          <w:iCs w:val="1"/>
+          <w:lang w:val="en-US"/>
+        </w:rPr>
+        <w:t>insertar</w:t>
+      </w:r>
+      <w:r>
+        <w:rPr>
+          <w:i w:val="1"/>
+          <w:iCs w:val="1"/>
+          <w:lang w:val="en-US"/>
+        </w:rPr>
+        <w:t xml:space="preserve"> </w:t>
+      </w:r>
+      <w:r>
+        <w:rPr>
+          <w:i w:val="1"/>
+          <w:iCs w:val="1"/>
+          <w:lang w:val="en-US"/>
+        </w:rPr>
+        <w:t>en</w:t>
+      </w:r>
+      <w:r>
+        <w:rPr>
+          <w:i w:val="1"/>
+          <w:iCs w:val="1"/>
+          <w:lang w:val="en-US"/>
+        </w:rPr>
+        <w:t xml:space="preserve"> un </w:t>
+      </w:r>
+      <w:r>
+        <w:rPr>
+          <w:i w:val="1"/>
+          <w:iCs w:val="1"/>
+          <w:lang w:val="en-US"/>
+        </w:rPr>
+        <w:t>proyecto</w:t>
+      </w:r>
+      <w:r>
+        <w:rPr>
+          <w:i w:val="1"/>
+          <w:iCs w:val="1"/>
+          <w:lang w:val="en-US"/>
+        </w:rPr>
+        <w:t xml:space="preserve"> de </w:t>
+      </w:r>
+      <w:r>
+        <w:rPr>
+          <w:i w:val="1"/>
+          <w:iCs w:val="1"/>
+          <w:lang w:val="en-US"/>
+        </w:rPr>
+        <w:t>código</w:t>
+      </w:r>
+      <w:r>
+        <w:rPr>
+          <w:i w:val="1"/>
+          <w:iCs w:val="1"/>
+          <w:lang w:val="en-US"/>
+        </w:rPr>
+        <w:t xml:space="preserve"> </w:t>
+      </w:r>
+      <w:r>
+        <w:rPr>
+          <w:i w:val="1"/>
+          <w:iCs w:val="1"/>
+          <w:lang w:val="en-US"/>
+        </w:rPr>
+        <w:t>cerrado</w:t>
+      </w:r>
+      <w:r>
+        <w:rPr>
+          <w:i w:val="1"/>
+          <w:iCs w:val="1"/>
+          <w:lang w:val="en-US"/>
+        </w:rPr>
+        <w:t xml:space="preserve"> </w:t>
+      </w:r>
+      <w:r>
+        <w:rPr>
+          <w:i w:val="1"/>
+          <w:iCs w:val="1"/>
+          <w:lang w:val="es-ES"/>
+        </w:rPr>
+        <w:t xml:space="preserve">(No tiene </w:t>
+      </w:r>
+      <w:bookmarkStart w:name="_Int_bjfWwamN" w:id="1539482335"/>
+      <w:r>
+        <w:rPr>
+          <w:i w:val="1"/>
+          <w:iCs w:val="1"/>
+          <w:lang w:val="es-ES"/>
+        </w:rPr>
+        <w:t>por qué</w:t>
+      </w:r>
+      <w:bookmarkEnd w:id="1539482335"/>
+      <w:r>
+        <w:rPr>
+          <w:i w:val="1"/>
+          <w:iCs w:val="1"/>
+          <w:lang w:val="es-ES"/>
+        </w:rPr>
+        <w:t xml:space="preserve"> afectar a todo el proyecto)</w:t>
+      </w:r>
+      <w:r>
+        <w:rPr>
+          <w:i w:val="1"/>
+          <w:iCs w:val="1"/>
+          <w:lang w:val="en-US"/>
+        </w:rPr>
+        <w:t>.</w:t>
+      </w:r>
+      <w:r>
+        <w:br/>
+      </w:r>
+      <w:r>
+        <w:rPr>
+          <w:b w:val="1"/>
+          <w:bCs w:val="1"/>
+          <w:i w:val="1"/>
+          <w:iCs w:val="1"/>
+          <w:lang w:val="en-US"/>
+        </w:rPr>
+        <w:t>EUPL</w:t>
+      </w:r>
+      <w:r>
+        <w:rPr>
+          <w:i w:val="1"/>
+          <w:iCs w:val="1"/>
+          <w:lang w:val="en-US"/>
+        </w:rPr>
+        <w:t xml:space="preserve"> :</w:t>
+      </w:r>
+      <w:r>
+        <w:rPr>
+          <w:i w:val="1"/>
+          <w:iCs w:val="1"/>
+          <w:lang w:val="en-US"/>
+        </w:rPr>
+        <w:t xml:space="preserve"> Esta es la </w:t>
+      </w:r>
+      <w:r>
+        <w:rPr>
+          <w:i w:val="1"/>
+          <w:iCs w:val="1"/>
+          <w:lang w:val="en-US"/>
+        </w:rPr>
+        <w:t>Licencia</w:t>
+      </w:r>
+      <w:r>
+        <w:rPr>
+          <w:i w:val="1"/>
+          <w:iCs w:val="1"/>
+          <w:lang w:val="en-US"/>
+        </w:rPr>
+        <w:t xml:space="preserve"> Pública de la Unión Europea.</w:t>
+      </w:r>
+      <w:r>
+        <w:rPr>
+          <w:i w:val="1"/>
+          <w:iCs w:val="1"/>
+          <w:lang w:val="en-US"/>
+        </w:rPr>
+        <w:t xml:space="preserve"> </w:t>
+      </w:r>
+      <w:r>
+        <w:rPr>
+          <w:i w:val="1"/>
+          <w:iCs w:val="1"/>
+          <w:lang w:val="en-US"/>
+        </w:rPr>
+        <w:t>Permite</w:t>
+      </w:r>
+      <w:r>
+        <w:rPr>
+          <w:i w:val="1"/>
+          <w:iCs w:val="1"/>
+          <w:lang w:val="en-US"/>
+        </w:rPr>
+        <w:t xml:space="preserve"> </w:t>
+      </w:r>
+      <w:r>
+        <w:rPr>
+          <w:i w:val="1"/>
+          <w:iCs w:val="1"/>
+          <w:lang w:val="en-US"/>
+        </w:rPr>
+        <w:t>utilizar</w:t>
+      </w:r>
+      <w:r>
+        <w:rPr>
+          <w:i w:val="1"/>
+          <w:iCs w:val="1"/>
+          <w:lang w:val="en-US"/>
+        </w:rPr>
+        <w:t xml:space="preserve"> </w:t>
+      </w:r>
+      <w:r>
+        <w:rPr>
+          <w:i w:val="1"/>
+          <w:iCs w:val="1"/>
+          <w:lang w:val="en-US"/>
+        </w:rPr>
+        <w:t>el</w:t>
+      </w:r>
+      <w:r>
+        <w:rPr>
+          <w:i w:val="1"/>
+          <w:iCs w:val="1"/>
+          <w:lang w:val="en-US"/>
+        </w:rPr>
+        <w:t xml:space="preserve"> software </w:t>
+      </w:r>
+      <w:r>
+        <w:rPr>
+          <w:i w:val="1"/>
+          <w:iCs w:val="1"/>
+          <w:lang w:val="es-ES"/>
+        </w:rPr>
+        <w:t>bajo unas condiciones mínimas</w:t>
+      </w:r>
+      <w:r>
+        <w:rPr>
+          <w:i w:val="1"/>
+          <w:iCs w:val="1"/>
+          <w:lang w:val="en-US"/>
+        </w:rPr>
+        <w:t xml:space="preserve">, </w:t>
+      </w:r>
+      <w:r>
+        <w:rPr>
+          <w:i w:val="1"/>
+          <w:iCs w:val="1"/>
+          <w:lang w:val="en-US"/>
+        </w:rPr>
+        <w:t>manteniendo</w:t>
+      </w:r>
+      <w:r>
+        <w:rPr>
+          <w:i w:val="1"/>
+          <w:iCs w:val="1"/>
+          <w:lang w:val="en-US"/>
+        </w:rPr>
+        <w:t xml:space="preserve"> </w:t>
+      </w:r>
+      <w:r>
+        <w:rPr>
+          <w:i w:val="1"/>
+          <w:iCs w:val="1"/>
+          <w:lang w:val="en-US"/>
+        </w:rPr>
+        <w:t>siempre</w:t>
+      </w:r>
+      <w:r>
+        <w:rPr>
+          <w:i w:val="1"/>
+          <w:iCs w:val="1"/>
+          <w:lang w:val="en-US"/>
+        </w:rPr>
+        <w:t xml:space="preserve"> la </w:t>
+      </w:r>
+      <w:r>
+        <w:rPr>
+          <w:i w:val="1"/>
+          <w:iCs w:val="1"/>
+          <w:lang w:val="en-US"/>
+        </w:rPr>
+        <w:t>licencia</w:t>
+      </w:r>
+      <w:r>
+        <w:rPr>
+          <w:i w:val="1"/>
+          <w:iCs w:val="1"/>
+          <w:lang w:val="en-US"/>
+        </w:rPr>
+        <w:t xml:space="preserve"> original. </w:t>
+      </w:r>
+      <w:r>
+        <w:rPr>
+          <w:i w:val="1"/>
+          <w:iCs w:val="1"/>
+          <w:lang w:val="en-US"/>
+        </w:rPr>
+        <w:t>Está</w:t>
+      </w:r>
+      <w:r>
+        <w:rPr>
+          <w:i w:val="1"/>
+          <w:iCs w:val="1"/>
+          <w:lang w:val="en-US"/>
+        </w:rPr>
+        <w:t xml:space="preserve"> </w:t>
+      </w:r>
+      <w:r>
+        <w:rPr>
+          <w:i w:val="1"/>
+          <w:iCs w:val="1"/>
+          <w:lang w:val="en-US"/>
+        </w:rPr>
+        <w:t>diseñada</w:t>
+      </w:r>
+      <w:r>
+        <w:rPr>
+          <w:i w:val="1"/>
+          <w:iCs w:val="1"/>
+          <w:lang w:val="en-US"/>
+        </w:rPr>
+        <w:t xml:space="preserve"> para ser compatible con las </w:t>
+      </w:r>
+      <w:r>
+        <w:rPr>
+          <w:i w:val="1"/>
+          <w:iCs w:val="1"/>
+          <w:lang w:val="en-US"/>
+        </w:rPr>
+        <w:t>leyes</w:t>
+      </w:r>
+      <w:r>
+        <w:rPr>
+          <w:i w:val="1"/>
+          <w:iCs w:val="1"/>
+          <w:lang w:val="en-US"/>
+        </w:rPr>
+        <w:t xml:space="preserve"> de </w:t>
+      </w:r>
+      <w:r>
+        <w:rPr>
+          <w:i w:val="1"/>
+          <w:iCs w:val="1"/>
+          <w:lang w:val="en-US"/>
+        </w:rPr>
+        <w:t>los</w:t>
+      </w:r>
+      <w:r>
+        <w:rPr>
+          <w:i w:val="1"/>
+          <w:iCs w:val="1"/>
+          <w:lang w:val="en-US"/>
+        </w:rPr>
+        <w:t xml:space="preserve"> </w:t>
+      </w:r>
+      <w:r>
+        <w:rPr>
+          <w:i w:val="1"/>
+          <w:iCs w:val="1"/>
+          <w:lang w:val="en-US"/>
+        </w:rPr>
+        <w:t>países</w:t>
+      </w:r>
+      <w:r>
+        <w:rPr>
+          <w:i w:val="1"/>
+          <w:iCs w:val="1"/>
+          <w:lang w:val="en-US"/>
+        </w:rPr>
+        <w:t xml:space="preserve"> </w:t>
+      </w:r>
+      <w:r>
+        <w:rPr>
+          <w:i w:val="1"/>
+          <w:iCs w:val="1"/>
+          <w:lang w:val="en-US"/>
+        </w:rPr>
+        <w:t>miembros</w:t>
+      </w:r>
+      <w:r>
+        <w:rPr>
+          <w:i w:val="1"/>
+          <w:iCs w:val="1"/>
+          <w:lang w:val="en-US"/>
+        </w:rPr>
+        <w:t xml:space="preserve"> de la Unión Europea.</w:t>
+      </w:r>
+      <w:r>
+        <w:rPr>
+          <w:i w:val="1"/>
+          <w:iCs w:val="1"/>
+          <w:lang w:val="en-US"/>
+        </w:rPr>
+        <w:t xml:space="preserve"> Compatible con otras licencias.</w:t>
+      </w:r>
+    </w:p>
+    <w:p>
+      <w:pPr>
+        <w:pStyle w:val="Normal"/>
+        <w:rPr>
+          <w:i w:val="1"/>
+          <w:iCs w:val="1"/>
+        </w:rPr>
+      </w:pPr>
+      <w:r>
+        <w:rPr>
+          <w:u w:val="single"/>
+        </w:rPr>
+        <w:t xml:space="preserve">Código </w:t>
+      </w:r>
+      <w:bookmarkStart w:name="_Int_hu64dXz0" w:id="2052037325"/>
+      <w:r>
+        <w:rPr>
+          <w:u w:val="single"/>
+        </w:rPr>
+        <w:t>abierto</w:t>
+      </w:r>
+      <w:r>
+        <w:rPr>
+          <w:u w:val="none"/>
+        </w:rPr>
+        <w:t xml:space="preserve"> </w:t>
+      </w:r>
+      <w:bookmarkStart w:name="_Int_2wOWNsbJ" w:id="1711188472"/>
+      <w:r>
+        <w:rPr/>
+        <w:t>:</w:t>
+      </w:r>
+      <w:bookmarkEnd w:id="1711188472"/>
+      <w:bookmarkEnd w:id="2052037325"/>
+      <w:r>
+        <w:rPr/>
+        <w:t xml:space="preserve"> </w:t>
+      </w:r>
+    </w:p>
+    <w:p>
+      <w:pPr>
+        <w:pStyle w:val="Normal"/>
+      </w:pPr>
+      <w:r>
+        <w:rPr>
+          <w:b w:val="1"/>
+          <w:bCs w:val="1"/>
+          <w:i w:val="1"/>
+          <w:iCs w:val="1"/>
+          <w:lang w:val="en-US"/>
+        </w:rPr>
+        <w:t xml:space="preserve">MIT </w:t>
+      </w:r>
+      <w:bookmarkStart w:name="_Int_TJnZtODn" w:id="814973230"/>
+      <w:r>
+        <w:rPr>
+          <w:b w:val="1"/>
+          <w:bCs w:val="1"/>
+          <w:i w:val="1"/>
+          <w:iCs w:val="1"/>
+          <w:lang w:val="en-US"/>
+        </w:rPr>
+        <w:t>License</w:t>
+      </w:r>
+      <w:r>
+        <w:rPr>
+          <w:i w:val="1"/>
+          <w:iCs w:val="1"/>
+          <w:lang w:val="en-US"/>
+        </w:rPr>
+        <w:t xml:space="preserve"> :</w:t>
+      </w:r>
+      <w:bookmarkEnd w:id="814973230"/>
+      <w:r>
+        <w:rPr>
+          <w:i w:val="1"/>
+          <w:iCs w:val="1"/>
+          <w:lang w:val="en-US"/>
+        </w:rPr>
+        <w:t xml:space="preserve"> El software </w:t>
+      </w:r>
+      <w:r>
+        <w:rPr>
+          <w:i w:val="1"/>
+          <w:iCs w:val="1"/>
+          <w:lang w:val="en-US"/>
+        </w:rPr>
+        <w:t>puede</w:t>
+      </w:r>
+      <w:r>
+        <w:rPr>
+          <w:i w:val="1"/>
+          <w:iCs w:val="1"/>
+          <w:lang w:val="en-US"/>
+        </w:rPr>
+        <w:t xml:space="preserve"> </w:t>
+      </w:r>
+      <w:r>
+        <w:rPr>
+          <w:i w:val="1"/>
+          <w:iCs w:val="1"/>
+          <w:lang w:val="en-US"/>
+        </w:rPr>
+        <w:t>usarse</w:t>
+      </w:r>
+      <w:r>
+        <w:rPr>
+          <w:i w:val="1"/>
+          <w:iCs w:val="1"/>
+          <w:lang w:val="en-US"/>
+        </w:rPr>
+        <w:t xml:space="preserve"> </w:t>
+      </w:r>
+      <w:r>
+        <w:rPr>
+          <w:i w:val="1"/>
+          <w:iCs w:val="1"/>
+          <w:lang w:val="es-ES"/>
+        </w:rPr>
+        <w:t>bajo unas condiciones mínimas</w:t>
+      </w:r>
+      <w:r>
+        <w:rPr>
+          <w:i w:val="1"/>
+          <w:iCs w:val="1"/>
+          <w:lang w:val="en-US"/>
+        </w:rPr>
+        <w:t xml:space="preserve">, </w:t>
+      </w:r>
+      <w:r>
+        <w:rPr>
+          <w:i w:val="1"/>
+          <w:iCs w:val="1"/>
+          <w:lang w:val="en-US"/>
+        </w:rPr>
+        <w:t>pero</w:t>
+      </w:r>
+      <w:r>
+        <w:rPr>
+          <w:i w:val="1"/>
+          <w:iCs w:val="1"/>
+          <w:lang w:val="en-US"/>
+        </w:rPr>
+        <w:t xml:space="preserve"> </w:t>
+      </w:r>
+      <w:r>
+        <w:rPr>
+          <w:i w:val="1"/>
+          <w:iCs w:val="1"/>
+          <w:lang w:val="en-US"/>
+        </w:rPr>
+        <w:t>manteniendo</w:t>
+      </w:r>
+      <w:r>
+        <w:rPr>
+          <w:i w:val="1"/>
+          <w:iCs w:val="1"/>
+          <w:lang w:val="en-US"/>
+        </w:rPr>
+        <w:t xml:space="preserve"> </w:t>
+      </w:r>
+      <w:r>
+        <w:rPr>
+          <w:i w:val="1"/>
+          <w:iCs w:val="1"/>
+          <w:lang w:val="en-US"/>
+        </w:rPr>
+        <w:t>siempre</w:t>
+      </w:r>
+      <w:r>
+        <w:rPr>
+          <w:i w:val="1"/>
+          <w:iCs w:val="1"/>
+          <w:lang w:val="en-US"/>
+        </w:rPr>
+        <w:t xml:space="preserve"> </w:t>
+      </w:r>
+      <w:r>
+        <w:rPr>
+          <w:i w:val="1"/>
+          <w:iCs w:val="1"/>
+          <w:lang w:val="en-US"/>
+        </w:rPr>
+        <w:t>el</w:t>
+      </w:r>
+      <w:r>
+        <w:rPr>
+          <w:i w:val="1"/>
+          <w:iCs w:val="1"/>
+          <w:lang w:val="en-US"/>
+        </w:rPr>
+        <w:t xml:space="preserve"> copyright y </w:t>
+      </w:r>
+      <w:r>
+        <w:rPr>
+          <w:i w:val="1"/>
+          <w:iCs w:val="1"/>
+          <w:lang w:val="en-US"/>
+        </w:rPr>
+        <w:t>el</w:t>
+      </w:r>
+      <w:r>
+        <w:rPr>
+          <w:i w:val="1"/>
+          <w:iCs w:val="1"/>
+          <w:lang w:val="en-US"/>
+        </w:rPr>
+        <w:t xml:space="preserve"> </w:t>
+      </w:r>
+      <w:r>
+        <w:rPr>
+          <w:i w:val="1"/>
+          <w:iCs w:val="1"/>
+          <w:lang w:val="en-US"/>
+        </w:rPr>
+        <w:t>texto</w:t>
+      </w:r>
+      <w:r>
+        <w:rPr>
+          <w:i w:val="1"/>
+          <w:iCs w:val="1"/>
+          <w:lang w:val="en-US"/>
+        </w:rPr>
+        <w:t xml:space="preserve"> de la </w:t>
+      </w:r>
+      <w:r>
+        <w:rPr>
+          <w:i w:val="1"/>
+          <w:iCs w:val="1"/>
+          <w:lang w:val="en-US"/>
+        </w:rPr>
+        <w:t>licencia</w:t>
+      </w:r>
+      <w:r>
+        <w:rPr>
+          <w:i w:val="1"/>
+          <w:iCs w:val="1"/>
+          <w:lang w:val="en-US"/>
+        </w:rPr>
+        <w:t>.</w:t>
+      </w:r>
+      <w:r>
+        <w:rPr>
+          <w:i w:val="1"/>
+          <w:iCs w:val="1"/>
+          <w:lang w:val="en-US"/>
+        </w:rPr>
+        <w:t xml:space="preserve"> La </w:t>
+      </w:r>
+      <w:r>
+        <w:rPr>
+          <w:i w:val="1"/>
+          <w:iCs w:val="1"/>
+          <w:lang w:val="en-US"/>
+        </w:rPr>
+        <w:t>licencia</w:t>
+      </w:r>
+      <w:r>
+        <w:rPr>
+          <w:i w:val="1"/>
+          <w:iCs w:val="1"/>
+          <w:lang w:val="en-US"/>
+        </w:rPr>
+        <w:t xml:space="preserve"> es </w:t>
+      </w:r>
+      <w:r>
+        <w:rPr>
+          <w:i w:val="1"/>
+          <w:iCs w:val="1"/>
+          <w:lang w:val="en-US"/>
+        </w:rPr>
+        <w:t>más</w:t>
+      </w:r>
+      <w:r>
+        <w:rPr>
+          <w:i w:val="1"/>
+          <w:iCs w:val="1"/>
+          <w:lang w:val="en-US"/>
+        </w:rPr>
+        <w:t xml:space="preserve"> simple </w:t>
+      </w:r>
+      <w:r>
+        <w:rPr>
+          <w:i w:val="1"/>
+          <w:iCs w:val="1"/>
+          <w:lang w:val="en-US"/>
+        </w:rPr>
+        <w:t>que</w:t>
+      </w:r>
+      <w:r>
+        <w:rPr>
+          <w:i w:val="1"/>
+          <w:iCs w:val="1"/>
+          <w:lang w:val="en-US"/>
+        </w:rPr>
+        <w:t xml:space="preserve"> la Apache 2.0.</w:t>
+      </w:r>
+      <w:r>
+        <w:br/>
+      </w:r>
+      <w:r>
+        <w:rPr>
+          <w:b w:val="1"/>
+          <w:bCs w:val="1"/>
+          <w:i w:val="1"/>
+          <w:iCs w:val="1"/>
+          <w:lang w:val="en-US"/>
+        </w:rPr>
+        <w:t xml:space="preserve">Apache </w:t>
+      </w:r>
+      <w:r>
+        <w:rPr>
+          <w:b w:val="1"/>
+          <w:bCs w:val="1"/>
+          <w:i w:val="1"/>
+          <w:iCs w:val="1"/>
+          <w:lang w:val="en-US"/>
+        </w:rPr>
+        <w:t>License</w:t>
+      </w:r>
+      <w:r>
+        <w:rPr>
+          <w:b w:val="1"/>
+          <w:bCs w:val="1"/>
+          <w:i w:val="1"/>
+          <w:iCs w:val="1"/>
+          <w:lang w:val="en-US"/>
+        </w:rPr>
+        <w:t xml:space="preserve"> v. </w:t>
+      </w:r>
+      <w:bookmarkStart w:name="_Int_pFmKXfSS" w:id="422401100"/>
+      <w:r>
+        <w:rPr>
+          <w:b w:val="1"/>
+          <w:bCs w:val="1"/>
+          <w:i w:val="1"/>
+          <w:iCs w:val="1"/>
+          <w:lang w:val="en-US"/>
+        </w:rPr>
+        <w:t>1.1.</w:t>
+      </w:r>
+      <w:r>
+        <w:rPr>
+          <w:i w:val="1"/>
+          <w:iCs w:val="1"/>
+          <w:lang w:val="en-US"/>
+        </w:rPr>
+        <w:t xml:space="preserve"> :</w:t>
+      </w:r>
+      <w:bookmarkEnd w:id="422401100"/>
+      <w:r>
+        <w:rPr>
+          <w:i w:val="1"/>
+          <w:iCs w:val="1"/>
+          <w:lang w:val="en-US"/>
+        </w:rPr>
+        <w:t xml:space="preserve"> </w:t>
+      </w:r>
+      <w:r>
+        <w:rPr>
+          <w:i w:val="1"/>
+          <w:iCs w:val="1"/>
+          <w:lang w:val="en-US"/>
+        </w:rPr>
+        <w:t xml:space="preserve">El software </w:t>
+      </w:r>
+      <w:r>
+        <w:rPr>
+          <w:i w:val="1"/>
+          <w:iCs w:val="1"/>
+          <w:lang w:val="en-US"/>
+        </w:rPr>
+        <w:t>puede</w:t>
+      </w:r>
+      <w:r>
+        <w:rPr>
+          <w:i w:val="1"/>
+          <w:iCs w:val="1"/>
+          <w:lang w:val="en-US"/>
+        </w:rPr>
+        <w:t xml:space="preserve"> </w:t>
+      </w:r>
+      <w:r>
+        <w:rPr>
+          <w:i w:val="1"/>
+          <w:iCs w:val="1"/>
+          <w:lang w:val="en-US"/>
+        </w:rPr>
+        <w:t>usarse</w:t>
+      </w:r>
+      <w:r>
+        <w:rPr>
+          <w:i w:val="1"/>
+          <w:iCs w:val="1"/>
+          <w:lang w:val="en-US"/>
+        </w:rPr>
+        <w:t xml:space="preserve"> </w:t>
+      </w:r>
+      <w:r>
+        <w:rPr>
+          <w:i w:val="1"/>
+          <w:iCs w:val="1"/>
+          <w:lang w:val="es-ES"/>
+        </w:rPr>
+        <w:t>bajo unas condiciones mínimas</w:t>
+      </w:r>
+      <w:r>
+        <w:rPr>
+          <w:i w:val="1"/>
+          <w:iCs w:val="1"/>
+          <w:lang w:val="en-US"/>
+        </w:rPr>
+        <w:t xml:space="preserve">, </w:t>
+      </w:r>
+      <w:r>
+        <w:rPr>
+          <w:i w:val="1"/>
+          <w:iCs w:val="1"/>
+          <w:lang w:val="en-US"/>
+        </w:rPr>
+        <w:t>pero</w:t>
+      </w:r>
+      <w:r>
+        <w:rPr>
+          <w:i w:val="1"/>
+          <w:iCs w:val="1"/>
+          <w:lang w:val="en-US"/>
+        </w:rPr>
+        <w:t xml:space="preserve"> </w:t>
+      </w:r>
+      <w:r>
+        <w:rPr>
+          <w:i w:val="1"/>
+          <w:iCs w:val="1"/>
+          <w:lang w:val="en-US"/>
+        </w:rPr>
+        <w:t>manteniendo</w:t>
+      </w:r>
+      <w:r>
+        <w:rPr>
+          <w:i w:val="1"/>
+          <w:iCs w:val="1"/>
+          <w:lang w:val="en-US"/>
+        </w:rPr>
+        <w:t xml:space="preserve"> </w:t>
+      </w:r>
+      <w:r>
+        <w:rPr>
+          <w:i w:val="1"/>
+          <w:iCs w:val="1"/>
+          <w:lang w:val="en-US"/>
+        </w:rPr>
+        <w:t>el</w:t>
+      </w:r>
+      <w:r>
+        <w:rPr>
+          <w:i w:val="1"/>
+          <w:iCs w:val="1"/>
+          <w:lang w:val="en-US"/>
+        </w:rPr>
+        <w:t xml:space="preserve"> copyright y </w:t>
+      </w:r>
+      <w:r>
+        <w:rPr>
+          <w:i w:val="1"/>
+          <w:iCs w:val="1"/>
+          <w:lang w:val="en-US"/>
+        </w:rPr>
+        <w:t>el</w:t>
+      </w:r>
+      <w:r>
+        <w:rPr>
+          <w:i w:val="1"/>
+          <w:iCs w:val="1"/>
+          <w:lang w:val="en-US"/>
+        </w:rPr>
+        <w:t xml:space="preserve"> </w:t>
+      </w:r>
+      <w:r>
+        <w:rPr>
+          <w:i w:val="1"/>
+          <w:iCs w:val="1"/>
+          <w:lang w:val="en-US"/>
+        </w:rPr>
+        <w:t>descargo</w:t>
+      </w:r>
+      <w:r>
+        <w:rPr>
+          <w:i w:val="1"/>
+          <w:iCs w:val="1"/>
+          <w:lang w:val="en-US"/>
+        </w:rPr>
+        <w:t xml:space="preserve"> de </w:t>
+      </w:r>
+      <w:r>
+        <w:rPr>
+          <w:i w:val="1"/>
+          <w:iCs w:val="1"/>
+          <w:lang w:val="en-US"/>
+        </w:rPr>
+        <w:t>responsabilidad</w:t>
+      </w:r>
+      <w:r>
+        <w:rPr>
+          <w:i w:val="1"/>
+          <w:iCs w:val="1"/>
+          <w:lang w:val="en-US"/>
+        </w:rPr>
+        <w:t>.</w:t>
+      </w:r>
+    </w:p>
+    <w:p>
+      <w:pPr>
+        <w:pStyle w:val="Normal"/>
+        <w:rPr>
+          <w:i w:val="1"/>
+          <w:iCs w:val="1"/>
+        </w:rPr>
+      </w:pPr>
+      <w:r>
+        <w:rPr>
+          <w:u w:val="single"/>
+        </w:rPr>
+        <w:t xml:space="preserve">Dominio </w:t>
+      </w:r>
+      <w:bookmarkStart w:name="_Int_WeaA8FST" w:id="1430791908"/>
+      <w:r>
+        <w:rPr>
+          <w:u w:val="single"/>
+        </w:rPr>
+        <w:t>público</w:t>
+      </w:r>
+      <w:r>
+        <w:rPr/>
+        <w:t xml:space="preserve"> :</w:t>
+      </w:r>
+      <w:bookmarkEnd w:id="1430791908"/>
+      <w:r>
+        <w:rPr/>
+        <w:t xml:space="preserve"> </w:t>
+      </w:r>
+    </w:p>
+    <w:p>
+      <w:pPr>
+        <w:pStyle w:val="Normal"/>
+        <w:rPr>
+          <w:lang w:val="es-ES"/>
+        </w:rPr>
+      </w:pPr>
+      <w:r>
+        <w:rPr>
+          <w:b w:val="1"/>
+          <w:bCs w:val="1"/>
+          <w:i w:val="1"/>
+          <w:iCs w:val="1"/>
+          <w:lang w:val="es-ES"/>
+        </w:rPr>
+        <w:t>CC</w:t>
+      </w:r>
+      <w:bookmarkStart w:name="_Int_evyyiED0" w:id="471761478"/>
+      <w:r>
+        <w:rPr>
+          <w:b w:val="1"/>
+          <w:bCs w:val="1"/>
+          <w:i w:val="1"/>
+          <w:iCs w:val="1"/>
+          <w:lang w:val="es-ES"/>
+        </w:rPr>
+        <w:t xml:space="preserve">0 </w:t>
+      </w:r>
+      <w:r>
+        <w:rPr>
+          <w:i w:val="1"/>
+          <w:iCs w:val="1"/>
+          <w:lang w:val="es-ES"/>
+        </w:rPr>
+        <w:t>:</w:t>
+      </w:r>
+      <w:bookmarkEnd w:id="471761478"/>
+      <w:r>
+        <w:rPr>
+          <w:i w:val="1"/>
+          <w:iCs w:val="1"/>
+          <w:lang w:val="es-ES"/>
+        </w:rPr>
+        <w:t xml:space="preserve"> Creative Commons Zero. Sin restricción, atribución, o garantías.</w:t>
+      </w:r>
+      <w:r>
+        <w:br/>
+      </w:r>
+      <w:r>
+        <w:br/>
+      </w:r>
+    </w:p>
+    <w:p>
+      <w:pPr>
+        <w:pStyle w:val="Normal"/>
+        <w:rPr>
+          <w:lang w:val="en-US"/>
+        </w:rPr>
+      </w:pPr>
+      <w:r>
+        <w:br/>
+      </w:r>
+    </w:p>
+    <w:p>
+      <w:pPr>
+        <w:pStyle w:val="Normal"/>
+      </w:pPr>
+    </w:p>
+    <w:p>
+      <w:pPr>
+        <w:pStyle w:val="Normal"/>
+      </w:pPr>
+      <w:r>
+        <w:br/>
+      </w:r>
+    </w:p>
+    <w:p>
+      <w:pPr>
+        <w:pStyle w:val="Normal"/>
+      </w:pPr>
+    </w:p>
+    <w:p>
+      <w:pPr>
+        <w:pStyle w:val="Heading2"/>
+      </w:pPr>
+      <w:bookmarkStart w:name="_Toc511265140" w:id="924421219"/>
+      <w:r>
+        <w:rPr/>
+        <w:t>Comparación entre licencias</w:t>
+      </w:r>
+      <w:bookmarkEnd w:id="924421219"/>
     </w:p>
     <w:p>
       <w:pPr>
@@ -2335,65 +2316,30 @@
         <w:ind w:left="0" w:right="0"/>
         <w:jc w:val="left"/>
         <w:rPr>
-          <w:b w:val="0"/>
-          <w:bCs w:val="0"/>
-          <w:i w:val="1"/>
-          <w:iCs w:val="1"/>
-        </w:rPr>
-      </w:pPr>
-      <w:r>
-        <w:rPr>
-          <w:b w:val="0"/>
-          <w:bCs w:val="0"/>
-          <w:i w:val="1"/>
-          <w:iCs w:val="1"/>
-        </w:rPr>
-        <w:t xml:space="preserve">Apache </w:t>
-      </w:r>
-      <w:r>
-        <w:rPr>
-          <w:b w:val="0"/>
-          <w:bCs w:val="0"/>
-          <w:i w:val="1"/>
-          <w:iCs w:val="1"/>
+          <w:b w:val="1"/>
+          <w:bCs w:val="1"/>
+        </w:rPr>
+      </w:pPr>
+      <w:r>
+        <w:rPr>
+          <w:b w:val="1"/>
+          <w:bCs w:val="1"/>
+        </w:rPr>
+        <w:t xml:space="preserve">GNU General Public </w:t>
+      </w:r>
+      <w:r>
+        <w:rPr>
+          <w:b w:val="1"/>
+          <w:bCs w:val="1"/>
         </w:rPr>
         <w:t>License</w:t>
       </w:r>
       <w:r>
         <w:rPr>
-          <w:b w:val="0"/>
-          <w:bCs w:val="0"/>
-          <w:i w:val="1"/>
-          <w:iCs w:val="1"/>
-        </w:rPr>
-        <w:t xml:space="preserve"> 2.0 y MIT funcionan igual</w:t>
-      </w:r>
-      <w:r>
-        <w:rPr>
-          <w:b w:val="0"/>
-          <w:bCs w:val="0"/>
-          <w:i w:val="1"/>
-          <w:iCs w:val="1"/>
-        </w:rPr>
-        <w:t xml:space="preserve"> que la GNU GPL 3.0, pero al insertarse en un proyecto, este no tiene que cambiar su licencia, pero tiene que mantener el copyright</w:t>
-      </w:r>
-      <w:r>
-        <w:rPr>
-          <w:b w:val="0"/>
-          <w:bCs w:val="0"/>
-          <w:i w:val="1"/>
-          <w:iCs w:val="1"/>
-        </w:rPr>
-        <w:t xml:space="preserve"> </w:t>
-      </w:r>
-      <w:r>
-        <w:rPr>
-          <w:b w:val="0"/>
-          <w:bCs w:val="0"/>
-          <w:i w:val="1"/>
-          <w:iCs w:val="1"/>
-        </w:rPr>
-        <w:t>y un aviso con la licencia original del código.</w:t>
+          <w:b w:val="1"/>
+          <w:bCs w:val="1"/>
+        </w:rPr>
+        <w:t xml:space="preserve"> v. 3.0 / Apache v. 2.0 / MIT</w:t>
       </w:r>
     </w:p>
     <w:p>
@@ -2418,7 +2364,7 @@
           <w:i w:val="1"/>
           <w:iCs w:val="1"/>
         </w:rPr>
-        <w:t xml:space="preserve">La diferencia entre la licencia Apache 2.0 y la MIT está en el tratamiento de las patentes, el cual, en la Apache 2.0 se especifica, </w:t>
+        <w:t>Un software bajo la licencia GNU GPL 3.0 puede ejecutarse, modificarse</w:t>
       </w:r>
       <w:r>
         <w:rPr>
@@ -2427,15 +2373,119 @@
           <w:i w:val="1"/>
           <w:iCs w:val="1"/>
         </w:rPr>
-        <w:t>mientras que en la MIT</w:t>
-      </w:r>
-      <w:r>
+        <w:t xml:space="preserve"> y compartirse, pero siempre bajo la misma licencia. Si se inserta dentro de un proyecto mayor, este proyecto también tiene que utilizar la misma licencia.</w:t>
+      </w:r>
+    </w:p>
+    <w:p>
+      <w:pPr>
+        <w:pStyle w:val="Normal"/>
+        <w:suppressLineNumbers w:val="0"/>
+        <w:bidi w:val="0"/>
+        <w:spacing w:before="0" w:beforeAutospacing="off" w:after="160" w:afterAutospacing="off" w:line="279" w:lineRule="auto"/>
+        <w:ind w:left="0" w:right="0"/>
+        <w:jc w:val="left"/>
         <w:rPr>
           <w:b w:val="0"/>
           <w:bCs w:val="0"/>
           <w:i w:val="1"/>
           <w:iCs w:val="1"/>
         </w:rPr>
+      </w:pPr>
+      <w:r>
+        <w:rPr>
+          <w:b w:val="0"/>
+          <w:bCs w:val="0"/>
+          <w:i w:val="1"/>
+          <w:iCs w:val="1"/>
+        </w:rPr>
+        <w:t xml:space="preserve">Apache </w:t>
+      </w:r>
+      <w:r>
+        <w:rPr>
+          <w:b w:val="0"/>
+          <w:bCs w:val="0"/>
+          <w:i w:val="1"/>
+          <w:iCs w:val="1"/>
+        </w:rPr>
+        <w:t>License</w:t>
+      </w:r>
+      <w:r>
+        <w:rPr>
+          <w:b w:val="0"/>
+          <w:bCs w:val="0"/>
+          <w:i w:val="1"/>
+          <w:iCs w:val="1"/>
+        </w:rPr>
+        <w:t xml:space="preserve"> 2.0 y MIT funcionan igual</w:t>
+      </w:r>
+      <w:r>
+        <w:rPr>
+          <w:b w:val="0"/>
+          <w:bCs w:val="0"/>
+          <w:i w:val="1"/>
+          <w:iCs w:val="1"/>
+        </w:rPr>
+        <w:t xml:space="preserve"> que la GNU GPL 3.0, pero al insertarse en un proyecto, este no tiene que cambiar su licencia, pero tiene que mantener el copyright</w:t>
+      </w:r>
+      <w:r>
+        <w:rPr>
+          <w:b w:val="0"/>
+          <w:bCs w:val="0"/>
+          <w:i w:val="1"/>
+          <w:iCs w:val="1"/>
+        </w:rPr>
+        <w:t xml:space="preserve"> </w:t>
+      </w:r>
+      <w:r>
+        <w:rPr>
+          <w:b w:val="0"/>
+          <w:bCs w:val="0"/>
+          <w:i w:val="1"/>
+          <w:iCs w:val="1"/>
+        </w:rPr>
+        <w:t>y un aviso con la licencia original del código.</w:t>
+      </w:r>
+    </w:p>
+    <w:p>
+      <w:pPr>
+        <w:pStyle w:val="Normal"/>
+        <w:suppressLineNumbers w:val="0"/>
+        <w:bidi w:val="0"/>
+        <w:spacing w:before="0" w:beforeAutospacing="off" w:after="160" w:afterAutospacing="off" w:line="279" w:lineRule="auto"/>
+        <w:ind w:left="0" w:right="0"/>
+        <w:jc w:val="left"/>
+        <w:rPr>
+          <w:b w:val="0"/>
+          <w:bCs w:val="0"/>
+          <w:i w:val="1"/>
+          <w:iCs w:val="1"/>
+        </w:rPr>
+      </w:pPr>
+      <w:r>
+        <w:rPr>
+          <w:b w:val="0"/>
+          <w:bCs w:val="0"/>
+          <w:i w:val="1"/>
+          <w:iCs w:val="1"/>
+        </w:rPr>
+        <w:t xml:space="preserve">La diferencia entre la licencia Apache 2.0 y la MIT está en el tratamiento de las patentes, el cual, en la Apache 2.0 se especifica, </w:t>
+      </w:r>
+      <w:r>
+        <w:rPr>
+          <w:b w:val="0"/>
+          <w:bCs w:val="0"/>
+          <w:i w:val="1"/>
+          <w:iCs w:val="1"/>
+        </w:rPr>
+        <w:t>mientras que en la MIT</w:t>
+      </w:r>
+      <w:r>
+        <w:rPr>
+          <w:b w:val="0"/>
+          <w:bCs w:val="0"/>
+          <w:i w:val="1"/>
+          <w:iCs w:val="1"/>
+        </w:rPr>
         <w:t xml:space="preserve"> no se trata por mantener la simplicidad.</w:t>
       </w:r>
     </w:p>
@@ -2452,7 +2502,7 @@
           <w:bCs w:val="1"/>
         </w:rPr>
       </w:pPr>
-      <w:bookmarkStart w:name="_Toc1517806272" w:id="1343324054"/>
+      <w:bookmarkStart w:name="_Toc879229880" w:id="467286197"/>
       <w:r>
         <w:rPr>
           <w:b w:val="1"/>
@@ -2460,7 +2510,7 @@
         </w:rPr>
         <w:t>Requisitos</w:t>
       </w:r>
-      <w:bookmarkEnd w:id="1343324054"/>
+      <w:bookmarkEnd w:id="467286197"/>
     </w:p>
     <w:p>
       <w:pPr>
@@ -2471,7 +2521,7 @@
         <w:ind w:left="0" w:right="0"/>
         <w:jc w:val="left"/>
       </w:pPr>
-      <w:bookmarkStart w:name="_Toc1060950956" w:id="1401901114"/>
+      <w:bookmarkStart w:name="_Toc1407560729" w:id="1897881209"/>
       <w:r>
         <w:rPr/>
         <w:t>R</w:t>
@@ -2480,7 +2530,7 @@
         <w:rPr/>
         <w:t>equisitos de Hardware</w:t>
       </w:r>
-      <w:bookmarkEnd w:id="1401901114"/>
+      <w:bookmarkEnd w:id="1897881209"/>
     </w:p>
     <w:p>
       <w:pPr>
@@ -2615,7 +2665,7 @@
         <w:ind w:left="0" w:right="0"/>
         <w:jc w:val="left"/>
       </w:pPr>
-      <w:bookmarkStart w:name="_Toc1663264036" w:id="570745839"/>
+      <w:bookmarkStart w:name="_Toc27283976" w:id="1116179200"/>
       <w:r>
         <w:rPr/>
         <w:t>R</w:t>
@@ -2624,7 +2674,7 @@
         <w:rPr/>
         <w:t>equisitos de Software</w:t>
       </w:r>
-      <w:bookmarkEnd w:id="570745839"/>
+      <w:bookmarkEnd w:id="1116179200"/>
     </w:p>
     <w:p>
       <w:pPr>
@@ -3139,7 +3189,7 @@
           <w:bCs w:val="1"/>
         </w:rPr>
       </w:pPr>
-      <w:bookmarkStart w:name="_Toc77101453" w:id="131007922"/>
+      <w:bookmarkStart w:name="_Toc157029606" w:id="778585360"/>
       <w:r>
         <w:rPr>
           <w:b w:val="1"/>
@@ -3147,7 +3197,7 @@
         </w:rPr>
         <w:t>Instalación</w:t>
       </w:r>
-      <w:bookmarkEnd w:id="131007922"/>
+      <w:bookmarkEnd w:id="778585360"/>
     </w:p>
     <w:p>
       <w:pPr>
@@ -3162,7 +3212,7 @@
           <w:bCs w:val="1"/>
         </w:rPr>
       </w:pPr>
-      <w:bookmarkStart w:name="_Toc81259772" w:id="1747516886"/>
+      <w:bookmarkStart w:name="_Toc1228673080" w:id="1658436496"/>
       <w:r>
         <w:rPr>
           <w:b w:val="1"/>
@@ -3170,7 +3220,7 @@
         </w:rPr>
         <w:t>Guía de uso</w:t>
       </w:r>
-      <w:bookmarkEnd w:id="1747516886"/>
+      <w:bookmarkEnd w:id="1658436496"/>
     </w:p>
     <w:p>
       <w:pPr>
@@ -3181,7 +3231,7 @@
           <w:bCs w:val="1"/>
         </w:rPr>
       </w:pPr>
-      <w:bookmarkStart w:name="_Toc2133818568" w:id="1758806372"/>
+      <w:bookmarkStart w:name="_Toc97740711" w:id="2025427051"/>
       <w:r>
         <w:rPr>
           <w:b w:val="1"/>
@@ -3189,7 +3239,7 @@
         </w:rPr>
         <w:t>Problemas frecuentes y solución</w:t>
       </w:r>
-      <w:bookmarkEnd w:id="1758806372"/>
+      <w:bookmarkEnd w:id="2025427051"/>
     </w:p>
     <w:p/>
     <w:p/>
@@ -3695,6 +3745,12 @@
     <int2:textHash int2:hashCode="9+LyU1u5NhH3uV" int2:id="wxPVyvBi">
       <int2:state int2:type="spell" int2:value="Rejected"/>
     </int2:textHash>
+    <int2:bookmark int2:bookmarkName="_Int_Mm7s96Jj" int2:invalidationBookmarkName="" int2:hashCode="AbZCIMyt3KvGrn" int2:id="ds4RTUAY">
+      <int2:state int2:type="gram" int2:value="Rejected"/>
+    </int2:bookmark>
+    <int2:bookmark int2:bookmarkName="_Int_PZUOkQCq" int2:invalidationBookmarkName="" int2:hashCode="ekPmbvhrjfGcpV" int2:id="sXHuKSn2">
+      <int2:state int2:type="gram" int2:value="Rejected"/>
+    </int2:bookmark>
     <int2:bookmark int2:bookmarkName="_Int_bjfWwamN" int2:invalidationBookmarkName="" int2:hashCode="5v+mkZMVuOG47R" int2:id="bwGFllnz">
       <int2:state int2:type="gram" int2:value="Rejected"/>
     </int2:bookmark>

</xml_diff>

<commit_message>
Cambios en relación con la base de datos
Se han cambiado DAO y gestores, también la pantalla para que funcione con la actualización de la base de datos
</commit_message>
<xml_diff>
--- a/Programacion/Manual de usuario/Manual de usuario.docx
+++ b/Programacion/Manual de usuario/Manual de usuario.docx
@@ -60,7 +60,7 @@
       <w:pPr>
         <w:pStyle w:val="Heading1"/>
       </w:pPr>
-      <w:bookmarkStart w:name="_Toc2047801213" w:id="2047716878"/>
+      <w:bookmarkStart w:name="_Toc1427686352" w:id="409401187"/>
       <w:r>
         <w:rPr>
           <w:b w:val="1"/>
@@ -72,7 +72,7 @@
       <w:r>
         <w:br/>
       </w:r>
-      <w:bookmarkEnd w:id="2047716878"/>
+      <w:bookmarkEnd w:id="409401187"/>
     </w:p>
     <w:sdt>
       <w:sdtPr>
@@ -102,7 +102,7 @@
           <w:r>
             <w:fldChar w:fldCharType="separate"/>
           </w:r>
-          <w:hyperlink w:anchor="_Toc2047801213">
+          <w:hyperlink w:anchor="_Toc1427686352">
             <w:r>
               <w:rPr>
                 <w:rStyle w:val="Hyperlink"/>
@@ -116,7 +116,7 @@
               <w:fldChar w:fldCharType="begin"/>
             </w:r>
             <w:r>
-              <w:instrText xml:space="preserve">PAGEREF _Toc2047801213 \h</w:instrText>
+              <w:instrText xml:space="preserve">PAGEREF _Toc1427686352 \h</w:instrText>
             </w:r>
             <w:r>
               <w:fldChar w:fldCharType="separate"/>
@@ -142,7 +142,7 @@
               <w:rStyle w:val="Hyperlink"/>
             </w:rPr>
           </w:pPr>
-          <w:hyperlink w:anchor="_Toc544508615">
+          <w:hyperlink w:anchor="_Toc798708136">
             <w:r>
               <w:rPr>
                 <w:rStyle w:val="Hyperlink"/>
@@ -156,7 +156,7 @@
               <w:fldChar w:fldCharType="begin"/>
             </w:r>
             <w:r>
-              <w:instrText xml:space="preserve">PAGEREF _Toc544508615 \h</w:instrText>
+              <w:instrText xml:space="preserve">PAGEREF _Toc798708136 \h</w:instrText>
             </w:r>
             <w:r>
               <w:fldChar w:fldCharType="separate"/>
@@ -182,7 +182,7 @@
               <w:rStyle w:val="Hyperlink"/>
             </w:rPr>
           </w:pPr>
-          <w:hyperlink w:anchor="_Toc859196054">
+          <w:hyperlink w:anchor="_Toc1509843913">
             <w:r>
               <w:rPr>
                 <w:rStyle w:val="Hyperlink"/>
@@ -196,7 +196,7 @@
               <w:fldChar w:fldCharType="begin"/>
             </w:r>
             <w:r>
-              <w:instrText xml:space="preserve">PAGEREF _Toc859196054 \h</w:instrText>
+              <w:instrText xml:space="preserve">PAGEREF _Toc1509843913 \h</w:instrText>
             </w:r>
             <w:r>
               <w:fldChar w:fldCharType="separate"/>
@@ -222,7 +222,7 @@
               <w:rStyle w:val="Hyperlink"/>
             </w:rPr>
           </w:pPr>
-          <w:hyperlink w:anchor="_Toc820899969">
+          <w:hyperlink w:anchor="_Toc905451803">
             <w:r>
               <w:rPr>
                 <w:rStyle w:val="Hyperlink"/>
@@ -236,7 +236,7 @@
               <w:fldChar w:fldCharType="begin"/>
             </w:r>
             <w:r>
-              <w:instrText xml:space="preserve">PAGEREF _Toc820899969 \h</w:instrText>
+              <w:instrText xml:space="preserve">PAGEREF _Toc905451803 \h</w:instrText>
             </w:r>
             <w:r>
               <w:fldChar w:fldCharType="separate"/>
@@ -262,7 +262,7 @@
               <w:rStyle w:val="Hyperlink"/>
             </w:rPr>
           </w:pPr>
-          <w:hyperlink w:anchor="_Toc399201739">
+          <w:hyperlink w:anchor="_Toc511265140">
             <w:r>
               <w:rPr>
                 <w:rStyle w:val="Hyperlink"/>
@@ -276,7 +276,7 @@
               <w:fldChar w:fldCharType="begin"/>
             </w:r>
             <w:r>
-              <w:instrText xml:space="preserve">PAGEREF _Toc399201739 \h</w:instrText>
+              <w:instrText xml:space="preserve">PAGEREF _Toc511265140 \h</w:instrText>
             </w:r>
             <w:r>
               <w:fldChar w:fldCharType="separate"/>
@@ -285,7 +285,7 @@
               <w:rPr>
                 <w:rStyle w:val="Hyperlink"/>
               </w:rPr>
-              <w:t>1</w:t>
+              <w:t>2</w:t>
             </w:r>
             <w:r>
               <w:fldChar w:fldCharType="end"/>
@@ -302,7 +302,7 @@
               <w:rStyle w:val="Hyperlink"/>
             </w:rPr>
           </w:pPr>
-          <w:hyperlink w:anchor="_Toc1517806272">
+          <w:hyperlink w:anchor="_Toc879229880">
             <w:r>
               <w:rPr>
                 <w:rStyle w:val="Hyperlink"/>
@@ -316,7 +316,7 @@
               <w:fldChar w:fldCharType="begin"/>
             </w:r>
             <w:r>
-              <w:instrText xml:space="preserve">PAGEREF _Toc1517806272 \h</w:instrText>
+              <w:instrText xml:space="preserve">PAGEREF _Toc879229880 \h</w:instrText>
             </w:r>
             <w:r>
               <w:fldChar w:fldCharType="separate"/>
@@ -325,7 +325,7 @@
               <w:rPr>
                 <w:rStyle w:val="Hyperlink"/>
               </w:rPr>
-              <w:t>1</w:t>
+              <w:t>3</w:t>
             </w:r>
             <w:r>
               <w:fldChar w:fldCharType="end"/>
@@ -339,7 +339,7 @@
               <w:tab w:val="right" w:leader="dot" w:pos="9015"/>
             </w:tabs>
           </w:pPr>
-          <w:hyperlink w:anchor="_Toc1060950956">
+          <w:hyperlink w:anchor="_Toc1407560729">
             <w:r>
               <w:rPr>
                 <w:rStyle w:val="Hyperlink"/>
@@ -353,7 +353,7 @@
               <w:fldChar w:fldCharType="begin"/>
             </w:r>
             <w:r>
-              <w:instrText xml:space="preserve">PAGEREF _Toc1060950956 \h</w:instrText>
+              <w:instrText xml:space="preserve">PAGEREF _Toc1407560729 \h</w:instrText>
             </w:r>
             <w:r>
               <w:fldChar w:fldCharType="separate"/>
@@ -362,7 +362,7 @@
               <w:rPr>
                 <w:rStyle w:val="Hyperlink"/>
               </w:rPr>
-              <w:t>1</w:t>
+              <w:t>3</w:t>
             </w:r>
             <w:r>
               <w:fldChar w:fldCharType="end"/>
@@ -376,7 +376,7 @@
               <w:tab w:val="right" w:leader="dot" w:pos="9015"/>
             </w:tabs>
           </w:pPr>
-          <w:hyperlink w:anchor="_Toc1663264036">
+          <w:hyperlink w:anchor="_Toc27283976">
             <w:r>
               <w:rPr>
                 <w:rStyle w:val="Hyperlink"/>
@@ -390,7 +390,7 @@
               <w:fldChar w:fldCharType="begin"/>
             </w:r>
             <w:r>
-              <w:instrText xml:space="preserve">PAGEREF _Toc1663264036 \h</w:instrText>
+              <w:instrText xml:space="preserve">PAGEREF _Toc27283976 \h</w:instrText>
             </w:r>
             <w:r>
               <w:fldChar w:fldCharType="separate"/>
@@ -399,7 +399,7 @@
               <w:rPr>
                 <w:rStyle w:val="Hyperlink"/>
               </w:rPr>
-              <w:t>2</w:t>
+              <w:t>3</w:t>
             </w:r>
             <w:r>
               <w:fldChar w:fldCharType="end"/>
@@ -413,7 +413,7 @@
               <w:tab w:val="right" w:leader="dot" w:pos="9015"/>
             </w:tabs>
           </w:pPr>
-          <w:hyperlink w:anchor="_Toc77101453">
+          <w:hyperlink w:anchor="_Toc157029606">
             <w:r>
               <w:rPr>
                 <w:rStyle w:val="Hyperlink"/>
@@ -427,7 +427,7 @@
               <w:fldChar w:fldCharType="begin"/>
             </w:r>
             <w:r>
-              <w:instrText xml:space="preserve">PAGEREF _Toc77101453 \h</w:instrText>
+              <w:instrText xml:space="preserve">PAGEREF _Toc157029606 \h</w:instrText>
             </w:r>
             <w:r>
               <w:fldChar w:fldCharType="separate"/>
@@ -436,7 +436,7 @@
               <w:rPr>
                 <w:rStyle w:val="Hyperlink"/>
               </w:rPr>
-              <w:t>3</w:t>
+              <w:t>4</w:t>
             </w:r>
             <w:r>
               <w:fldChar w:fldCharType="end"/>
@@ -450,7 +450,7 @@
               <w:tab w:val="right" w:leader="dot" w:pos="9015"/>
             </w:tabs>
           </w:pPr>
-          <w:hyperlink w:anchor="_Toc81259772">
+          <w:hyperlink w:anchor="_Toc1228673080">
             <w:r>
               <w:rPr>
                 <w:rStyle w:val="Hyperlink"/>
@@ -464,7 +464,7 @@
               <w:fldChar w:fldCharType="begin"/>
             </w:r>
             <w:r>
-              <w:instrText xml:space="preserve">PAGEREF _Toc81259772 \h</w:instrText>
+              <w:instrText xml:space="preserve">PAGEREF _Toc1228673080 \h</w:instrText>
             </w:r>
             <w:r>
               <w:fldChar w:fldCharType="separate"/>
@@ -473,7 +473,7 @@
               <w:rPr>
                 <w:rStyle w:val="Hyperlink"/>
               </w:rPr>
-              <w:t>3</w:t>
+              <w:t>4</w:t>
             </w:r>
             <w:r>
               <w:fldChar w:fldCharType="end"/>
@@ -487,7 +487,7 @@
               <w:tab w:val="right" w:leader="dot" w:pos="9015"/>
             </w:tabs>
           </w:pPr>
-          <w:hyperlink w:anchor="_Toc2133818568">
+          <w:hyperlink w:anchor="_Toc97740711">
             <w:r>
               <w:rPr>
                 <w:rStyle w:val="Hyperlink"/>
@@ -501,7 +501,7 @@
               <w:fldChar w:fldCharType="begin"/>
             </w:r>
             <w:r>
-              <w:instrText xml:space="preserve">PAGEREF _Toc2133818568 \h</w:instrText>
+              <w:instrText xml:space="preserve">PAGEREF _Toc97740711 \h</w:instrText>
             </w:r>
             <w:r>
               <w:fldChar w:fldCharType="separate"/>
@@ -510,7 +510,7 @@
               <w:rPr>
                 <w:rStyle w:val="Hyperlink"/>
               </w:rPr>
-              <w:t>3</w:t>
+              <w:t>4</w:t>
             </w:r>
             <w:r>
               <w:fldChar w:fldCharType="end"/>
@@ -532,7 +532,7 @@
           <w:bCs w:val="1"/>
         </w:rPr>
       </w:pPr>
-      <w:bookmarkStart w:name="_Toc544508615" w:id="148542406"/>
+      <w:bookmarkStart w:name="_Toc798708136" w:id="772364370"/>
       <w:r>
         <w:rPr>
           <w:b w:val="1"/>
@@ -540,18 +540,18 @@
         </w:rPr>
         <w:t>Licencia</w:t>
       </w:r>
-      <w:bookmarkEnd w:id="148542406"/>
+      <w:bookmarkEnd w:id="772364370"/>
     </w:p>
     <w:p>
       <w:pPr>
         <w:pStyle w:val="Heading2"/>
       </w:pPr>
-      <w:bookmarkStart w:name="_Toc859196054" w:id="610359836"/>
+      <w:bookmarkStart w:name="_Toc1509843913" w:id="312327123"/>
       <w:r>
         <w:rPr/>
         <w:t>Licencia de la aplicación</w:t>
       </w:r>
-      <w:bookmarkEnd w:id="610359836"/>
+      <w:bookmarkEnd w:id="312327123"/>
     </w:p>
     <w:p>
       <w:pPr>
@@ -576,42 +576,97 @@
     <w:p>
       <w:pPr>
         <w:pStyle w:val="Normal"/>
-        <w:rPr>
-          <w:u w:val="single"/>
-        </w:rPr>
-      </w:pPr>
+        <w:suppressLineNumbers w:val="0"/>
+        <w:bidi w:val="0"/>
+        <w:spacing w:before="0" w:beforeAutospacing="off" w:after="160" w:afterAutospacing="off" w:line="279" w:lineRule="auto"/>
+        <w:ind w:left="0" w:right="0"/>
+        <w:jc w:val="left"/>
+        <w:rPr>
+          <w:i w:val="1"/>
+          <w:iCs w:val="1"/>
+          <w:u w:val="none"/>
+        </w:rPr>
+      </w:pPr>
+      <w:r>
+        <w:rPr>
+          <w:i w:val="1"/>
+          <w:iCs w:val="1"/>
+          <w:u w:val="none"/>
+        </w:rPr>
+        <w:t>Est</w:t>
+      </w:r>
+      <w:r>
+        <w:rPr>
+          <w:i w:val="1"/>
+          <w:iCs w:val="1"/>
+          <w:u w:val="none"/>
+        </w:rPr>
+        <w:t>a</w:t>
+      </w:r>
+      <w:r>
+        <w:rPr>
+          <w:i w:val="1"/>
+          <w:iCs w:val="1"/>
+          <w:u w:val="none"/>
+        </w:rPr>
+        <w:t xml:space="preserve"> aplicación se distribuye bajo una licencia </w:t>
+      </w:r>
+      <w:bookmarkStart w:name="_Int_Mm7s96Jj" w:id="1175264736"/>
+      <w:r>
+        <w:rPr>
+          <w:i w:val="1"/>
+          <w:iCs w:val="1"/>
+          <w:u w:val="none"/>
+        </w:rPr>
+        <w:t>MIT</w:t>
+      </w:r>
+      <w:bookmarkStart w:name="_Int_PZUOkQCq" w:id="1312044779"/>
+      <w:r>
+        <w:rPr>
+          <w:i w:val="1"/>
+          <w:iCs w:val="1"/>
+          <w:u w:val="none"/>
+        </w:rPr>
+        <w:t>.</w:t>
+      </w:r>
+      <w:bookmarkEnd w:id="1312044779"/>
+      <w:bookmarkEnd w:id="1175264736"/>
     </w:p>
     <w:p>
       <w:pPr>
         <w:pStyle w:val="Normal"/>
-        <w:rPr>
-          <w:u w:val="single"/>
-        </w:rPr>
-      </w:pPr>
-      <w:r>
-        <w:rPr>
-          <w:u w:val="single"/>
-        </w:rPr>
-        <w:t>Licencia de Creative Commons</w:t>
+        <w:suppressLineNumbers w:val="0"/>
+        <w:bidi w:val="0"/>
+        <w:spacing w:before="0" w:beforeAutospacing="off" w:after="160" w:afterAutospacing="off" w:line="279" w:lineRule="auto"/>
+        <w:ind w:left="0" w:right="0"/>
+        <w:jc w:val="left"/>
+        <w:rPr>
+          <w:i w:val="1"/>
+          <w:iCs w:val="1"/>
+          <w:u w:val="none"/>
+        </w:rPr>
+      </w:pPr>
+      <w:r>
+        <w:rPr>
+          <w:i w:val="1"/>
+          <w:iCs w:val="1"/>
+          <w:u w:val="none"/>
+        </w:rPr>
+        <w:t>Esto es así ya que queremos que nuestro programa sea de uso libre</w:t>
+      </w:r>
+      <w:r>
+        <w:rPr>
+          <w:i w:val="1"/>
+          <w:iCs w:val="1"/>
+          <w:u w:val="none"/>
+        </w:rPr>
+        <w:t>, y su licencia lo más simple posible; pero también queremos que siempre se nos dé crédito como creadores del programa original.</w:t>
       </w:r>
     </w:p>
     <w:p>
       <w:pPr>
         <w:pStyle w:val="Normal"/>
-        <w:rPr>
-          <w:i w:val="1"/>
-          <w:iCs w:val="1"/>
-          <w:u w:val="single"/>
-        </w:rPr>
-      </w:pPr>
-      <w:r>
-        <w:rPr>
-          <w:i w:val="1"/>
-          <w:iCs w:val="1"/>
-          <w:u w:val="single"/>
-        </w:rPr>
-        <w:t>https://creativecommons.org/chooser/</w:t>
-      </w:r>
+      </w:pPr>
     </w:p>
     <w:p>
       <w:pPr>
@@ -630,14 +685,9 @@
     </w:p>
     <w:p>
       <w:pPr>
-        <w:pStyle w:val="Normal"/>
-      </w:pPr>
-    </w:p>
-    <w:p>
-      <w:pPr>
         <w:pStyle w:val="Heading2"/>
       </w:pPr>
-      <w:bookmarkStart w:name="_Toc820899969" w:id="331534152"/>
+      <w:bookmarkStart w:name="_Toc905451803" w:id="2058945873"/>
       <w:r>
         <w:rPr/>
         <w:t>Otros tipos de licencia</w:t>
@@ -646,11 +696,16 @@
         <w:rPr/>
         <w:t xml:space="preserve"> de software</w:t>
       </w:r>
-      <w:bookmarkEnd w:id="331534152"/>
+      <w:bookmarkEnd w:id="2058945873"/>
     </w:p>
     <w:p>
       <w:pPr>
         <w:pStyle w:val="Normal"/>
+        <w:suppressLineNumbers w:val="0"/>
+        <w:bidi w:val="0"/>
+        <w:spacing w:before="0" w:beforeAutospacing="off" w:after="160" w:afterAutospacing="off" w:line="279" w:lineRule="auto"/>
+        <w:ind w:left="0" w:right="0"/>
+        <w:jc w:val="left"/>
         <w:rPr>
           <w:i w:val="1"/>
           <w:iCs w:val="1"/>
@@ -660,20 +715,22 @@
         <w:rPr>
           <w:u w:val="single"/>
         </w:rPr>
-        <w:t xml:space="preserve">Código </w:t>
+        <w:t xml:space="preserve">Software </w:t>
+      </w:r>
+      <w:bookmarkStart w:name="_Int_Vri9LjKR" w:id="333783046"/>
+      <w:r>
+        <w:rPr>
+          <w:u w:val="single"/>
+        </w:rPr>
+        <w:t>propietario</w:t>
       </w:r>
       <w:bookmarkStart w:name="_Int_BNGyn2rD" w:id="804433918"/>
-      <w:r>
-        <w:rPr>
-          <w:u w:val="single"/>
-        </w:rPr>
-        <w:t>cerrado</w:t>
-      </w:r>
       <w:r>
         <w:rPr/>
         <w:t xml:space="preserve"> :</w:t>
       </w:r>
       <w:bookmarkEnd w:id="804433918"/>
+      <w:bookmarkEnd w:id="333783046"/>
       <w:r>
         <w:rPr/>
         <w:t xml:space="preserve"> </w:t>
@@ -745,7 +802,6 @@
         </w:rPr>
         <w:t xml:space="preserve">Adobe </w:t>
       </w:r>
-      <w:bookmarkStart w:name="_Int_hKjV3oYq" w:id="1820288658"/>
       <w:bookmarkStart w:name="_Int_Onu0VE9h" w:id="1899355236"/>
       <w:r>
         <w:rPr>
@@ -778,11 +834,15 @@
         </w:rPr>
         <w:t>La licencia es de pago, pero caduca y se tiene que renovar a través de una suscripción.</w:t>
       </w:r>
-      <w:bookmarkEnd w:id="1820288658"/>
     </w:p>
     <w:p>
       <w:pPr>
         <w:pStyle w:val="Normal"/>
+        <w:suppressLineNumbers w:val="0"/>
+        <w:bidi w:val="0"/>
+        <w:spacing w:before="0" w:beforeAutospacing="off" w:after="160" w:afterAutospacing="off" w:line="279" w:lineRule="auto"/>
+        <w:ind w:left="0" w:right="0"/>
+        <w:jc w:val="left"/>
         <w:rPr>
           <w:i w:val="1"/>
           <w:iCs w:val="1"/>
@@ -794,28 +854,14 @@
           <w:u w:val="single"/>
           <w:lang w:val="en-US"/>
         </w:rPr>
-        <w:t xml:space="preserve">Código </w:t>
+        <w:t>C</w:t>
       </w:r>
       <w:r>
         <w:rPr>
           <w:u w:val="single"/>
           <w:lang w:val="en-US"/>
         </w:rPr>
-        <w:t>abierto</w:t>
-      </w:r>
-      <w:r>
-        <w:rPr>
-          <w:u w:val="single"/>
-          <w:lang w:val="en-US"/>
-        </w:rPr>
-        <w:t xml:space="preserve"> robustas </w:t>
-      </w:r>
-      <w:r>
-        <w:rPr>
-          <w:u w:val="single"/>
-          <w:lang w:val="en-US"/>
-        </w:rPr>
-        <w:t>fuertes</w:t>
+        <w:t>opyleft fuerte</w:t>
       </w:r>
       <w:r>
         <w:rPr>
@@ -833,11 +879,6 @@
     <w:p>
       <w:pPr>
         <w:pStyle w:val="Normal"/>
-        <w:rPr>
-          <w:i w:val="1"/>
-          <w:iCs w:val="1"/>
-          <w:lang w:val="es-ES"/>
-        </w:rPr>
       </w:pPr>
       <w:r>
         <w:rPr>
@@ -869,7 +910,7 @@
         </w:rPr>
         <w:t xml:space="preserve"> v. </w:t>
       </w:r>
-      <w:bookmarkStart w:name="_Int_QcWw9Dl5" w:id="492922352"/>
+      <w:bookmarkStart w:name="_Int_LTK0zGtF" w:id="1825119616"/>
       <w:r>
         <w:rPr>
           <w:b w:val="1"/>
@@ -878,28 +919,9 @@
           <w:iCs w:val="1"/>
           <w:lang w:val="es-ES"/>
         </w:rPr>
-        <w:t>2.0.</w:t>
-      </w:r>
-      <w:r>
-        <w:rPr>
-          <w:i w:val="1"/>
-          <w:iCs w:val="1"/>
-          <w:lang w:val="es-ES"/>
-        </w:rPr>
-        <w:t xml:space="preserve"> :</w:t>
-      </w:r>
-      <w:bookmarkEnd w:id="492922352"/>
-      <w:r>
-        <w:rPr>
-          <w:i w:val="1"/>
-          <w:iCs w:val="1"/>
-          <w:lang w:val="es-ES"/>
-        </w:rPr>
-        <w:t xml:space="preserve"> Copyleft</w:t>
-      </w:r>
-      <w:r>
-        <w:br/>
-      </w:r>
+        <w:t>3</w:t>
+      </w:r>
+      <w:bookmarkStart w:name="_Int_QcWw9Dl5" w:id="492922352"/>
       <w:r>
         <w:rPr>
           <w:b w:val="1"/>
@@ -908,7 +930,52 @@
           <w:iCs w:val="1"/>
           <w:lang w:val="es-ES"/>
         </w:rPr>
-        <w:t xml:space="preserve">Eclipse Public </w:t>
+        <w:t>.0.</w:t>
+      </w:r>
+      <w:r>
+        <w:rPr>
+          <w:i w:val="1"/>
+          <w:iCs w:val="1"/>
+          <w:lang w:val="es-ES"/>
+        </w:rPr>
+        <w:t xml:space="preserve"> :</w:t>
+      </w:r>
+      <w:bookmarkEnd w:id="492922352"/>
+      <w:bookmarkEnd w:id="1825119616"/>
+      <w:r>
+        <w:rPr>
+          <w:i w:val="1"/>
+          <w:iCs w:val="1"/>
+          <w:lang w:val="es-ES"/>
+        </w:rPr>
+        <w:t xml:space="preserve"> </w:t>
+      </w:r>
+      <w:r>
+        <w:rPr>
+          <w:i w:val="1"/>
+          <w:iCs w:val="1"/>
+          <w:lang w:val="es-ES"/>
+        </w:rPr>
+        <w:t xml:space="preserve">El software puede usarse </w:t>
+      </w:r>
+      <w:r>
+        <w:rPr>
+          <w:i w:val="1"/>
+          <w:iCs w:val="1"/>
+          <w:lang w:val="es-ES"/>
+        </w:rPr>
+        <w:t>bajo unas condiciones mínimas</w:t>
+      </w:r>
+      <w:r>
+        <w:rPr>
+          <w:i w:val="1"/>
+          <w:iCs w:val="1"/>
+          <w:lang w:val="es-ES"/>
+        </w:rPr>
+        <w:t>, pero cualquier derivado debe mantener las mismas libertades.</w:t>
+      </w:r>
+      <w:r>
+        <w:br/>
       </w:r>
       <w:r>
         <w:rPr>
@@ -918,26 +985,7 @@
           <w:iCs w:val="1"/>
           <w:lang w:val="es-ES"/>
         </w:rPr>
-        <w:t>License</w:t>
-      </w:r>
-      <w:r>
-        <w:rPr>
-          <w:i w:val="1"/>
-          <w:iCs w:val="1"/>
-          <w:lang w:val="es-ES"/>
-        </w:rPr>
-        <w:t xml:space="preserve"> :</w:t>
-      </w:r>
-      <w:r>
-        <w:rPr>
-          <w:i w:val="1"/>
-          <w:iCs w:val="1"/>
-          <w:lang w:val="es-ES"/>
-        </w:rPr>
-        <w:t xml:space="preserve"> Código abierto. Permite uso comercial. Mantener derechos de autor.</w:t>
-      </w:r>
-      <w:r>
-        <w:br/>
+        <w:t xml:space="preserve">Eclipse Public </w:t>
       </w:r>
       <w:r>
         <w:rPr>
@@ -947,9 +995,137 @@
           <w:iCs w:val="1"/>
           <w:lang w:val="es-ES"/>
         </w:rPr>
-        <w:t xml:space="preserve">OpenSSL </w:t>
-      </w:r>
-      <w:bookmarkStart w:name="_Int_GoY55r2F" w:id="1940586703"/>
+        <w:t>License</w:t>
+      </w:r>
+      <w:r>
+        <w:rPr>
+          <w:i w:val="1"/>
+          <w:iCs w:val="1"/>
+          <w:lang w:val="es-ES"/>
+        </w:rPr>
+        <w:t xml:space="preserve"> :</w:t>
+      </w:r>
+      <w:r>
+        <w:rPr>
+          <w:i w:val="1"/>
+          <w:iCs w:val="1"/>
+          <w:lang w:val="es-ES"/>
+        </w:rPr>
+        <w:t xml:space="preserve"> </w:t>
+      </w:r>
+      <w:r>
+        <w:rPr>
+          <w:i w:val="1"/>
+          <w:iCs w:val="1"/>
+          <w:lang w:val="es-ES"/>
+        </w:rPr>
+        <w:t xml:space="preserve">El software puede usarse </w:t>
+      </w:r>
+      <w:r>
+        <w:rPr>
+          <w:i w:val="1"/>
+          <w:iCs w:val="1"/>
+          <w:lang w:val="es-ES"/>
+        </w:rPr>
+        <w:t>bajo unas condiciones mínimas</w:t>
+      </w:r>
+      <w:r>
+        <w:rPr>
+          <w:i w:val="1"/>
+          <w:iCs w:val="1"/>
+          <w:lang w:val="es-ES"/>
+        </w:rPr>
+        <w:t>, pero</w:t>
+      </w:r>
+      <w:r>
+        <w:rPr>
+          <w:i w:val="1"/>
+          <w:iCs w:val="1"/>
+          <w:lang w:val="es-ES"/>
+        </w:rPr>
+        <w:t xml:space="preserve"> un derivado puede combinar partes de código abierto con partes de código cerrado</w:t>
+      </w:r>
+      <w:r>
+        <w:rPr>
+          <w:i w:val="1"/>
+          <w:iCs w:val="1"/>
+          <w:lang w:val="es-ES"/>
+        </w:rPr>
+        <w:t xml:space="preserve"> (No tiene </w:t>
+      </w:r>
+      <w:bookmarkStart w:name="_Int_mo6XNs1U" w:id="1743440449"/>
+      <w:r>
+        <w:rPr>
+          <w:i w:val="1"/>
+          <w:iCs w:val="1"/>
+          <w:lang w:val="es-ES"/>
+        </w:rPr>
+        <w:t>por qu</w:t>
+      </w:r>
+      <w:r>
+        <w:rPr>
+          <w:i w:val="1"/>
+          <w:iCs w:val="1"/>
+          <w:lang w:val="es-ES"/>
+        </w:rPr>
+        <w:t>é</w:t>
+      </w:r>
+      <w:bookmarkEnd w:id="1743440449"/>
+      <w:r>
+        <w:rPr>
+          <w:i w:val="1"/>
+          <w:iCs w:val="1"/>
+          <w:lang w:val="es-ES"/>
+        </w:rPr>
+        <w:t xml:space="preserve"> afectar a todo el proyecto)</w:t>
+      </w:r>
+      <w:r>
+        <w:rPr>
+          <w:i w:val="1"/>
+          <w:iCs w:val="1"/>
+          <w:lang w:val="es-ES"/>
+        </w:rPr>
+        <w:t>.</w:t>
+      </w:r>
+    </w:p>
+    <w:p>
+      <w:pPr>
+        <w:pStyle w:val="Normal"/>
+        <w:suppressLineNumbers w:val="0"/>
+        <w:bidi w:val="0"/>
+        <w:spacing w:before="0" w:beforeAutospacing="off" w:after="160" w:afterAutospacing="off" w:line="279" w:lineRule="auto"/>
+        <w:ind w:left="0" w:right="0"/>
+        <w:jc w:val="left"/>
+      </w:pPr>
+      <w:r>
+        <w:rPr>
+          <w:u w:val="single"/>
+        </w:rPr>
+        <w:t xml:space="preserve">Copyleft </w:t>
+      </w:r>
+      <w:bookmarkStart w:name="_Int_geqKrWBl" w:id="262962573"/>
+      <w:r>
+        <w:rPr>
+          <w:u w:val="single"/>
+        </w:rPr>
+        <w:t>débil</w:t>
+      </w:r>
+      <w:bookmarkStart w:name="_Int_pXWCEQrJ" w:id="902082552"/>
+      <w:r>
+        <w:rPr/>
+        <w:t xml:space="preserve"> :</w:t>
+      </w:r>
+      <w:bookmarkEnd w:id="902082552"/>
+      <w:bookmarkEnd w:id="262962573"/>
+      <w:r>
+        <w:rPr/>
+        <w:t xml:space="preserve"> </w:t>
+      </w:r>
+    </w:p>
+    <w:p>
+      <w:pPr>
+        <w:pStyle w:val="Normal"/>
+      </w:pPr>
       <w:r>
         <w:rPr>
           <w:b w:val="1"/>
@@ -958,25 +1134,544 @@
           <w:iCs w:val="1"/>
           <w:lang w:val="es-ES"/>
         </w:rPr>
+        <w:t xml:space="preserve">Apache </w:t>
+      </w:r>
+      <w:r>
+        <w:rPr>
+          <w:b w:val="1"/>
+          <w:bCs w:val="1"/>
+          <w:i w:val="1"/>
+          <w:iCs w:val="1"/>
+          <w:lang w:val="es-ES"/>
+        </w:rPr>
         <w:t>License</w:t>
       </w:r>
       <w:r>
         <w:rPr>
+          <w:b w:val="1"/>
+          <w:bCs w:val="1"/>
           <w:i w:val="1"/>
           <w:iCs w:val="1"/>
           <w:lang w:val="es-ES"/>
         </w:rPr>
+        <w:t xml:space="preserve"> v </w:t>
+      </w:r>
+      <w:bookmarkStart w:name="_Int_U7HCu94M" w:id="191233352"/>
+      <w:r>
+        <w:rPr>
+          <w:b w:val="1"/>
+          <w:bCs w:val="1"/>
+          <w:i w:val="1"/>
+          <w:iCs w:val="1"/>
+          <w:lang w:val="es-ES"/>
+        </w:rPr>
+        <w:t>2.0.</w:t>
+      </w:r>
+      <w:r>
+        <w:rPr>
+          <w:i w:val="1"/>
+          <w:iCs w:val="1"/>
+          <w:lang w:val="es-ES"/>
+        </w:rPr>
         <w:t xml:space="preserve"> :</w:t>
       </w:r>
+      <w:bookmarkEnd w:id="191233352"/>
       <w:r>
         <w:rPr>
           <w:i w:val="1"/>
           <w:iCs w:val="1"/>
           <w:lang w:val="es-ES"/>
         </w:rPr>
-        <w:t xml:space="preserve"> (Apache License 2.0)</w:t>
-      </w:r>
-      <w:bookmarkEnd w:id="1940586703"/>
+        <w:t xml:space="preserve"> El software puede usarse bajo unas condiciones mínimas, pero siempre manteniendo los avisos de los derechos de autor y el texto de la licencia. La licencia es muy detallada y da más seguridad jurídica.</w:t>
+      </w:r>
+      <w:r>
+        <w:br/>
+      </w:r>
+      <w:r>
+        <w:rPr>
+          <w:b w:val="1"/>
+          <w:bCs w:val="1"/>
+          <w:i w:val="1"/>
+          <w:iCs w:val="1"/>
+          <w:lang w:val="en-US"/>
+        </w:rPr>
+        <w:t xml:space="preserve">Mozilla Public </w:t>
+      </w:r>
+      <w:bookmarkStart w:name="_Int_iHhWgWn9" w:id="771899124"/>
+      <w:r>
+        <w:rPr>
+          <w:b w:val="1"/>
+          <w:bCs w:val="1"/>
+          <w:i w:val="1"/>
+          <w:iCs w:val="1"/>
+          <w:lang w:val="en-US"/>
+        </w:rPr>
+        <w:t>License</w:t>
+      </w:r>
+      <w:r>
+        <w:rPr>
+          <w:i w:val="1"/>
+          <w:iCs w:val="1"/>
+          <w:lang w:val="en-US"/>
+        </w:rPr>
+        <w:t xml:space="preserve"> :</w:t>
+      </w:r>
+      <w:bookmarkEnd w:id="771899124"/>
+      <w:r>
+        <w:rPr>
+          <w:i w:val="1"/>
+          <w:iCs w:val="1"/>
+          <w:lang w:val="en-US"/>
+        </w:rPr>
+        <w:t xml:space="preserve"> </w:t>
+      </w:r>
+      <w:r>
+        <w:rPr>
+          <w:i w:val="1"/>
+          <w:iCs w:val="1"/>
+          <w:lang w:val="en-US"/>
+        </w:rPr>
+        <w:t xml:space="preserve">El software </w:t>
+      </w:r>
+      <w:r>
+        <w:rPr>
+          <w:i w:val="1"/>
+          <w:iCs w:val="1"/>
+          <w:lang w:val="en-US"/>
+        </w:rPr>
+        <w:t>puede</w:t>
+      </w:r>
+      <w:r>
+        <w:rPr>
+          <w:i w:val="1"/>
+          <w:iCs w:val="1"/>
+          <w:lang w:val="en-US"/>
+        </w:rPr>
+        <w:t xml:space="preserve"> </w:t>
+      </w:r>
+      <w:r>
+        <w:rPr>
+          <w:i w:val="1"/>
+          <w:iCs w:val="1"/>
+          <w:lang w:val="en-US"/>
+        </w:rPr>
+        <w:t>usarse</w:t>
+      </w:r>
+      <w:r>
+        <w:rPr>
+          <w:i w:val="1"/>
+          <w:iCs w:val="1"/>
+          <w:lang w:val="es-ES"/>
+        </w:rPr>
+        <w:t xml:space="preserve"> bajo unas condiciones mínimas</w:t>
+      </w:r>
+      <w:r>
+        <w:rPr>
+          <w:i w:val="1"/>
+          <w:iCs w:val="1"/>
+          <w:lang w:val="en-US"/>
+        </w:rPr>
+        <w:t xml:space="preserve">. También se </w:t>
+      </w:r>
+      <w:r>
+        <w:rPr>
+          <w:i w:val="1"/>
+          <w:iCs w:val="1"/>
+          <w:lang w:val="en-US"/>
+        </w:rPr>
+        <w:t>puede</w:t>
+      </w:r>
+      <w:r>
+        <w:rPr>
+          <w:i w:val="1"/>
+          <w:iCs w:val="1"/>
+          <w:lang w:val="en-US"/>
+        </w:rPr>
+        <w:t xml:space="preserve"> </w:t>
+      </w:r>
+      <w:r>
+        <w:rPr>
+          <w:i w:val="1"/>
+          <w:iCs w:val="1"/>
+          <w:lang w:val="en-US"/>
+        </w:rPr>
+        <w:t>insertar</w:t>
+      </w:r>
+      <w:r>
+        <w:rPr>
+          <w:i w:val="1"/>
+          <w:iCs w:val="1"/>
+          <w:lang w:val="en-US"/>
+        </w:rPr>
+        <w:t xml:space="preserve"> </w:t>
+      </w:r>
+      <w:r>
+        <w:rPr>
+          <w:i w:val="1"/>
+          <w:iCs w:val="1"/>
+          <w:lang w:val="en-US"/>
+        </w:rPr>
+        <w:t>en</w:t>
+      </w:r>
+      <w:r>
+        <w:rPr>
+          <w:i w:val="1"/>
+          <w:iCs w:val="1"/>
+          <w:lang w:val="en-US"/>
+        </w:rPr>
+        <w:t xml:space="preserve"> un </w:t>
+      </w:r>
+      <w:r>
+        <w:rPr>
+          <w:i w:val="1"/>
+          <w:iCs w:val="1"/>
+          <w:lang w:val="en-US"/>
+        </w:rPr>
+        <w:t>proyecto</w:t>
+      </w:r>
+      <w:r>
+        <w:rPr>
+          <w:i w:val="1"/>
+          <w:iCs w:val="1"/>
+          <w:lang w:val="en-US"/>
+        </w:rPr>
+        <w:t xml:space="preserve"> de </w:t>
+      </w:r>
+      <w:r>
+        <w:rPr>
+          <w:i w:val="1"/>
+          <w:iCs w:val="1"/>
+          <w:lang w:val="en-US"/>
+        </w:rPr>
+        <w:t>código</w:t>
+      </w:r>
+      <w:r>
+        <w:rPr>
+          <w:i w:val="1"/>
+          <w:iCs w:val="1"/>
+          <w:lang w:val="en-US"/>
+        </w:rPr>
+        <w:t xml:space="preserve"> </w:t>
+      </w:r>
+      <w:r>
+        <w:rPr>
+          <w:i w:val="1"/>
+          <w:iCs w:val="1"/>
+          <w:lang w:val="en-US"/>
+        </w:rPr>
+        <w:t>cerrado</w:t>
+      </w:r>
+      <w:r>
+        <w:rPr>
+          <w:i w:val="1"/>
+          <w:iCs w:val="1"/>
+          <w:lang w:val="en-US"/>
+        </w:rPr>
+        <w:t xml:space="preserve"> </w:t>
+      </w:r>
+      <w:r>
+        <w:rPr>
+          <w:i w:val="1"/>
+          <w:iCs w:val="1"/>
+          <w:lang w:val="es-ES"/>
+        </w:rPr>
+        <w:t xml:space="preserve">(No tiene </w:t>
+      </w:r>
+      <w:bookmarkStart w:name="_Int_bjfWwamN" w:id="1539482335"/>
+      <w:r>
+        <w:rPr>
+          <w:i w:val="1"/>
+          <w:iCs w:val="1"/>
+          <w:lang w:val="es-ES"/>
+        </w:rPr>
+        <w:t>por qué</w:t>
+      </w:r>
+      <w:bookmarkEnd w:id="1539482335"/>
+      <w:r>
+        <w:rPr>
+          <w:i w:val="1"/>
+          <w:iCs w:val="1"/>
+          <w:lang w:val="es-ES"/>
+        </w:rPr>
+        <w:t xml:space="preserve"> afectar a todo el proyecto)</w:t>
+      </w:r>
+      <w:r>
+        <w:rPr>
+          <w:i w:val="1"/>
+          <w:iCs w:val="1"/>
+          <w:lang w:val="en-US"/>
+        </w:rPr>
+        <w:t>.</w:t>
+      </w:r>
+      <w:r>
+        <w:br/>
+      </w:r>
+      <w:r>
+        <w:rPr>
+          <w:b w:val="1"/>
+          <w:bCs w:val="1"/>
+          <w:i w:val="1"/>
+          <w:iCs w:val="1"/>
+          <w:lang w:val="en-US"/>
+        </w:rPr>
+        <w:t>EUPL</w:t>
+      </w:r>
+      <w:r>
+        <w:rPr>
+          <w:i w:val="1"/>
+          <w:iCs w:val="1"/>
+          <w:lang w:val="en-US"/>
+        </w:rPr>
+        <w:t xml:space="preserve"> :</w:t>
+      </w:r>
+      <w:r>
+        <w:rPr>
+          <w:i w:val="1"/>
+          <w:iCs w:val="1"/>
+          <w:lang w:val="en-US"/>
+        </w:rPr>
+        <w:t xml:space="preserve"> Esta es la </w:t>
+      </w:r>
+      <w:r>
+        <w:rPr>
+          <w:i w:val="1"/>
+          <w:iCs w:val="1"/>
+          <w:lang w:val="en-US"/>
+        </w:rPr>
+        <w:t>Licencia</w:t>
+      </w:r>
+      <w:r>
+        <w:rPr>
+          <w:i w:val="1"/>
+          <w:iCs w:val="1"/>
+          <w:lang w:val="en-US"/>
+        </w:rPr>
+        <w:t xml:space="preserve"> Pública de la Unión Europea.</w:t>
+      </w:r>
+      <w:r>
+        <w:rPr>
+          <w:i w:val="1"/>
+          <w:iCs w:val="1"/>
+          <w:lang w:val="en-US"/>
+        </w:rPr>
+        <w:t xml:space="preserve"> </w:t>
+      </w:r>
+      <w:r>
+        <w:rPr>
+          <w:i w:val="1"/>
+          <w:iCs w:val="1"/>
+          <w:lang w:val="en-US"/>
+        </w:rPr>
+        <w:t>Permite</w:t>
+      </w:r>
+      <w:r>
+        <w:rPr>
+          <w:i w:val="1"/>
+          <w:iCs w:val="1"/>
+          <w:lang w:val="en-US"/>
+        </w:rPr>
+        <w:t xml:space="preserve"> </w:t>
+      </w:r>
+      <w:r>
+        <w:rPr>
+          <w:i w:val="1"/>
+          <w:iCs w:val="1"/>
+          <w:lang w:val="en-US"/>
+        </w:rPr>
+        <w:t>utilizar</w:t>
+      </w:r>
+      <w:r>
+        <w:rPr>
+          <w:i w:val="1"/>
+          <w:iCs w:val="1"/>
+          <w:lang w:val="en-US"/>
+        </w:rPr>
+        <w:t xml:space="preserve"> </w:t>
+      </w:r>
+      <w:r>
+        <w:rPr>
+          <w:i w:val="1"/>
+          <w:iCs w:val="1"/>
+          <w:lang w:val="en-US"/>
+        </w:rPr>
+        <w:t>el</w:t>
+      </w:r>
+      <w:r>
+        <w:rPr>
+          <w:i w:val="1"/>
+          <w:iCs w:val="1"/>
+          <w:lang w:val="en-US"/>
+        </w:rPr>
+        <w:t xml:space="preserve"> software </w:t>
+      </w:r>
+      <w:r>
+        <w:rPr>
+          <w:i w:val="1"/>
+          <w:iCs w:val="1"/>
+          <w:lang w:val="es-ES"/>
+        </w:rPr>
+        <w:t>bajo unas condiciones mínimas</w:t>
+      </w:r>
+      <w:r>
+        <w:rPr>
+          <w:i w:val="1"/>
+          <w:iCs w:val="1"/>
+          <w:lang w:val="en-US"/>
+        </w:rPr>
+        <w:t xml:space="preserve">, </w:t>
+      </w:r>
+      <w:r>
+        <w:rPr>
+          <w:i w:val="1"/>
+          <w:iCs w:val="1"/>
+          <w:lang w:val="en-US"/>
+        </w:rPr>
+        <w:t>manteniendo</w:t>
+      </w:r>
+      <w:r>
+        <w:rPr>
+          <w:i w:val="1"/>
+          <w:iCs w:val="1"/>
+          <w:lang w:val="en-US"/>
+        </w:rPr>
+        <w:t xml:space="preserve"> </w:t>
+      </w:r>
+      <w:r>
+        <w:rPr>
+          <w:i w:val="1"/>
+          <w:iCs w:val="1"/>
+          <w:lang w:val="en-US"/>
+        </w:rPr>
+        <w:t>siempre</w:t>
+      </w:r>
+      <w:r>
+        <w:rPr>
+          <w:i w:val="1"/>
+          <w:iCs w:val="1"/>
+          <w:lang w:val="en-US"/>
+        </w:rPr>
+        <w:t xml:space="preserve"> la </w:t>
+      </w:r>
+      <w:r>
+        <w:rPr>
+          <w:i w:val="1"/>
+          <w:iCs w:val="1"/>
+          <w:lang w:val="en-US"/>
+        </w:rPr>
+        <w:t>licencia</w:t>
+      </w:r>
+      <w:r>
+        <w:rPr>
+          <w:i w:val="1"/>
+          <w:iCs w:val="1"/>
+          <w:lang w:val="en-US"/>
+        </w:rPr>
+        <w:t xml:space="preserve"> original. </w:t>
+      </w:r>
+      <w:r>
+        <w:rPr>
+          <w:i w:val="1"/>
+          <w:iCs w:val="1"/>
+          <w:lang w:val="en-US"/>
+        </w:rPr>
+        <w:t>Está</w:t>
+      </w:r>
+      <w:r>
+        <w:rPr>
+          <w:i w:val="1"/>
+          <w:iCs w:val="1"/>
+          <w:lang w:val="en-US"/>
+        </w:rPr>
+        <w:t xml:space="preserve"> </w:t>
+      </w:r>
+      <w:r>
+        <w:rPr>
+          <w:i w:val="1"/>
+          <w:iCs w:val="1"/>
+          <w:lang w:val="en-US"/>
+        </w:rPr>
+        <w:t>diseñada</w:t>
+      </w:r>
+      <w:r>
+        <w:rPr>
+          <w:i w:val="1"/>
+          <w:iCs w:val="1"/>
+          <w:lang w:val="en-US"/>
+        </w:rPr>
+        <w:t xml:space="preserve"> para ser compatible con las </w:t>
+      </w:r>
+      <w:r>
+        <w:rPr>
+          <w:i w:val="1"/>
+          <w:iCs w:val="1"/>
+          <w:lang w:val="en-US"/>
+        </w:rPr>
+        <w:t>leyes</w:t>
+      </w:r>
+      <w:r>
+        <w:rPr>
+          <w:i w:val="1"/>
+          <w:iCs w:val="1"/>
+          <w:lang w:val="en-US"/>
+        </w:rPr>
+        <w:t xml:space="preserve"> de </w:t>
+      </w:r>
+      <w:r>
+        <w:rPr>
+          <w:i w:val="1"/>
+          <w:iCs w:val="1"/>
+          <w:lang w:val="en-US"/>
+        </w:rPr>
+        <w:t>los</w:t>
+      </w:r>
+      <w:r>
+        <w:rPr>
+          <w:i w:val="1"/>
+          <w:iCs w:val="1"/>
+          <w:lang w:val="en-US"/>
+        </w:rPr>
+        <w:t xml:space="preserve"> </w:t>
+      </w:r>
+      <w:r>
+        <w:rPr>
+          <w:i w:val="1"/>
+          <w:iCs w:val="1"/>
+          <w:lang w:val="en-US"/>
+        </w:rPr>
+        <w:t>países</w:t>
+      </w:r>
+      <w:r>
+        <w:rPr>
+          <w:i w:val="1"/>
+          <w:iCs w:val="1"/>
+          <w:lang w:val="en-US"/>
+        </w:rPr>
+        <w:t xml:space="preserve"> </w:t>
+      </w:r>
+      <w:r>
+        <w:rPr>
+          <w:i w:val="1"/>
+          <w:iCs w:val="1"/>
+          <w:lang w:val="en-US"/>
+        </w:rPr>
+        <w:t>miembros</w:t>
+      </w:r>
+      <w:r>
+        <w:rPr>
+          <w:i w:val="1"/>
+          <w:iCs w:val="1"/>
+          <w:lang w:val="en-US"/>
+        </w:rPr>
+        <w:t xml:space="preserve"> de la Unión Europea.</w:t>
+      </w:r>
+      <w:r>
+        <w:rPr>
+          <w:i w:val="1"/>
+          <w:iCs w:val="1"/>
+          <w:lang w:val="en-US"/>
+        </w:rPr>
+        <w:t xml:space="preserve"> Compatible con otras licencias.</w:t>
+      </w:r>
     </w:p>
     <w:p>
       <w:pPr>
@@ -990,20 +1685,531 @@
         <w:rPr>
           <w:u w:val="single"/>
         </w:rPr>
-        <w:t xml:space="preserve">Código abierto robustas </w:t>
-      </w:r>
-      <w:bookmarkStart w:name="_Int_pXWCEQrJ" w:id="902082552"/>
+        <w:t xml:space="preserve">Código </w:t>
+      </w:r>
+      <w:bookmarkStart w:name="_Int_hu64dXz0" w:id="2052037325"/>
       <w:r>
         <w:rPr>
           <w:u w:val="single"/>
         </w:rPr>
-        <w:t>débiles</w:t>
+        <w:t>abierto</w:t>
+      </w:r>
+      <w:r>
+        <w:rPr>
+          <w:u w:val="none"/>
+        </w:rPr>
+        <w:t xml:space="preserve"> </w:t>
+      </w:r>
+      <w:bookmarkStart w:name="_Int_2wOWNsbJ" w:id="1711188472"/>
+      <w:r>
+        <w:rPr/>
+        <w:t>:</w:t>
+      </w:r>
+      <w:bookmarkEnd w:id="1711188472"/>
+      <w:bookmarkEnd w:id="2052037325"/>
+      <w:r>
+        <w:rPr/>
+        <w:t xml:space="preserve"> </w:t>
+      </w:r>
+    </w:p>
+    <w:p>
+      <w:pPr>
+        <w:pStyle w:val="Normal"/>
+      </w:pPr>
+      <w:r>
+        <w:rPr>
+          <w:b w:val="1"/>
+          <w:bCs w:val="1"/>
+          <w:i w:val="1"/>
+          <w:iCs w:val="1"/>
+          <w:lang w:val="en-US"/>
+        </w:rPr>
+        <w:t xml:space="preserve">MIT </w:t>
+      </w:r>
+      <w:bookmarkStart w:name="_Int_TJnZtODn" w:id="814973230"/>
+      <w:r>
+        <w:rPr>
+          <w:b w:val="1"/>
+          <w:bCs w:val="1"/>
+          <w:i w:val="1"/>
+          <w:iCs w:val="1"/>
+          <w:lang w:val="en-US"/>
+        </w:rPr>
+        <w:t>License</w:t>
+      </w:r>
+      <w:r>
+        <w:rPr>
+          <w:i w:val="1"/>
+          <w:iCs w:val="1"/>
+          <w:lang w:val="en-US"/>
+        </w:rPr>
+        <w:t xml:space="preserve"> :</w:t>
+      </w:r>
+      <w:bookmarkEnd w:id="814973230"/>
+      <w:r>
+        <w:rPr>
+          <w:i w:val="1"/>
+          <w:iCs w:val="1"/>
+          <w:lang w:val="en-US"/>
+        </w:rPr>
+        <w:t xml:space="preserve"> El software </w:t>
+      </w:r>
+      <w:r>
+        <w:rPr>
+          <w:i w:val="1"/>
+          <w:iCs w:val="1"/>
+          <w:lang w:val="en-US"/>
+        </w:rPr>
+        <w:t>puede</w:t>
+      </w:r>
+      <w:r>
+        <w:rPr>
+          <w:i w:val="1"/>
+          <w:iCs w:val="1"/>
+          <w:lang w:val="en-US"/>
+        </w:rPr>
+        <w:t xml:space="preserve"> </w:t>
+      </w:r>
+      <w:r>
+        <w:rPr>
+          <w:i w:val="1"/>
+          <w:iCs w:val="1"/>
+          <w:lang w:val="en-US"/>
+        </w:rPr>
+        <w:t>usarse</w:t>
+      </w:r>
+      <w:r>
+        <w:rPr>
+          <w:i w:val="1"/>
+          <w:iCs w:val="1"/>
+          <w:lang w:val="en-US"/>
+        </w:rPr>
+        <w:t xml:space="preserve"> </w:t>
+      </w:r>
+      <w:r>
+        <w:rPr>
+          <w:i w:val="1"/>
+          <w:iCs w:val="1"/>
+          <w:lang w:val="es-ES"/>
+        </w:rPr>
+        <w:t>bajo unas condiciones mínimas</w:t>
+      </w:r>
+      <w:r>
+        <w:rPr>
+          <w:i w:val="1"/>
+          <w:iCs w:val="1"/>
+          <w:lang w:val="en-US"/>
+        </w:rPr>
+        <w:t xml:space="preserve">, </w:t>
+      </w:r>
+      <w:r>
+        <w:rPr>
+          <w:i w:val="1"/>
+          <w:iCs w:val="1"/>
+          <w:lang w:val="en-US"/>
+        </w:rPr>
+        <w:t>pero</w:t>
+      </w:r>
+      <w:r>
+        <w:rPr>
+          <w:i w:val="1"/>
+          <w:iCs w:val="1"/>
+          <w:lang w:val="en-US"/>
+        </w:rPr>
+        <w:t xml:space="preserve"> </w:t>
+      </w:r>
+      <w:r>
+        <w:rPr>
+          <w:i w:val="1"/>
+          <w:iCs w:val="1"/>
+          <w:lang w:val="en-US"/>
+        </w:rPr>
+        <w:t>manteniendo</w:t>
+      </w:r>
+      <w:r>
+        <w:rPr>
+          <w:i w:val="1"/>
+          <w:iCs w:val="1"/>
+          <w:lang w:val="en-US"/>
+        </w:rPr>
+        <w:t xml:space="preserve"> </w:t>
+      </w:r>
+      <w:r>
+        <w:rPr>
+          <w:i w:val="1"/>
+          <w:iCs w:val="1"/>
+          <w:lang w:val="en-US"/>
+        </w:rPr>
+        <w:t>siempre</w:t>
+      </w:r>
+      <w:r>
+        <w:rPr>
+          <w:i w:val="1"/>
+          <w:iCs w:val="1"/>
+          <w:lang w:val="en-US"/>
+        </w:rPr>
+        <w:t xml:space="preserve"> </w:t>
+      </w:r>
+      <w:r>
+        <w:rPr>
+          <w:i w:val="1"/>
+          <w:iCs w:val="1"/>
+          <w:lang w:val="en-US"/>
+        </w:rPr>
+        <w:t>el</w:t>
+      </w:r>
+      <w:r>
+        <w:rPr>
+          <w:i w:val="1"/>
+          <w:iCs w:val="1"/>
+          <w:lang w:val="en-US"/>
+        </w:rPr>
+        <w:t xml:space="preserve"> copyright y </w:t>
+      </w:r>
+      <w:r>
+        <w:rPr>
+          <w:i w:val="1"/>
+          <w:iCs w:val="1"/>
+          <w:lang w:val="en-US"/>
+        </w:rPr>
+        <w:t>el</w:t>
+      </w:r>
+      <w:r>
+        <w:rPr>
+          <w:i w:val="1"/>
+          <w:iCs w:val="1"/>
+          <w:lang w:val="en-US"/>
+        </w:rPr>
+        <w:t xml:space="preserve"> </w:t>
+      </w:r>
+      <w:r>
+        <w:rPr>
+          <w:i w:val="1"/>
+          <w:iCs w:val="1"/>
+          <w:lang w:val="en-US"/>
+        </w:rPr>
+        <w:t>texto</w:t>
+      </w:r>
+      <w:r>
+        <w:rPr>
+          <w:i w:val="1"/>
+          <w:iCs w:val="1"/>
+          <w:lang w:val="en-US"/>
+        </w:rPr>
+        <w:t xml:space="preserve"> de la </w:t>
+      </w:r>
+      <w:r>
+        <w:rPr>
+          <w:i w:val="1"/>
+          <w:iCs w:val="1"/>
+          <w:lang w:val="en-US"/>
+        </w:rPr>
+        <w:t>licencia</w:t>
+      </w:r>
+      <w:r>
+        <w:rPr>
+          <w:i w:val="1"/>
+          <w:iCs w:val="1"/>
+          <w:lang w:val="en-US"/>
+        </w:rPr>
+        <w:t>.</w:t>
+      </w:r>
+      <w:r>
+        <w:rPr>
+          <w:i w:val="1"/>
+          <w:iCs w:val="1"/>
+          <w:lang w:val="en-US"/>
+        </w:rPr>
+        <w:t xml:space="preserve"> La </w:t>
+      </w:r>
+      <w:r>
+        <w:rPr>
+          <w:i w:val="1"/>
+          <w:iCs w:val="1"/>
+          <w:lang w:val="en-US"/>
+        </w:rPr>
+        <w:t>licencia</w:t>
+      </w:r>
+      <w:r>
+        <w:rPr>
+          <w:i w:val="1"/>
+          <w:iCs w:val="1"/>
+          <w:lang w:val="en-US"/>
+        </w:rPr>
+        <w:t xml:space="preserve"> es </w:t>
+      </w:r>
+      <w:r>
+        <w:rPr>
+          <w:i w:val="1"/>
+          <w:iCs w:val="1"/>
+          <w:lang w:val="en-US"/>
+        </w:rPr>
+        <w:t>más</w:t>
+      </w:r>
+      <w:r>
+        <w:rPr>
+          <w:i w:val="1"/>
+          <w:iCs w:val="1"/>
+          <w:lang w:val="en-US"/>
+        </w:rPr>
+        <w:t xml:space="preserve"> simple </w:t>
+      </w:r>
+      <w:r>
+        <w:rPr>
+          <w:i w:val="1"/>
+          <w:iCs w:val="1"/>
+          <w:lang w:val="en-US"/>
+        </w:rPr>
+        <w:t>que</w:t>
+      </w:r>
+      <w:r>
+        <w:rPr>
+          <w:i w:val="1"/>
+          <w:iCs w:val="1"/>
+          <w:lang w:val="en-US"/>
+        </w:rPr>
+        <w:t xml:space="preserve"> la Apache 2.0.</w:t>
+      </w:r>
+      <w:r>
+        <w:br/>
+      </w:r>
+      <w:r>
+        <w:rPr>
+          <w:b w:val="1"/>
+          <w:bCs w:val="1"/>
+          <w:i w:val="1"/>
+          <w:iCs w:val="1"/>
+          <w:lang w:val="en-US"/>
+        </w:rPr>
+        <w:t xml:space="preserve">Apache </w:t>
+      </w:r>
+      <w:r>
+        <w:rPr>
+          <w:b w:val="1"/>
+          <w:bCs w:val="1"/>
+          <w:i w:val="1"/>
+          <w:iCs w:val="1"/>
+          <w:lang w:val="en-US"/>
+        </w:rPr>
+        <w:t>License</w:t>
+      </w:r>
+      <w:r>
+        <w:rPr>
+          <w:b w:val="1"/>
+          <w:bCs w:val="1"/>
+          <w:i w:val="1"/>
+          <w:iCs w:val="1"/>
+          <w:lang w:val="en-US"/>
+        </w:rPr>
+        <w:t xml:space="preserve"> v. </w:t>
+      </w:r>
+      <w:bookmarkStart w:name="_Int_pFmKXfSS" w:id="422401100"/>
+      <w:r>
+        <w:rPr>
+          <w:b w:val="1"/>
+          <w:bCs w:val="1"/>
+          <w:i w:val="1"/>
+          <w:iCs w:val="1"/>
+          <w:lang w:val="en-US"/>
+        </w:rPr>
+        <w:t>1.1.</w:t>
+      </w:r>
+      <w:r>
+        <w:rPr>
+          <w:i w:val="1"/>
+          <w:iCs w:val="1"/>
+          <w:lang w:val="en-US"/>
+        </w:rPr>
+        <w:t xml:space="preserve"> :</w:t>
+      </w:r>
+      <w:bookmarkEnd w:id="422401100"/>
+      <w:r>
+        <w:rPr>
+          <w:i w:val="1"/>
+          <w:iCs w:val="1"/>
+          <w:lang w:val="en-US"/>
+        </w:rPr>
+        <w:t xml:space="preserve"> </w:t>
+      </w:r>
+      <w:r>
+        <w:rPr>
+          <w:i w:val="1"/>
+          <w:iCs w:val="1"/>
+          <w:lang w:val="en-US"/>
+        </w:rPr>
+        <w:t xml:space="preserve">El software </w:t>
+      </w:r>
+      <w:r>
+        <w:rPr>
+          <w:i w:val="1"/>
+          <w:iCs w:val="1"/>
+          <w:lang w:val="en-US"/>
+        </w:rPr>
+        <w:t>puede</w:t>
+      </w:r>
+      <w:r>
+        <w:rPr>
+          <w:i w:val="1"/>
+          <w:iCs w:val="1"/>
+          <w:lang w:val="en-US"/>
+        </w:rPr>
+        <w:t xml:space="preserve"> </w:t>
+      </w:r>
+      <w:r>
+        <w:rPr>
+          <w:i w:val="1"/>
+          <w:iCs w:val="1"/>
+          <w:lang w:val="en-US"/>
+        </w:rPr>
+        <w:t>usarse</w:t>
+      </w:r>
+      <w:r>
+        <w:rPr>
+          <w:i w:val="1"/>
+          <w:iCs w:val="1"/>
+          <w:lang w:val="en-US"/>
+        </w:rPr>
+        <w:t xml:space="preserve"> </w:t>
+      </w:r>
+      <w:r>
+        <w:rPr>
+          <w:i w:val="1"/>
+          <w:iCs w:val="1"/>
+          <w:lang w:val="es-ES"/>
+        </w:rPr>
+        <w:t>bajo unas condiciones mínimas</w:t>
+      </w:r>
+      <w:r>
+        <w:rPr>
+          <w:i w:val="1"/>
+          <w:iCs w:val="1"/>
+          <w:lang w:val="en-US"/>
+        </w:rPr>
+        <w:t xml:space="preserve">, </w:t>
+      </w:r>
+      <w:r>
+        <w:rPr>
+          <w:i w:val="1"/>
+          <w:iCs w:val="1"/>
+          <w:lang w:val="en-US"/>
+        </w:rPr>
+        <w:t>pero</w:t>
+      </w:r>
+      <w:r>
+        <w:rPr>
+          <w:i w:val="1"/>
+          <w:iCs w:val="1"/>
+          <w:lang w:val="en-US"/>
+        </w:rPr>
+        <w:t xml:space="preserve"> </w:t>
+      </w:r>
+      <w:r>
+        <w:rPr>
+          <w:i w:val="1"/>
+          <w:iCs w:val="1"/>
+          <w:lang w:val="en-US"/>
+        </w:rPr>
+        <w:t>manteniendo</w:t>
+      </w:r>
+      <w:r>
+        <w:rPr>
+          <w:i w:val="1"/>
+          <w:iCs w:val="1"/>
+          <w:lang w:val="en-US"/>
+        </w:rPr>
+        <w:t xml:space="preserve"> </w:t>
+      </w:r>
+      <w:r>
+        <w:rPr>
+          <w:i w:val="1"/>
+          <w:iCs w:val="1"/>
+          <w:lang w:val="en-US"/>
+        </w:rPr>
+        <w:t>el</w:t>
+      </w:r>
+      <w:r>
+        <w:rPr>
+          <w:i w:val="1"/>
+          <w:iCs w:val="1"/>
+          <w:lang w:val="en-US"/>
+        </w:rPr>
+        <w:t xml:space="preserve"> copyright y </w:t>
+      </w:r>
+      <w:r>
+        <w:rPr>
+          <w:i w:val="1"/>
+          <w:iCs w:val="1"/>
+          <w:lang w:val="en-US"/>
+        </w:rPr>
+        <w:t>el</w:t>
+      </w:r>
+      <w:r>
+        <w:rPr>
+          <w:i w:val="1"/>
+          <w:iCs w:val="1"/>
+          <w:lang w:val="en-US"/>
+        </w:rPr>
+        <w:t xml:space="preserve"> </w:t>
+      </w:r>
+      <w:r>
+        <w:rPr>
+          <w:i w:val="1"/>
+          <w:iCs w:val="1"/>
+          <w:lang w:val="en-US"/>
+        </w:rPr>
+        <w:t>descargo</w:t>
+      </w:r>
+      <w:r>
+        <w:rPr>
+          <w:i w:val="1"/>
+          <w:iCs w:val="1"/>
+          <w:lang w:val="en-US"/>
+        </w:rPr>
+        <w:t xml:space="preserve"> de </w:t>
+      </w:r>
+      <w:r>
+        <w:rPr>
+          <w:i w:val="1"/>
+          <w:iCs w:val="1"/>
+          <w:lang w:val="en-US"/>
+        </w:rPr>
+        <w:t>responsabilidad</w:t>
+      </w:r>
+      <w:r>
+        <w:rPr>
+          <w:i w:val="1"/>
+          <w:iCs w:val="1"/>
+          <w:lang w:val="en-US"/>
+        </w:rPr>
+        <w:t>.</w:t>
+      </w:r>
+    </w:p>
+    <w:p>
+      <w:pPr>
+        <w:pStyle w:val="Normal"/>
+        <w:rPr>
+          <w:i w:val="1"/>
+          <w:iCs w:val="1"/>
+        </w:rPr>
+      </w:pPr>
+      <w:r>
+        <w:rPr>
+          <w:u w:val="single"/>
+        </w:rPr>
+        <w:t xml:space="preserve">Dominio </w:t>
+      </w:r>
+      <w:bookmarkStart w:name="_Int_WeaA8FST" w:id="1430791908"/>
+      <w:r>
+        <w:rPr>
+          <w:u w:val="single"/>
+        </w:rPr>
+        <w:t>público</w:t>
       </w:r>
       <w:r>
         <w:rPr/>
         <w:t xml:space="preserve"> :</w:t>
       </w:r>
-      <w:bookmarkEnd w:id="902082552"/>
+      <w:bookmarkEnd w:id="1430791908"/>
       <w:r>
         <w:rPr/>
         <w:t xml:space="preserve"> </w:t>
@@ -1013,9 +2219,7 @@
       <w:pPr>
         <w:pStyle w:val="Normal"/>
         <w:rPr>
-          <w:i w:val="1"/>
-          <w:iCs w:val="1"/>
-          <w:lang w:val="en-US"/>
+          <w:lang w:val="es-ES"/>
         </w:rPr>
       </w:pPr>
       <w:r>
@@ -1024,403 +2228,289 @@
           <w:bCs w:val="1"/>
           <w:i w:val="1"/>
           <w:iCs w:val="1"/>
-          <w:lang w:val="en-US"/>
-        </w:rPr>
-        <w:t xml:space="preserve">Mozilla Public </w:t>
-      </w:r>
-      <w:bookmarkStart w:name="_Int_iHhWgWn9" w:id="771899124"/>
+          <w:lang w:val="es-ES"/>
+        </w:rPr>
+        <w:t>CC</w:t>
+      </w:r>
+      <w:bookmarkStart w:name="_Int_evyyiED0" w:id="471761478"/>
       <w:r>
         <w:rPr>
           <w:b w:val="1"/>
           <w:bCs w:val="1"/>
           <w:i w:val="1"/>
           <w:iCs w:val="1"/>
-          <w:lang w:val="en-US"/>
-        </w:rPr>
-        <w:t>License</w:t>
-      </w:r>
-      <w:r>
-        <w:rPr>
-          <w:i w:val="1"/>
-          <w:iCs w:val="1"/>
-          <w:lang w:val="en-US"/>
-        </w:rPr>
-        <w:t xml:space="preserve"> :</w:t>
-      </w:r>
-      <w:bookmarkEnd w:id="771899124"/>
-      <w:r>
-        <w:rPr>
-          <w:i w:val="1"/>
-          <w:iCs w:val="1"/>
-          <w:lang w:val="en-US"/>
-        </w:rPr>
-        <w:t xml:space="preserve"> </w:t>
+          <w:lang w:val="es-ES"/>
+        </w:rPr>
+        <w:t xml:space="preserve">0 </w:t>
+      </w:r>
+      <w:r>
+        <w:rPr>
+          <w:i w:val="1"/>
+          <w:iCs w:val="1"/>
+          <w:lang w:val="es-ES"/>
+        </w:rPr>
+        <w:t>:</w:t>
+      </w:r>
+      <w:bookmarkEnd w:id="471761478"/>
+      <w:r>
+        <w:rPr>
+          <w:i w:val="1"/>
+          <w:iCs w:val="1"/>
+          <w:lang w:val="es-ES"/>
+        </w:rPr>
+        <w:t xml:space="preserve"> Creative Commons Zero. Sin restricción, atribución, o garantías.</w:t>
       </w:r>
       <w:r>
         <w:br/>
       </w:r>
       <w:r>
+        <w:br/>
+      </w:r>
+    </w:p>
+    <w:p>
+      <w:pPr>
+        <w:pStyle w:val="Normal"/>
+        <w:rPr>
+          <w:lang w:val="en-US"/>
+        </w:rPr>
+      </w:pPr>
+      <w:r>
+        <w:br/>
+      </w:r>
+    </w:p>
+    <w:p>
+      <w:pPr>
+        <w:pStyle w:val="Normal"/>
+      </w:pPr>
+    </w:p>
+    <w:p>
+      <w:pPr>
+        <w:pStyle w:val="Normal"/>
+      </w:pPr>
+      <w:r>
+        <w:br/>
+      </w:r>
+    </w:p>
+    <w:p>
+      <w:pPr>
+        <w:pStyle w:val="Normal"/>
+      </w:pPr>
+    </w:p>
+    <w:p>
+      <w:pPr>
+        <w:pStyle w:val="Heading2"/>
+      </w:pPr>
+      <w:bookmarkStart w:name="_Toc511265140" w:id="924421219"/>
+      <w:r>
+        <w:rPr/>
+        <w:t>Comparación entre licencias</w:t>
+      </w:r>
+      <w:bookmarkEnd w:id="924421219"/>
+    </w:p>
+    <w:p>
+      <w:pPr>
+        <w:pStyle w:val="Normal"/>
+        <w:suppressLineNumbers w:val="0"/>
+        <w:bidi w:val="0"/>
+        <w:spacing w:before="0" w:beforeAutospacing="off" w:after="160" w:afterAutospacing="off" w:line="279" w:lineRule="auto"/>
+        <w:ind w:left="0" w:right="0"/>
+        <w:jc w:val="left"/>
         <w:rPr>
           <w:b w:val="1"/>
           <w:bCs w:val="1"/>
-          <w:i w:val="1"/>
-          <w:iCs w:val="1"/>
-          <w:lang w:val="en-US"/>
-        </w:rPr>
-        <w:t>EUPL</w:t>
-      </w:r>
-      <w:r>
-        <w:rPr>
-          <w:i w:val="1"/>
-          <w:iCs w:val="1"/>
-          <w:lang w:val="en-US"/>
-        </w:rPr>
-        <w:t xml:space="preserve"> :</w:t>
-      </w:r>
-      <w:r>
-        <w:br/>
-      </w:r>
+        </w:rPr>
+      </w:pPr>
       <w:r>
         <w:rPr>
           <w:b w:val="1"/>
           <w:bCs w:val="1"/>
-          <w:i w:val="1"/>
-          <w:iCs w:val="1"/>
-          <w:lang w:val="en-US"/>
-        </w:rPr>
-        <w:t xml:space="preserve">Apple Source License v. </w:t>
-      </w:r>
-      <w:bookmarkStart w:name="_Int_q1gubYzH" w:id="942627623"/>
+        </w:rPr>
+        <w:t xml:space="preserve">GNU General Public </w:t>
+      </w:r>
       <w:r>
         <w:rPr>
           <w:b w:val="1"/>
           <w:bCs w:val="1"/>
-          <w:i w:val="1"/>
-          <w:iCs w:val="1"/>
-          <w:lang w:val="en-US"/>
-        </w:rPr>
-        <w:t>2.0.</w:t>
-      </w:r>
-      <w:r>
-        <w:rPr>
-          <w:i w:val="1"/>
-          <w:iCs w:val="1"/>
-          <w:lang w:val="en-US"/>
-        </w:rPr>
-        <w:t xml:space="preserve"> :</w:t>
-      </w:r>
-      <w:bookmarkEnd w:id="942627623"/>
-    </w:p>
-    <w:p>
-      <w:pPr>
-        <w:pStyle w:val="Normal"/>
-        <w:rPr>
-          <w:i w:val="1"/>
-          <w:iCs w:val="1"/>
-        </w:rPr>
-      </w:pPr>
-      <w:r>
-        <w:rPr>
-          <w:u w:val="single"/>
-        </w:rPr>
-        <w:t xml:space="preserve">Código abierto </w:t>
-      </w:r>
-      <w:bookmarkStart w:name="_Int_2wOWNsbJ" w:id="1711188472"/>
-      <w:r>
-        <w:rPr>
-          <w:u w:val="single"/>
-        </w:rPr>
-        <w:t>permisivas</w:t>
-      </w:r>
-      <w:r>
-        <w:rPr/>
-        <w:t xml:space="preserve"> :</w:t>
-      </w:r>
-      <w:bookmarkEnd w:id="1711188472"/>
-      <w:r>
-        <w:rPr/>
-        <w:t xml:space="preserve"> </w:t>
-      </w:r>
-    </w:p>
-    <w:p>
-      <w:pPr>
-        <w:pStyle w:val="Normal"/>
-        <w:rPr>
-          <w:i w:val="1"/>
-          <w:iCs w:val="1"/>
-          <w:lang w:val="en-US"/>
-        </w:rPr>
-      </w:pPr>
+        </w:rPr>
+        <w:t>License</w:t>
+      </w:r>
       <w:r>
         <w:rPr>
           <w:b w:val="1"/>
           <w:bCs w:val="1"/>
-          <w:i w:val="1"/>
-          <w:iCs w:val="1"/>
-          <w:lang w:val="en-US"/>
-        </w:rPr>
-        <w:t xml:space="preserve">MIT </w:t>
-      </w:r>
-      <w:r>
+        </w:rPr>
+        <w:t xml:space="preserve"> v. 3.0 / Apache v. 2.0 / MIT</w:t>
+      </w:r>
+    </w:p>
+    <w:p>
+      <w:pPr>
+        <w:pStyle w:val="Normal"/>
+        <w:suppressLineNumbers w:val="0"/>
+        <w:bidi w:val="0"/>
+        <w:spacing w:before="0" w:beforeAutospacing="off" w:after="160" w:afterAutospacing="off" w:line="279" w:lineRule="auto"/>
+        <w:ind w:left="0" w:right="0"/>
+        <w:jc w:val="left"/>
+        <w:rPr>
+          <w:b w:val="0"/>
+          <w:bCs w:val="0"/>
+          <w:i w:val="1"/>
+          <w:iCs w:val="1"/>
+        </w:rPr>
+      </w:pPr>
+      <w:r>
+        <w:rPr>
+          <w:b w:val="0"/>
+          <w:bCs w:val="0"/>
+          <w:i w:val="1"/>
+          <w:iCs w:val="1"/>
+        </w:rPr>
+        <w:t>Un software bajo la licencia GNU GPL 3.0 puede ejecutarse, modificarse</w:t>
+      </w:r>
+      <w:r>
+        <w:rPr>
+          <w:b w:val="0"/>
+          <w:bCs w:val="0"/>
+          <w:i w:val="1"/>
+          <w:iCs w:val="1"/>
+        </w:rPr>
+        <w:t xml:space="preserve"> y compartirse, pero siempre bajo la misma licencia. Si se inserta dentro de un proyecto mayor, este proyecto también tiene que utilizar la misma licencia.</w:t>
+      </w:r>
+    </w:p>
+    <w:p>
+      <w:pPr>
+        <w:pStyle w:val="Normal"/>
+        <w:suppressLineNumbers w:val="0"/>
+        <w:bidi w:val="0"/>
+        <w:spacing w:before="0" w:beforeAutospacing="off" w:after="160" w:afterAutospacing="off" w:line="279" w:lineRule="auto"/>
+        <w:ind w:left="0" w:right="0"/>
+        <w:jc w:val="left"/>
+        <w:rPr>
+          <w:b w:val="0"/>
+          <w:bCs w:val="0"/>
+          <w:i w:val="1"/>
+          <w:iCs w:val="1"/>
+        </w:rPr>
+      </w:pPr>
+      <w:r>
+        <w:rPr>
+          <w:b w:val="0"/>
+          <w:bCs w:val="0"/>
+          <w:i w:val="1"/>
+          <w:iCs w:val="1"/>
+        </w:rPr>
+        <w:t xml:space="preserve">Apache </w:t>
+      </w:r>
+      <w:r>
+        <w:rPr>
+          <w:b w:val="0"/>
+          <w:bCs w:val="0"/>
+          <w:i w:val="1"/>
+          <w:iCs w:val="1"/>
+        </w:rPr>
+        <w:t>License</w:t>
+      </w:r>
+      <w:r>
+        <w:rPr>
+          <w:b w:val="0"/>
+          <w:bCs w:val="0"/>
+          <w:i w:val="1"/>
+          <w:iCs w:val="1"/>
+        </w:rPr>
+        <w:t xml:space="preserve"> 2.0 y MIT funcionan igual</w:t>
+      </w:r>
+      <w:r>
+        <w:rPr>
+          <w:b w:val="0"/>
+          <w:bCs w:val="0"/>
+          <w:i w:val="1"/>
+          <w:iCs w:val="1"/>
+        </w:rPr>
+        <w:t xml:space="preserve"> que la GNU GPL 3.0, pero al insertarse en un proyecto, este no tiene que cambiar su licencia, pero tiene que mantener el copyright</w:t>
+      </w:r>
+      <w:r>
+        <w:rPr>
+          <w:b w:val="0"/>
+          <w:bCs w:val="0"/>
+          <w:i w:val="1"/>
+          <w:iCs w:val="1"/>
+        </w:rPr>
+        <w:t xml:space="preserve"> </w:t>
+      </w:r>
+      <w:r>
+        <w:rPr>
+          <w:b w:val="0"/>
+          <w:bCs w:val="0"/>
+          <w:i w:val="1"/>
+          <w:iCs w:val="1"/>
+        </w:rPr>
+        <w:t>y un aviso con la licencia original del código.</w:t>
+      </w:r>
+    </w:p>
+    <w:p>
+      <w:pPr>
+        <w:pStyle w:val="Normal"/>
+        <w:suppressLineNumbers w:val="0"/>
+        <w:bidi w:val="0"/>
+        <w:spacing w:before="0" w:beforeAutospacing="off" w:after="160" w:afterAutospacing="off" w:line="279" w:lineRule="auto"/>
+        <w:ind w:left="0" w:right="0"/>
+        <w:jc w:val="left"/>
+        <w:rPr>
+          <w:b w:val="0"/>
+          <w:bCs w:val="0"/>
+          <w:i w:val="1"/>
+          <w:iCs w:val="1"/>
+        </w:rPr>
+      </w:pPr>
+      <w:r>
+        <w:rPr>
+          <w:b w:val="0"/>
+          <w:bCs w:val="0"/>
+          <w:i w:val="1"/>
+          <w:iCs w:val="1"/>
+        </w:rPr>
+        <w:t xml:space="preserve">La diferencia entre la licencia Apache 2.0 y la MIT está en el tratamiento de las patentes, el cual, en la Apache 2.0 se especifica, </w:t>
+      </w:r>
+      <w:r>
+        <w:rPr>
+          <w:b w:val="0"/>
+          <w:bCs w:val="0"/>
+          <w:i w:val="1"/>
+          <w:iCs w:val="1"/>
+        </w:rPr>
+        <w:t>mientras que en la MIT</w:t>
+      </w:r>
+      <w:r>
+        <w:rPr>
+          <w:b w:val="0"/>
+          <w:bCs w:val="0"/>
+          <w:i w:val="1"/>
+          <w:iCs w:val="1"/>
+        </w:rPr>
+        <w:t xml:space="preserve"> no se trata por mantener la simplicidad.</w:t>
+      </w:r>
+    </w:p>
+    <w:p>
+      <w:pPr>
+        <w:pStyle w:val="Normal"/>
+      </w:pPr>
+    </w:p>
+    <w:p>
+      <w:pPr>
+        <w:pStyle w:val="Heading1"/>
         <w:rPr>
           <w:b w:val="1"/>
           <w:bCs w:val="1"/>
-          <w:i w:val="1"/>
-          <w:iCs w:val="1"/>
-          <w:lang w:val="en-US"/>
-        </w:rPr>
-        <w:t>License</w:t>
-      </w:r>
-      <w:r>
-        <w:rPr>
-          <w:i w:val="1"/>
-          <w:iCs w:val="1"/>
-          <w:lang w:val="en-US"/>
-        </w:rPr>
-        <w:t xml:space="preserve"> :</w:t>
-      </w:r>
-      <w:r>
-        <w:br/>
-      </w:r>
+        </w:rPr>
+      </w:pPr>
+      <w:bookmarkStart w:name="_Toc879229880" w:id="467286197"/>
       <w:r>
         <w:rPr>
           <w:b w:val="1"/>
           <w:bCs w:val="1"/>
-          <w:i w:val="1"/>
-          <w:iCs w:val="1"/>
-          <w:lang w:val="en-US"/>
-        </w:rPr>
-        <w:t xml:space="preserve">Apache </w:t>
-      </w:r>
-      <w:r>
-        <w:rPr>
-          <w:b w:val="1"/>
-          <w:bCs w:val="1"/>
-          <w:i w:val="1"/>
-          <w:iCs w:val="1"/>
-          <w:lang w:val="en-US"/>
-        </w:rPr>
-        <w:t>License</w:t>
-      </w:r>
-      <w:r>
-        <w:rPr>
-          <w:b w:val="1"/>
-          <w:bCs w:val="1"/>
-          <w:i w:val="1"/>
-          <w:iCs w:val="1"/>
-          <w:lang w:val="en-US"/>
-        </w:rPr>
-        <w:t xml:space="preserve"> v. 1.1.</w:t>
-      </w:r>
-      <w:r>
-        <w:rPr>
-          <w:i w:val="1"/>
-          <w:iCs w:val="1"/>
-          <w:lang w:val="en-US"/>
-        </w:rPr>
-        <w:t xml:space="preserve"> :</w:t>
-      </w:r>
-      <w:r>
-        <w:br/>
-      </w:r>
-      <w:r>
-        <w:rPr>
-          <w:b w:val="1"/>
-          <w:bCs w:val="1"/>
-          <w:i w:val="1"/>
-          <w:iCs w:val="1"/>
-          <w:lang w:val="en-US"/>
-        </w:rPr>
-        <w:t xml:space="preserve">BSD </w:t>
-      </w:r>
-      <w:bookmarkStart w:name="_Int_u14OiYTo" w:id="786575150"/>
-      <w:r>
-        <w:rPr>
-          <w:b w:val="1"/>
-          <w:bCs w:val="1"/>
-          <w:i w:val="1"/>
-          <w:iCs w:val="1"/>
-          <w:lang w:val="en-US"/>
-        </w:rPr>
-        <w:t>License</w:t>
-      </w:r>
-      <w:r>
-        <w:rPr>
-          <w:i w:val="1"/>
-          <w:iCs w:val="1"/>
-          <w:lang w:val="en-US"/>
-        </w:rPr>
-        <w:t xml:space="preserve"> :</w:t>
-      </w:r>
-      <w:bookmarkEnd w:id="786575150"/>
-    </w:p>
-    <w:p>
-      <w:pPr>
-        <w:pStyle w:val="Normal"/>
-        <w:rPr>
-          <w:i w:val="1"/>
-          <w:iCs w:val="1"/>
-        </w:rPr>
-      </w:pPr>
-      <w:r>
-        <w:rPr>
-          <w:u w:val="single"/>
-        </w:rPr>
-        <w:t xml:space="preserve">Dominio </w:t>
-      </w:r>
-      <w:bookmarkStart w:name="_Int_WeaA8FST" w:id="1430791908"/>
-      <w:r>
-        <w:rPr>
-          <w:u w:val="single"/>
-        </w:rPr>
-        <w:t>público</w:t>
-      </w:r>
-      <w:r>
-        <w:rPr/>
-        <w:t xml:space="preserve"> :</w:t>
-      </w:r>
-      <w:bookmarkEnd w:id="1430791908"/>
-      <w:r>
-        <w:rPr/>
-        <w:t xml:space="preserve"> </w:t>
-      </w:r>
-    </w:p>
-    <w:p>
-      <w:pPr>
-        <w:pStyle w:val="Normal"/>
-      </w:pPr>
-      <w:r>
-        <w:rPr>
-          <w:b w:val="1"/>
-          <w:bCs w:val="1"/>
-          <w:i w:val="1"/>
-          <w:iCs w:val="1"/>
-        </w:rPr>
-        <w:t xml:space="preserve">CC0 </w:t>
-      </w:r>
-      <w:r>
-        <w:rPr>
-          <w:i w:val="1"/>
-          <w:iCs w:val="1"/>
-        </w:rPr>
-        <w:t>:</w:t>
-      </w:r>
-      <w:r>
-        <w:br/>
-      </w:r>
-      <w:r>
-        <w:rPr>
-          <w:b w:val="1"/>
-          <w:bCs w:val="1"/>
-          <w:i w:val="1"/>
-          <w:iCs w:val="1"/>
-        </w:rPr>
-        <w:t>Unlicense</w:t>
-      </w:r>
-      <w:r>
-        <w:rPr>
-          <w:i w:val="1"/>
-          <w:iCs w:val="1"/>
-        </w:rPr>
-        <w:t xml:space="preserve"> :</w:t>
-      </w:r>
-      <w:r>
-        <w:br/>
-      </w:r>
-      <w:r>
-        <w:rPr>
-          <w:b w:val="1"/>
-          <w:bCs w:val="1"/>
-          <w:i w:val="1"/>
-          <w:iCs w:val="1"/>
-        </w:rPr>
-        <w:t>WTFPL</w:t>
-      </w:r>
-      <w:r>
-        <w:rPr>
-          <w:i w:val="1"/>
-          <w:iCs w:val="1"/>
-        </w:rPr>
-        <w:t xml:space="preserve"> :</w:t>
-      </w:r>
-      <w:r>
-        <w:br/>
-      </w:r>
-      <w:r>
-        <w:br/>
-      </w:r>
-    </w:p>
-    <w:p>
-      <w:pPr>
-        <w:pStyle w:val="Normal"/>
-        <w:rPr>
-          <w:lang w:val="en-US"/>
-        </w:rPr>
-      </w:pPr>
-      <w:r>
-        <w:br/>
-      </w:r>
-    </w:p>
-    <w:p>
-      <w:pPr>
-        <w:pStyle w:val="Normal"/>
-      </w:pPr>
-    </w:p>
-    <w:p>
-      <w:pPr>
-        <w:pStyle w:val="Normal"/>
-      </w:pPr>
-      <w:r>
-        <w:br/>
-      </w:r>
-    </w:p>
-    <w:p>
-      <w:pPr>
-        <w:pStyle w:val="Normal"/>
-      </w:pPr>
-    </w:p>
-    <w:p>
-      <w:pPr>
-        <w:pStyle w:val="Heading2"/>
-      </w:pPr>
-      <w:bookmarkStart w:name="_Toc399201739" w:id="1380771996"/>
-      <w:r>
-        <w:rPr/>
-        <w:t>Comparación entre licencias</w:t>
-      </w:r>
-      <w:bookmarkEnd w:id="1380771996"/>
-    </w:p>
-    <w:p>
-      <w:pPr>
-        <w:pStyle w:val="Normal"/>
-      </w:pPr>
-      <w:r>
-        <w:rPr/>
-        <w:t>(Mínimo tres licencias: MIT, GPL v3, Apache 2.0)</w:t>
-      </w:r>
-    </w:p>
-    <w:p>
-      <w:pPr>
-        <w:pStyle w:val="Normal"/>
-      </w:pPr>
-    </w:p>
-    <w:p>
-      <w:pPr>
-        <w:pStyle w:val="Heading1"/>
-        <w:rPr>
-          <w:b w:val="1"/>
-          <w:bCs w:val="1"/>
-        </w:rPr>
-      </w:pPr>
-      <w:bookmarkStart w:name="_Toc1517806272" w:id="1343324054"/>
-      <w:r>
-        <w:rPr>
-          <w:b w:val="1"/>
-          <w:bCs w:val="1"/>
         </w:rPr>
         <w:t>Requisitos</w:t>
       </w:r>
-      <w:bookmarkEnd w:id="1343324054"/>
+      <w:bookmarkEnd w:id="467286197"/>
     </w:p>
     <w:p>
       <w:pPr>
@@ -1431,7 +2521,7 @@
         <w:ind w:left="0" w:right="0"/>
         <w:jc w:val="left"/>
       </w:pPr>
-      <w:bookmarkStart w:name="_Toc1060950956" w:id="1401901114"/>
+      <w:bookmarkStart w:name="_Toc1407560729" w:id="1897881209"/>
       <w:r>
         <w:rPr/>
         <w:t>R</w:t>
@@ -1440,7 +2530,7 @@
         <w:rPr/>
         <w:t>equisitos de Hardware</w:t>
       </w:r>
-      <w:bookmarkEnd w:id="1401901114"/>
+      <w:bookmarkEnd w:id="1897881209"/>
     </w:p>
     <w:p>
       <w:pPr>
@@ -1575,7 +2665,7 @@
         <w:ind w:left="0" w:right="0"/>
         <w:jc w:val="left"/>
       </w:pPr>
-      <w:bookmarkStart w:name="_Toc1663264036" w:id="570745839"/>
+      <w:bookmarkStart w:name="_Toc27283976" w:id="1116179200"/>
       <w:r>
         <w:rPr/>
         <w:t>R</w:t>
@@ -1584,7 +2674,7 @@
         <w:rPr/>
         <w:t>equisitos de Software</w:t>
       </w:r>
-      <w:bookmarkEnd w:id="570745839"/>
+      <w:bookmarkEnd w:id="1116179200"/>
     </w:p>
     <w:p>
       <w:pPr>
@@ -1619,7 +2709,6 @@
         </w:rPr>
         <w:t xml:space="preserve">Versión de la </w:t>
       </w:r>
-      <w:bookmarkStart w:name="_Int_PbJygJwA" w:id="488373760"/>
       <w:r>
         <w:rPr>
           <w:i w:val="1"/>
@@ -1627,7 +2716,6 @@
         </w:rPr>
         <w:t>dependencia :</w:t>
       </w:r>
-      <w:bookmarkEnd w:id="488373760"/>
       <w:r>
         <w:rPr>
           <w:i w:val="1"/>
@@ -1669,7 +2757,6 @@
         </w:rPr>
         <w:t xml:space="preserve">Versión de la </w:t>
       </w:r>
-      <w:bookmarkStart w:name="_Int_jrHdhtML" w:id="445121096"/>
       <w:r>
         <w:rPr>
           <w:i w:val="1"/>
@@ -1677,7 +2764,6 @@
         </w:rPr>
         <w:t>codificación :</w:t>
       </w:r>
-      <w:bookmarkEnd w:id="445121096"/>
       <w:r>
         <w:rPr>
           <w:i w:val="1"/>
@@ -1695,7 +2781,6 @@
         </w:rPr>
         <w:t xml:space="preserve">Versión Java </w:t>
       </w:r>
-      <w:bookmarkStart w:name="_Int_kv2hkcxo" w:id="2098512541"/>
       <w:r>
         <w:rPr>
           <w:i w:val="1"/>
@@ -1703,7 +2788,6 @@
         </w:rPr>
         <w:t>utilizada :</w:t>
       </w:r>
-      <w:bookmarkEnd w:id="2098512541"/>
       <w:r>
         <w:rPr>
           <w:i w:val="1"/>
@@ -1792,7 +2876,6 @@
         </w:rPr>
         <w:t xml:space="preserve">Desarrollada </w:t>
       </w:r>
-      <w:bookmarkStart w:name="_Int_zKYrNJ0a" w:id="1264186406"/>
       <w:r>
         <w:rPr>
           <w:i w:val="1"/>
@@ -1801,7 +2884,6 @@
         </w:rPr>
         <w:t>en :</w:t>
       </w:r>
-      <w:bookmarkEnd w:id="1264186406"/>
       <w:r>
         <w:rPr>
           <w:i w:val="1"/>
@@ -1821,7 +2903,6 @@
         </w:rPr>
         <w:t xml:space="preserve">Versión de </w:t>
       </w:r>
-      <w:bookmarkStart w:name="_Int_zTGp3K9f" w:id="2044014223"/>
       <w:r>
         <w:rPr>
           <w:i w:val="1"/>
@@ -1830,7 +2911,6 @@
         </w:rPr>
         <w:t>MySQL :</w:t>
       </w:r>
-      <w:bookmarkEnd w:id="2044014223"/>
       <w:r>
         <w:rPr>
           <w:i w:val="1"/>
@@ -1923,7 +3003,6 @@
         </w:rPr>
         <w:t xml:space="preserve">Algunas funciones del programa están vinculadas con el siguiente servidor </w:t>
       </w:r>
-      <w:bookmarkStart w:name="_Int_PC0UU3qx" w:id="1201115950"/>
       <w:r>
         <w:rPr>
           <w:i w:val="1"/>
@@ -1948,7 +3027,6 @@
         </w:rPr>
         <w:t>:</w:t>
       </w:r>
-      <w:bookmarkEnd w:id="1201115950"/>
       <w:r>
         <w:rPr>
           <w:i w:val="1"/>
@@ -1986,7 +3064,6 @@
         </w:rPr>
         <w:t>Versión Chrome</w:t>
       </w:r>
-      <w:bookmarkStart w:name="_Int_izmYSkhS" w:id="1287169969"/>
       <w:r>
         <w:rPr>
           <w:rFonts w:ascii="Aptos" w:hAnsi="Aptos" w:eastAsia="Aptos" w:cs="Aptos"/>
@@ -2000,7 +3077,6 @@
         </w:rPr>
         <w:t xml:space="preserve"> :</w:t>
       </w:r>
-      <w:bookmarkEnd w:id="1287169969"/>
       <w:r>
         <w:rPr>
           <w:rFonts w:ascii="Aptos" w:hAnsi="Aptos" w:eastAsia="Aptos" w:cs="Aptos"/>
@@ -2044,7 +3120,6 @@
         </w:rPr>
         <w:t xml:space="preserve">Sistema operativo </w:t>
       </w:r>
-      <w:bookmarkStart w:name="_Int_Mzr5bTw3" w:id="1425172146"/>
       <w:r>
         <w:rPr>
           <w:i w:val="1"/>
@@ -2053,7 +3128,6 @@
         </w:rPr>
         <w:t>utilizado :</w:t>
       </w:r>
-      <w:bookmarkEnd w:id="1425172146"/>
       <w:r>
         <w:rPr>
           <w:i w:val="1"/>
@@ -2115,7 +3189,7 @@
           <w:bCs w:val="1"/>
         </w:rPr>
       </w:pPr>
-      <w:bookmarkStart w:name="_Toc77101453" w:id="131007922"/>
+      <w:bookmarkStart w:name="_Toc157029606" w:id="778585360"/>
       <w:r>
         <w:rPr>
           <w:b w:val="1"/>
@@ -2123,7 +3197,7 @@
         </w:rPr>
         <w:t>Instalación</w:t>
       </w:r>
-      <w:bookmarkEnd w:id="131007922"/>
+      <w:bookmarkEnd w:id="778585360"/>
     </w:p>
     <w:p>
       <w:pPr>
@@ -2138,7 +3212,7 @@
           <w:bCs w:val="1"/>
         </w:rPr>
       </w:pPr>
-      <w:bookmarkStart w:name="_Toc81259772" w:id="1747516886"/>
+      <w:bookmarkStart w:name="_Toc1228673080" w:id="1658436496"/>
       <w:r>
         <w:rPr>
           <w:b w:val="1"/>
@@ -2146,7 +3220,7 @@
         </w:rPr>
         <w:t>Guía de uso</w:t>
       </w:r>
-      <w:bookmarkEnd w:id="1747516886"/>
+      <w:bookmarkEnd w:id="1658436496"/>
     </w:p>
     <w:p>
       <w:pPr>
@@ -2157,7 +3231,7 @@
           <w:bCs w:val="1"/>
         </w:rPr>
       </w:pPr>
-      <w:bookmarkStart w:name="_Toc2133818568" w:id="1758806372"/>
+      <w:bookmarkStart w:name="_Toc97740711" w:id="2025427051"/>
       <w:r>
         <w:rPr>
           <w:b w:val="1"/>
@@ -2165,7 +3239,7 @@
         </w:rPr>
         <w:t>Problemas frecuentes y solución</w:t>
       </w:r>
-      <w:bookmarkEnd w:id="1758806372"/>
+      <w:bookmarkEnd w:id="2025427051"/>
     </w:p>
     <w:p/>
     <w:p/>
@@ -2551,6 +3625,93 @@
 <file path=word/intelligence2.xml><?xml version="1.0" encoding="utf-8"?>
 <int2:intelligence xmlns:int2="http://schemas.microsoft.com/office/intelligence/2020/intelligence">
   <int2:observations>
+    <int2:textHash int2:hashCode="hRdKhY2AT6IxU4" int2:id="9oxHLqgl">
+      <int2:state int2:type="spell" int2:value="Rejected"/>
+    </int2:textHash>
+    <int2:textHash int2:hashCode="XicHniNN0ZqAw7" int2:id="Ro8AuwMY">
+      <int2:state int2:type="spell" int2:value="Rejected"/>
+    </int2:textHash>
+    <int2:textHash int2:hashCode="evDxxgcmQJjbNV" int2:id="clhPyGeZ">
+      <int2:state int2:type="spell" int2:value="Rejected"/>
+    </int2:textHash>
+    <int2:textHash int2:hashCode="6BNpycLgNJFQMk" int2:id="EJ8aVH3Y">
+      <int2:state int2:type="spell" int2:value="Rejected"/>
+    </int2:textHash>
+    <int2:textHash int2:hashCode="LjYtK0ovlYnUBM" int2:id="fQJvqK0T">
+      <int2:state int2:type="spell" int2:value="Rejected"/>
+    </int2:textHash>
+    <int2:textHash int2:hashCode="V7XKRZ746ZWtAA" int2:id="kAf2pVbM">
+      <int2:state int2:type="spell" int2:value="Rejected"/>
+    </int2:textHash>
+    <int2:textHash int2:hashCode="kXrHCTkR7GgDU3" int2:id="xpg2oCY3">
+      <int2:state int2:type="spell" int2:value="Rejected"/>
+    </int2:textHash>
+    <int2:textHash int2:hashCode="6mMVUfVWn2Et1w" int2:id="T3HRzkPF">
+      <int2:state int2:type="spell" int2:value="Rejected"/>
+    </int2:textHash>
+    <int2:textHash int2:hashCode="mPx7NHYPrOXiaL" int2:id="TMVJxFwS">
+      <int2:state int2:type="spell" int2:value="Rejected"/>
+    </int2:textHash>
+    <int2:textHash int2:hashCode="HuSJ1tCRHaY8PG" int2:id="Av8iDELD">
+      <int2:state int2:type="spell" int2:value="Rejected"/>
+    </int2:textHash>
+    <int2:textHash int2:hashCode="LRCAegk7AaKM2C" int2:id="FOqNVdNH">
+      <int2:state int2:type="spell" int2:value="Rejected"/>
+    </int2:textHash>
+    <int2:textHash int2:hashCode="YIRUI8gdImtgrX" int2:id="0WQi5Wgo">
+      <int2:state int2:type="spell" int2:value="Rejected"/>
+    </int2:textHash>
+    <int2:textHash int2:hashCode="ccYa/T5sArXkwr" int2:id="oUfyqkMC">
+      <int2:state int2:type="spell" int2:value="Rejected"/>
+    </int2:textHash>
+    <int2:textHash int2:hashCode="pNKUakEeaiXJHK" int2:id="Q8JSVFR7">
+      <int2:state int2:type="spell" int2:value="Rejected"/>
+    </int2:textHash>
+    <int2:textHash int2:hashCode="dIwGx6Y0mc//nZ" int2:id="zcClWeGw">
+      <int2:state int2:type="spell" int2:value="Rejected"/>
+    </int2:textHash>
+    <int2:textHash int2:hashCode="4C8Wh1I+5/32R1" int2:id="We7TVI8k">
+      <int2:state int2:type="spell" int2:value="Rejected"/>
+    </int2:textHash>
+    <int2:textHash int2:hashCode="wpuIcwU0qeWTFq" int2:id="KkBwKnRE">
+      <int2:state int2:type="spell" int2:value="Rejected"/>
+    </int2:textHash>
+    <int2:textHash int2:hashCode="CUsP4OMChUrxMR" int2:id="aggn7iO1">
+      <int2:state int2:type="spell" int2:value="Rejected"/>
+    </int2:textHash>
+    <int2:textHash int2:hashCode="FWzm1l/TGpXl7t" int2:id="oj1jBceZ">
+      <int2:state int2:type="spell" int2:value="Rejected"/>
+    </int2:textHash>
+    <int2:textHash int2:hashCode="mhc+TeQs5v22K0" int2:id="Jfa0Nr3V">
+      <int2:state int2:type="spell" int2:value="Rejected"/>
+    </int2:textHash>
+    <int2:textHash int2:hashCode="5IrimIOm7vh4bJ" int2:id="lQXMslam">
+      <int2:state int2:type="spell" int2:value="Rejected"/>
+    </int2:textHash>
+    <int2:textHash int2:hashCode="KlzE4Eudh8VdEN" int2:id="kRVq8HLH">
+      <int2:state int2:type="spell" int2:value="Rejected"/>
+    </int2:textHash>
+    <int2:textHash int2:hashCode="4iRkEhkB4ljk+E" int2:id="jBRAlJd9">
+      <int2:state int2:type="spell" int2:value="Rejected"/>
+    </int2:textHash>
+    <int2:textHash int2:hashCode="lGkOxBgQdQL+FR" int2:id="8lShD3w7">
+      <int2:state int2:type="spell" int2:value="Rejected"/>
+    </int2:textHash>
+    <int2:textHash int2:hashCode="mfwPxprGT52uD5" int2:id="99np0kOr">
+      <int2:state int2:type="spell" int2:value="Rejected"/>
+    </int2:textHash>
+    <int2:textHash int2:hashCode="UqVVWteceKmuzy" int2:id="TGqYBd4u">
+      <int2:state int2:type="spell" int2:value="Rejected"/>
+    </int2:textHash>
+    <int2:textHash int2:hashCode="wKNKS9IaSVZFgb" int2:id="K96PYLNh">
+      <int2:state int2:type="spell" int2:value="Rejected"/>
+    </int2:textHash>
+    <int2:textHash int2:hashCode="Tx6k8J2yqq+wqS" int2:id="R8vBCvKl">
+      <int2:state int2:type="spell" int2:value="Rejected"/>
+    </int2:textHash>
+    <int2:textHash int2:hashCode="/N3CrvjxLw/Tob" int2:id="903KHU3V">
+      <int2:state int2:type="spell" int2:value="Rejected"/>
+    </int2:textHash>
     <int2:textHash int2:hashCode="Rrt+PC8NAaOqSj" int2:id="qMjHCwBo">
       <int2:state int2:type="spell" int2:value="Rejected"/>
     </int2:textHash>
@@ -2584,6 +3745,48 @@
     <int2:textHash int2:hashCode="9+LyU1u5NhH3uV" int2:id="wxPVyvBi">
       <int2:state int2:type="spell" int2:value="Rejected"/>
     </int2:textHash>
+    <int2:bookmark int2:bookmarkName="_Int_Mm7s96Jj" int2:invalidationBookmarkName="" int2:hashCode="AbZCIMyt3KvGrn" int2:id="ds4RTUAY">
+      <int2:state int2:type="gram" int2:value="Rejected"/>
+    </int2:bookmark>
+    <int2:bookmark int2:bookmarkName="_Int_PZUOkQCq" int2:invalidationBookmarkName="" int2:hashCode="ekPmbvhrjfGcpV" int2:id="sXHuKSn2">
+      <int2:state int2:type="gram" int2:value="Rejected"/>
+    </int2:bookmark>
+    <int2:bookmark int2:bookmarkName="_Int_bjfWwamN" int2:invalidationBookmarkName="" int2:hashCode="5v+mkZMVuOG47R" int2:id="bwGFllnz">
+      <int2:state int2:type="gram" int2:value="Rejected"/>
+    </int2:bookmark>
+    <int2:bookmark int2:bookmarkName="_Int_mo6XNs1U" int2:invalidationBookmarkName="" int2:hashCode="5v+mkZMVuOG47R" int2:id="L06iP4vc">
+      <int2:state int2:type="gram" int2:value="Rejected"/>
+    </int2:bookmark>
+    <int2:bookmark int2:bookmarkName="_Int_U7HCu94M" int2:invalidationBookmarkName="" int2:hashCode="j3/5UV1kd056GV" int2:id="sykofM2V">
+      <int2:state int2:type="gram" int2:value="Rejected"/>
+    </int2:bookmark>
+    <int2:bookmark int2:bookmarkName="_Int_geqKrWBl" int2:invalidationBookmarkName="" int2:hashCode="OrkU+C2o04kvDc" int2:id="wKktzAUa">
+      <int2:state int2:type="gram" int2:value="Rejected"/>
+    </int2:bookmark>
+    <int2:bookmark int2:bookmarkName="_Int_hu64dXz0" int2:invalidationBookmarkName="" int2:hashCode="qd1rtIQyrrr82B" int2:id="LfXqhQbM">
+      <int2:state int2:type="gram" int2:value="Rejected"/>
+    </int2:bookmark>
+    <int2:bookmark int2:bookmarkName="_Int_Vri9LjKR" int2:invalidationBookmarkName="" int2:hashCode="hcBEPrlMQejWsG" int2:id="9jzN6o5X">
+      <int2:state int2:type="gram" int2:value="Rejected"/>
+    </int2:bookmark>
+    <int2:bookmark int2:bookmarkName="_Int_evyyiED0" int2:invalidationBookmarkName="" int2:hashCode="0WxAKyM+zMcoiS" int2:id="I2dFVq2O">
+      <int2:state int2:type="gram" int2:value="Rejected"/>
+    </int2:bookmark>
+    <int2:bookmark int2:bookmarkName="_Int_pFmKXfSS" int2:invalidationBookmarkName="" int2:hashCode="HHu34FIPSLZPxI" int2:id="61Au87ld">
+      <int2:state int2:type="gram" int2:value="Rejected"/>
+    </int2:bookmark>
+    <int2:bookmark int2:bookmarkName="_Int_TJnZtODn" int2:invalidationBookmarkName="" int2:hashCode="GgOKH3Y34D2IMf" int2:id="6lmNdlWb">
+      <int2:state int2:type="gram" int2:value="Rejected"/>
+    </int2:bookmark>
+    <int2:bookmark int2:bookmarkName="_Int_f0qpi2vl" int2:invalidationBookmarkName="" int2:hashCode="j3/5UV1kd056GV" int2:id="2fdAlmis">
+      <int2:state int2:type="gram" int2:value="Rejected"/>
+    </int2:bookmark>
+    <int2:bookmark int2:bookmarkName="_Int_LTK0zGtF" int2:invalidationBookmarkName="" int2:hashCode="WKWJ1yrZ9QpjLv" int2:id="UTqy53uj">
+      <int2:state int2:type="gram" int2:value="Rejected"/>
+    </int2:bookmark>
+    <int2:bookmark int2:bookmarkName="_Int_MX7gpIkU" int2:invalidationBookmarkName="" int2:hashCode="j3/5UV1kd056GV" int2:id="iLWn6kRD">
+      <int2:state int2:type="gram" int2:value="Rejected"/>
+    </int2:bookmark>
     <int2:bookmark int2:bookmarkName="_Int_iHhWgWn9" int2:invalidationBookmarkName="" int2:hashCode="GgOKH3Y34D2IMf" int2:id="Cf0Eqnvv">
       <int2:state int2:type="gram" int2:value="Rejected"/>
     </int2:bookmark>
@@ -2599,12 +3802,6 @@
     <int2:bookmark int2:bookmarkName="_Int_q1gubYzH" int2:invalidationBookmarkName="" int2:hashCode="j3/5UV1kd056GV" int2:id="8LUwlDHM">
       <int2:state int2:type="gram" int2:value="Rejected"/>
     </int2:bookmark>
-    <int2:bookmark int2:bookmarkName="_Int_GoY55r2F" int2:invalidationBookmarkName="" int2:hashCode="GgOKH3Y34D2IMf" int2:id="Ayckn7Mz">
-      <int2:state int2:type="gram" int2:value="Rejected"/>
-    </int2:bookmark>
-    <int2:bookmark int2:bookmarkName="_Int_hKjV3oYq" int2:invalidationBookmarkName="" int2:hashCode="xo9HxJxlI02xYk" int2:id="LRd5z0Xt">
-      <int2:state int2:type="gram" int2:value="Rejected"/>
-    </int2:bookmark>
     <int2:bookmark int2:bookmarkName="_Int_pXWCEQrJ" int2:invalidationBookmarkName="" int2:hashCode="oyYTSSFghkGb9z" int2:id="40REclGI">
       <int2:state int2:type="gram" int2:value="Rejected"/>
     </int2:bookmark>
@@ -2614,52 +3811,7 @@
     <int2:bookmark int2:bookmarkName="_Int_2wOWNsbJ" int2:invalidationBookmarkName="" int2:hashCode="mzu2CnX9I5dePd" int2:id="hXjOlsew">
       <int2:state int2:type="gram" int2:value="Rejected"/>
     </int2:bookmark>
-    <int2:bookmark int2:bookmarkName="_Int_Wy9nliN4" int2:invalidationBookmarkName="" int2:hashCode="mzu2CnX9I5dePd" int2:id="RrE5JG0A">
-      <int2:state int2:type="gram" int2:value="Rejected"/>
-    </int2:bookmark>
     <int2:bookmark int2:bookmarkName="_Int_BNGyn2rD" int2:invalidationBookmarkName="" int2:hashCode="JS5tuGqORwI101" int2:id="JD3COfX1">
-      <int2:state int2:type="gram" int2:value="Rejected"/>
-    </int2:bookmark>
-    <int2:bookmark int2:bookmarkName="_Int_A2EOY0AI" int2:invalidationBookmarkName="" int2:hashCode="3PfC+GJZBDhYvZ" int2:id="14I4MeYv">
-      <int2:state int2:type="gram" int2:value="Rejected"/>
-    </int2:bookmark>
-    <int2:bookmark int2:bookmarkName="_Int_kX4wvsCi" int2:invalidationBookmarkName="" int2:hashCode="3PfC+GJZBDhYvZ" int2:id="U553FoWv">
-      <int2:state int2:type="gram" int2:value="Rejected"/>
-    </int2:bookmark>
-    <int2:bookmark int2:bookmarkName="_Int_FwNksKla" int2:invalidationBookmarkName="" int2:hashCode="JS5tuGqORwI101" int2:id="oO1CVZKr">
-      <int2:state int2:type="gram" int2:value="Rejected"/>
-    </int2:bookmark>
-    <int2:bookmark int2:bookmarkName="_Int_BkbyaetL" int2:invalidationBookmarkName="" int2:hashCode="oyYTSSFghkGb9z" int2:id="4FmXv0ks">
-      <int2:state int2:type="gram" int2:value="Rejected"/>
-    </int2:bookmark>
-    <int2:bookmark int2:bookmarkName="_Int_1PzHL1Bb" int2:invalidationBookmarkName="" int2:hashCode="kVILneHS+H1FUH" int2:id="H07xXBvG">
-      <int2:state int2:type="gram" int2:value="Rejected"/>
-    </int2:bookmark>
-    <int2:bookmark int2:bookmarkName="_Int_4QRaorbY" int2:invalidationBookmarkName="" int2:hashCode="mzu2CnX9I5dePd" int2:id="a82qQU7s">
-      <int2:state int2:type="gram" int2:value="Rejected"/>
-    </int2:bookmark>
-    <int2:bookmark int2:bookmarkName="_Int_izmYSkhS" int2:invalidationBookmarkName="" int2:hashCode="3haxrba8DazZMj" int2:id="E6a5AK7R">
-      <int2:state int2:type="gram" int2:value="Rejected"/>
-    </int2:bookmark>
-    <int2:bookmark int2:bookmarkName="_Int_PC0UU3qx" int2:invalidationBookmarkName="" int2:hashCode="KOUfLdXGd6UHXG" int2:id="Z7IcNzX5">
-      <int2:state int2:type="gram" int2:value="Rejected"/>
-    </int2:bookmark>
-    <int2:bookmark int2:bookmarkName="_Int_Mzr5bTw3" int2:invalidationBookmarkName="" int2:hashCode="dZz2AW9T19GHMv" int2:id="dRht6v8h">
-      <int2:state int2:type="gram" int2:value="Rejected"/>
-    </int2:bookmark>
-    <int2:bookmark int2:bookmarkName="_Int_zTGp3K9f" int2:invalidationBookmarkName="" int2:hashCode="ByJAIvPv2QIWkt" int2:id="8dwlP4Qx">
-      <int2:state int2:type="gram" int2:value="Rejected"/>
-    </int2:bookmark>
-    <int2:bookmark int2:bookmarkName="_Int_zKYrNJ0a" int2:invalidationBookmarkName="" int2:hashCode="Ad7MnWnzIjN3iR" int2:id="Ty1nUPeE">
-      <int2:state int2:type="gram" int2:value="Rejected"/>
-    </int2:bookmark>
-    <int2:bookmark int2:bookmarkName="_Int_kv2hkcxo" int2:invalidationBookmarkName="" int2:hashCode="xtMwMrtAb35MFM" int2:id="TVS9rXRk">
-      <int2:state int2:type="gram" int2:value="Rejected"/>
-    </int2:bookmark>
-    <int2:bookmark int2:bookmarkName="_Int_jrHdhtML" int2:invalidationBookmarkName="" int2:hashCode="aStH+7q1c4BKLN" int2:id="J7OKhgp2">
-      <int2:state int2:type="gram" int2:value="Rejected"/>
-    </int2:bookmark>
-    <int2:bookmark int2:bookmarkName="_Int_PbJygJwA" int2:invalidationBookmarkName="" int2:hashCode="aylDeju43fGW+e" int2:id="wkXrJSXF">
       <int2:state int2:type="gram" int2:value="Rejected"/>
     </int2:bookmark>
   </int2:observations>

</xml_diff>